<commit_message>
fix: colisoes entre jogadores, nova IA tatica e guarda-redes com reacao
- Colisoes: anula a velocidade de aproximacao (sem tremer), mantem os
  jogadores dentro do rinque, encosta-os as balizas sem saltos.
- Desarmes com probabilidade por atributos, protecao de quem ganha a bola
  e bloqueio de quem a perde (acaba o pingue-pongue).
- IA: pressao + cobertura + formacao, passes para colegas livres com
  antecipacao, recetor vai a bola, remate ao canto longe do GR, contorna a
  baliza, finta adversarios, tempo de reacao.
- Guarda-redes com tempo de reacao, leitura da trajetoria com erro e
  alcance por dificuldade.
- A dificuldade so afeta a equipa adversaria.
- Depois de um golo recomeca a equipa que o sofreu.
- Script ferramentas/medir_jogabilidade.py e relatorio/diagrama atualizados.

Co-Authored-By: Claude Opus 5.5 <noreply@anthropic.com>
</commit_message>
<xml_diff>
--- a/docs/relatorio/Relatorio_PAP_StickMania.docx
+++ b/docs/relatorio/Relatorio_PAP_StickMania.docx
@@ -9,7 +9,7 @@
           <w:noProof/>
         </w:rPr>
         <w:drawing>
-          <wp:anchor distT="0" distB="0" distL="114300" distR="114300" simplePos="0" relativeHeight="251658240" behindDoc="0" locked="0" layoutInCell="1" hidden="0" allowOverlap="1" wp14:anchorId="5F9B198D" wp14:editId="5C30280A">
+          <wp:anchor distT="0" distB="0" distL="114300" distR="114300" simplePos="0" relativeHeight="251658240" behindDoc="0" locked="0" layoutInCell="1" hidden="0" allowOverlap="1" wp14:anchorId="06561113" wp14:editId="2ED9C2D2">
             <wp:simplePos x="0" y="0"/>
             <wp:positionH relativeFrom="column">
               <wp:posOffset>104780</wp:posOffset>
@@ -236,7 +236,7 @@
           <w:noProof/>
         </w:rPr>
         <w:drawing>
-          <wp:anchor distT="0" distB="0" distL="114300" distR="114300" simplePos="0" relativeHeight="251659264" behindDoc="0" locked="0" layoutInCell="1" hidden="0" allowOverlap="1" wp14:anchorId="3E7CDE1A" wp14:editId="57615673">
+          <wp:anchor distT="0" distB="0" distL="114300" distR="114300" simplePos="0" relativeHeight="251659264" behindDoc="0" locked="0" layoutInCell="1" hidden="0" allowOverlap="1" wp14:anchorId="7313BF9D" wp14:editId="57AAD542">
             <wp:simplePos x="0" y="0"/>
             <wp:positionH relativeFrom="column">
               <wp:posOffset>-3172</wp:posOffset>
@@ -570,7 +570,7 @@
           <w:r>
             <w:fldChar w:fldCharType="separate"/>
           </w:r>
-          <w:hyperlink w:anchor="_Toc244220116" w:history="1">
+          <w:hyperlink w:anchor="_Toc244268647" w:history="1">
             <w:r>
               <w:rPr>
                 <w:rStyle w:val="Hiperligao"/>
@@ -597,7 +597,7 @@
                 <w:noProof/>
                 <w:webHidden/>
               </w:rPr>
-              <w:instrText xml:space="preserve"> PAGEREF _Toc244220116 \h </w:instrText>
+              <w:instrText xml:space="preserve"> PAGEREF _Toc244268647 \h </w:instrText>
             </w:r>
             <w:r>
               <w:rPr>
@@ -643,7 +643,7 @@
               <w14:ligatures w14:val="standardContextual"/>
             </w:rPr>
           </w:pPr>
-          <w:hyperlink w:anchor="_Toc244220117" w:history="1">
+          <w:hyperlink w:anchor="_Toc244268648" w:history="1">
             <w:r>
               <w:rPr>
                 <w:rStyle w:val="Hiperligao"/>
@@ -670,7 +670,7 @@
                 <w:noProof/>
                 <w:webHidden/>
               </w:rPr>
-              <w:instrText xml:space="preserve"> PAGEREF _Toc244220117 \h </w:instrText>
+              <w:instrText xml:space="preserve"> PAGEREF _Toc244268648 \h </w:instrText>
             </w:r>
             <w:r>
               <w:rPr>
@@ -716,7 +716,7 @@
               <w14:ligatures w14:val="standardContextual"/>
             </w:rPr>
           </w:pPr>
-          <w:hyperlink w:anchor="_Toc244220118" w:history="1">
+          <w:hyperlink w:anchor="_Toc244268649" w:history="1">
             <w:r>
               <w:rPr>
                 <w:rStyle w:val="Hiperligao"/>
@@ -743,7 +743,7 @@
                 <w:noProof/>
                 <w:webHidden/>
               </w:rPr>
-              <w:instrText xml:space="preserve"> PAGEREF _Toc244220118 \h </w:instrText>
+              <w:instrText xml:space="preserve"> PAGEREF _Toc244268649 \h </w:instrText>
             </w:r>
             <w:r>
               <w:rPr>
@@ -789,7 +789,7 @@
               <w14:ligatures w14:val="standardContextual"/>
             </w:rPr>
           </w:pPr>
-          <w:hyperlink w:anchor="_Toc244220119" w:history="1">
+          <w:hyperlink w:anchor="_Toc244268650" w:history="1">
             <w:r>
               <w:rPr>
                 <w:rStyle w:val="Hiperligao"/>
@@ -816,7 +816,7 @@
                 <w:noProof/>
                 <w:webHidden/>
               </w:rPr>
-              <w:instrText xml:space="preserve"> PAGEREF _Toc244220119 \h </w:instrText>
+              <w:instrText xml:space="preserve"> PAGEREF _Toc244268650 \h </w:instrText>
             </w:r>
             <w:r>
               <w:rPr>
@@ -862,7 +862,7 @@
               <w14:ligatures w14:val="standardContextual"/>
             </w:rPr>
           </w:pPr>
-          <w:hyperlink w:anchor="_Toc244220120" w:history="1">
+          <w:hyperlink w:anchor="_Toc244268651" w:history="1">
             <w:r>
               <w:rPr>
                 <w:rStyle w:val="Hiperligao"/>
@@ -904,7 +904,7 @@
                 <w:noProof/>
                 <w:webHidden/>
               </w:rPr>
-              <w:instrText xml:space="preserve"> PAGEREF _Toc244220120 \h </w:instrText>
+              <w:instrText xml:space="preserve"> PAGEREF _Toc244268651 \h </w:instrText>
             </w:r>
             <w:r>
               <w:rPr>
@@ -950,7 +950,7 @@
               <w14:ligatures w14:val="standardContextual"/>
             </w:rPr>
           </w:pPr>
-          <w:hyperlink w:anchor="_Toc244220121" w:history="1">
+          <w:hyperlink w:anchor="_Toc244268652" w:history="1">
             <w:r>
               <w:rPr>
                 <w:rStyle w:val="Hiperligao"/>
@@ -977,7 +977,7 @@
                 <w:noProof/>
                 <w:webHidden/>
               </w:rPr>
-              <w:instrText xml:space="preserve"> PAGEREF _Toc244220121 \h </w:instrText>
+              <w:instrText xml:space="preserve"> PAGEREF _Toc244268652 \h </w:instrText>
             </w:r>
             <w:r>
               <w:rPr>
@@ -1023,7 +1023,7 @@
               <w14:ligatures w14:val="standardContextual"/>
             </w:rPr>
           </w:pPr>
-          <w:hyperlink w:anchor="_Toc244220122" w:history="1">
+          <w:hyperlink w:anchor="_Toc244268653" w:history="1">
             <w:r>
               <w:rPr>
                 <w:rStyle w:val="Hiperligao"/>
@@ -1050,7 +1050,7 @@
                 <w:noProof/>
                 <w:webHidden/>
               </w:rPr>
-              <w:instrText xml:space="preserve"> PAGEREF _Toc244220122 \h </w:instrText>
+              <w:instrText xml:space="preserve"> PAGEREF _Toc244268653 \h </w:instrText>
             </w:r>
             <w:r>
               <w:rPr>
@@ -1096,7 +1096,7 @@
               <w14:ligatures w14:val="standardContextual"/>
             </w:rPr>
           </w:pPr>
-          <w:hyperlink w:anchor="_Toc244220123" w:history="1">
+          <w:hyperlink w:anchor="_Toc244268654" w:history="1">
             <w:r>
               <w:rPr>
                 <w:rStyle w:val="Hiperligao"/>
@@ -1138,7 +1138,7 @@
                 <w:noProof/>
                 <w:webHidden/>
               </w:rPr>
-              <w:instrText xml:space="preserve"> PAGEREF _Toc244220123 \h </w:instrText>
+              <w:instrText xml:space="preserve"> PAGEREF _Toc244268654 \h </w:instrText>
             </w:r>
             <w:r>
               <w:rPr>
@@ -1184,7 +1184,7 @@
               <w14:ligatures w14:val="standardContextual"/>
             </w:rPr>
           </w:pPr>
-          <w:hyperlink w:anchor="_Toc244220124" w:history="1">
+          <w:hyperlink w:anchor="_Toc244268655" w:history="1">
             <w:r>
               <w:rPr>
                 <w:rStyle w:val="Hiperligao"/>
@@ -1226,7 +1226,7 @@
                 <w:noProof/>
                 <w:webHidden/>
               </w:rPr>
-              <w:instrText xml:space="preserve"> PAGEREF _Toc244220124 \h </w:instrText>
+              <w:instrText xml:space="preserve"> PAGEREF _Toc244268655 \h </w:instrText>
             </w:r>
             <w:r>
               <w:rPr>
@@ -1272,7 +1272,7 @@
               <w14:ligatures w14:val="standardContextual"/>
             </w:rPr>
           </w:pPr>
-          <w:hyperlink w:anchor="_Toc244220125" w:history="1">
+          <w:hyperlink w:anchor="_Toc244268656" w:history="1">
             <w:r>
               <w:rPr>
                 <w:rStyle w:val="Hiperligao"/>
@@ -1314,7 +1314,7 @@
                 <w:noProof/>
                 <w:webHidden/>
               </w:rPr>
-              <w:instrText xml:space="preserve"> PAGEREF _Toc244220125 \h </w:instrText>
+              <w:instrText xml:space="preserve"> PAGEREF _Toc244268656 \h </w:instrText>
             </w:r>
             <w:r>
               <w:rPr>
@@ -1360,7 +1360,7 @@
               <w14:ligatures w14:val="standardContextual"/>
             </w:rPr>
           </w:pPr>
-          <w:hyperlink w:anchor="_Toc244220126" w:history="1">
+          <w:hyperlink w:anchor="_Toc244268657" w:history="1">
             <w:r>
               <w:rPr>
                 <w:rStyle w:val="Hiperligao"/>
@@ -1402,7 +1402,7 @@
                 <w:noProof/>
                 <w:webHidden/>
               </w:rPr>
-              <w:instrText xml:space="preserve"> PAGEREF _Toc244220126 \h </w:instrText>
+              <w:instrText xml:space="preserve"> PAGEREF _Toc244268657 \h </w:instrText>
             </w:r>
             <w:r>
               <w:rPr>
@@ -1448,7 +1448,7 @@
               <w14:ligatures w14:val="standardContextual"/>
             </w:rPr>
           </w:pPr>
-          <w:hyperlink w:anchor="_Toc244220127" w:history="1">
+          <w:hyperlink w:anchor="_Toc244268658" w:history="1">
             <w:r>
               <w:rPr>
                 <w:rStyle w:val="Hiperligao"/>
@@ -1490,7 +1490,7 @@
                 <w:noProof/>
                 <w:webHidden/>
               </w:rPr>
-              <w:instrText xml:space="preserve"> PAGEREF _Toc244220127 \h </w:instrText>
+              <w:instrText xml:space="preserve"> PAGEREF _Toc244268658 \h </w:instrText>
             </w:r>
             <w:r>
               <w:rPr>
@@ -1536,7 +1536,7 @@
               <w14:ligatures w14:val="standardContextual"/>
             </w:rPr>
           </w:pPr>
-          <w:hyperlink w:anchor="_Toc244220128" w:history="1">
+          <w:hyperlink w:anchor="_Toc244268659" w:history="1">
             <w:r>
               <w:rPr>
                 <w:rStyle w:val="Hiperligao"/>
@@ -1578,7 +1578,7 @@
                 <w:noProof/>
                 <w:webHidden/>
               </w:rPr>
-              <w:instrText xml:space="preserve"> PAGEREF _Toc244220128 \h </w:instrText>
+              <w:instrText xml:space="preserve"> PAGEREF _Toc244268659 \h </w:instrText>
             </w:r>
             <w:r>
               <w:rPr>
@@ -1624,7 +1624,7 @@
               <w14:ligatures w14:val="standardContextual"/>
             </w:rPr>
           </w:pPr>
-          <w:hyperlink w:anchor="_Toc244220129" w:history="1">
+          <w:hyperlink w:anchor="_Toc244268660" w:history="1">
             <w:r>
               <w:rPr>
                 <w:rStyle w:val="Hiperligao"/>
@@ -1666,7 +1666,7 @@
                 <w:noProof/>
                 <w:webHidden/>
               </w:rPr>
-              <w:instrText xml:space="preserve"> PAGEREF _Toc244220129 \h </w:instrText>
+              <w:instrText xml:space="preserve"> PAGEREF _Toc244268660 \h </w:instrText>
             </w:r>
             <w:r>
               <w:rPr>
@@ -1712,7 +1712,7 @@
               <w14:ligatures w14:val="standardContextual"/>
             </w:rPr>
           </w:pPr>
-          <w:hyperlink w:anchor="_Toc244220130" w:history="1">
+          <w:hyperlink w:anchor="_Toc244268661" w:history="1">
             <w:r>
               <w:rPr>
                 <w:rStyle w:val="Hiperligao"/>
@@ -1754,7 +1754,7 @@
                 <w:noProof/>
                 <w:webHidden/>
               </w:rPr>
-              <w:instrText xml:space="preserve"> PAGEREF _Toc244220130 \h </w:instrText>
+              <w:instrText xml:space="preserve"> PAGEREF _Toc244268661 \h </w:instrText>
             </w:r>
             <w:r>
               <w:rPr>
@@ -1800,7 +1800,7 @@
               <w14:ligatures w14:val="standardContextual"/>
             </w:rPr>
           </w:pPr>
-          <w:hyperlink w:anchor="_Toc244220131" w:history="1">
+          <w:hyperlink w:anchor="_Toc244268662" w:history="1">
             <w:r>
               <w:rPr>
                 <w:rStyle w:val="Hiperligao"/>
@@ -1843,7 +1843,7 @@
                 <w:noProof/>
                 <w:webHidden/>
               </w:rPr>
-              <w:instrText xml:space="preserve"> PAGEREF _Toc244220131 \h </w:instrText>
+              <w:instrText xml:space="preserve"> PAGEREF _Toc244268662 \h </w:instrText>
             </w:r>
             <w:r>
               <w:rPr>
@@ -1889,7 +1889,7 @@
               <w14:ligatures w14:val="standardContextual"/>
             </w:rPr>
           </w:pPr>
-          <w:hyperlink w:anchor="_Toc244220132" w:history="1">
+          <w:hyperlink w:anchor="_Toc244268663" w:history="1">
             <w:r>
               <w:rPr>
                 <w:rStyle w:val="Hiperligao"/>
@@ -1931,7 +1931,7 @@
                 <w:noProof/>
                 <w:webHidden/>
               </w:rPr>
-              <w:instrText xml:space="preserve"> PAGEREF _Toc244220132 \h </w:instrText>
+              <w:instrText xml:space="preserve"> PAGEREF _Toc244268663 \h </w:instrText>
             </w:r>
             <w:r>
               <w:rPr>
@@ -1977,7 +1977,7 @@
               <w14:ligatures w14:val="standardContextual"/>
             </w:rPr>
           </w:pPr>
-          <w:hyperlink w:anchor="_Toc244220133" w:history="1">
+          <w:hyperlink w:anchor="_Toc244268664" w:history="1">
             <w:r>
               <w:rPr>
                 <w:rStyle w:val="Hiperligao"/>
@@ -2004,7 +2004,7 @@
                 <w:noProof/>
                 <w:webHidden/>
               </w:rPr>
-              <w:instrText xml:space="preserve"> PAGEREF _Toc244220133 \h </w:instrText>
+              <w:instrText xml:space="preserve"> PAGEREF _Toc244268664 \h </w:instrText>
             </w:r>
             <w:r>
               <w:rPr>
@@ -2050,7 +2050,7 @@
               <w14:ligatures w14:val="standardContextual"/>
             </w:rPr>
           </w:pPr>
-          <w:hyperlink w:anchor="_Toc244220134" w:history="1">
+          <w:hyperlink w:anchor="_Toc244268665" w:history="1">
             <w:r>
               <w:rPr>
                 <w:rStyle w:val="Hiperligao"/>
@@ -2077,7 +2077,7 @@
                 <w:noProof/>
                 <w:webHidden/>
               </w:rPr>
-              <w:instrText xml:space="preserve"> PAGEREF _Toc244220134 \h </w:instrText>
+              <w:instrText xml:space="preserve"> PAGEREF _Toc244268665 \h </w:instrText>
             </w:r>
             <w:r>
               <w:rPr>
@@ -2123,7 +2123,7 @@
               <w14:ligatures w14:val="standardContextual"/>
             </w:rPr>
           </w:pPr>
-          <w:hyperlink w:anchor="_Toc244220135" w:history="1">
+          <w:hyperlink w:anchor="_Toc244268666" w:history="1">
             <w:r>
               <w:rPr>
                 <w:rStyle w:val="Hiperligao"/>
@@ -2150,7 +2150,7 @@
                 <w:noProof/>
                 <w:webHidden/>
               </w:rPr>
-              <w:instrText xml:space="preserve"> PAGEREF _Toc244220135 \h </w:instrText>
+              <w:instrText xml:space="preserve"> PAGEREF _Toc244268666 \h </w:instrText>
             </w:r>
             <w:r>
               <w:rPr>
@@ -2170,7 +2170,7 @@
                 <w:noProof/>
                 <w:webHidden/>
               </w:rPr>
-              <w:t>20</w:t>
+              <w:t>19</w:t>
             </w:r>
             <w:r>
               <w:rPr>
@@ -2196,7 +2196,7 @@
               <w14:ligatures w14:val="standardContextual"/>
             </w:rPr>
           </w:pPr>
-          <w:hyperlink w:anchor="_Toc244220136" w:history="1">
+          <w:hyperlink w:anchor="_Toc244268667" w:history="1">
             <w:r>
               <w:rPr>
                 <w:rStyle w:val="Hiperligao"/>
@@ -2223,7 +2223,7 @@
                 <w:noProof/>
                 <w:webHidden/>
               </w:rPr>
-              <w:instrText xml:space="preserve"> PAGEREF _Toc244220136 \h </w:instrText>
+              <w:instrText xml:space="preserve"> PAGEREF _Toc244268667 \h </w:instrText>
             </w:r>
             <w:r>
               <w:rPr>
@@ -2269,7 +2269,7 @@
               <w14:ligatures w14:val="standardContextual"/>
             </w:rPr>
           </w:pPr>
-          <w:hyperlink w:anchor="_Toc244220137" w:history="1">
+          <w:hyperlink w:anchor="_Toc244268668" w:history="1">
             <w:r>
               <w:rPr>
                 <w:rStyle w:val="Hiperligao"/>
@@ -2311,7 +2311,7 @@
                 <w:noProof/>
                 <w:webHidden/>
               </w:rPr>
-              <w:instrText xml:space="preserve"> PAGEREF _Toc244220137 \h </w:instrText>
+              <w:instrText xml:space="preserve"> PAGEREF _Toc244268668 \h </w:instrText>
             </w:r>
             <w:r>
               <w:rPr>
@@ -2357,7 +2357,7 @@
               <w14:ligatures w14:val="standardContextual"/>
             </w:rPr>
           </w:pPr>
-          <w:hyperlink w:anchor="_Toc244220138" w:history="1">
+          <w:hyperlink w:anchor="_Toc244268669" w:history="1">
             <w:r>
               <w:rPr>
                 <w:rStyle w:val="Hiperligao"/>
@@ -2384,7 +2384,7 @@
                 <w:noProof/>
                 <w:webHidden/>
               </w:rPr>
-              <w:instrText xml:space="preserve"> PAGEREF _Toc244220138 \h </w:instrText>
+              <w:instrText xml:space="preserve"> PAGEREF _Toc244268669 \h </w:instrText>
             </w:r>
             <w:r>
               <w:rPr>
@@ -2430,7 +2430,7 @@
               <w14:ligatures w14:val="standardContextual"/>
             </w:rPr>
           </w:pPr>
-          <w:hyperlink w:anchor="_Toc244220139" w:history="1">
+          <w:hyperlink w:anchor="_Toc244268670" w:history="1">
             <w:r>
               <w:rPr>
                 <w:rStyle w:val="Hiperligao"/>
@@ -2457,7 +2457,7 @@
                 <w:noProof/>
                 <w:webHidden/>
               </w:rPr>
-              <w:instrText xml:space="preserve"> PAGEREF _Toc244220139 \h </w:instrText>
+              <w:instrText xml:space="preserve"> PAGEREF _Toc244268670 \h </w:instrText>
             </w:r>
             <w:r>
               <w:rPr>
@@ -2477,7 +2477,7 @@
                 <w:noProof/>
                 <w:webHidden/>
               </w:rPr>
-              <w:t>21</w:t>
+              <w:t>20</w:t>
             </w:r>
             <w:r>
               <w:rPr>
@@ -2503,7 +2503,7 @@
               <w14:ligatures w14:val="standardContextual"/>
             </w:rPr>
           </w:pPr>
-          <w:hyperlink w:anchor="_Toc244220140" w:history="1">
+          <w:hyperlink w:anchor="_Toc244268671" w:history="1">
             <w:r>
               <w:rPr>
                 <w:rStyle w:val="Hiperligao"/>
@@ -2530,7 +2530,7 @@
                 <w:noProof/>
                 <w:webHidden/>
               </w:rPr>
-              <w:instrText xml:space="preserve"> PAGEREF _Toc244220140 \h </w:instrText>
+              <w:instrText xml:space="preserve"> PAGEREF _Toc244268671 \h </w:instrText>
             </w:r>
             <w:r>
               <w:rPr>
@@ -2576,7 +2576,7 @@
               <w14:ligatures w14:val="standardContextual"/>
             </w:rPr>
           </w:pPr>
-          <w:hyperlink w:anchor="_Toc244220141" w:history="1">
+          <w:hyperlink w:anchor="_Toc244268672" w:history="1">
             <w:r>
               <w:rPr>
                 <w:rStyle w:val="Hiperligao"/>
@@ -2603,7 +2603,7 @@
                 <w:noProof/>
                 <w:webHidden/>
               </w:rPr>
-              <w:instrText xml:space="preserve"> PAGEREF _Toc244220141 \h </w:instrText>
+              <w:instrText xml:space="preserve"> PAGEREF _Toc244268672 \h </w:instrText>
             </w:r>
             <w:r>
               <w:rPr>
@@ -2623,7 +2623,7 @@
                 <w:noProof/>
                 <w:webHidden/>
               </w:rPr>
-              <w:t>22</w:t>
+              <w:t>23</w:t>
             </w:r>
             <w:r>
               <w:rPr>
@@ -2649,7 +2649,7 @@
               <w14:ligatures w14:val="standardContextual"/>
             </w:rPr>
           </w:pPr>
-          <w:hyperlink w:anchor="_Toc244220142" w:history="1">
+          <w:hyperlink w:anchor="_Toc244268673" w:history="1">
             <w:r>
               <w:rPr>
                 <w:rStyle w:val="Hiperligao"/>
@@ -2676,7 +2676,7 @@
                 <w:noProof/>
                 <w:webHidden/>
               </w:rPr>
-              <w:instrText xml:space="preserve"> PAGEREF _Toc244220142 \h </w:instrText>
+              <w:instrText xml:space="preserve"> PAGEREF _Toc244268673 \h </w:instrText>
             </w:r>
             <w:r>
               <w:rPr>
@@ -2722,7 +2722,7 @@
               <w14:ligatures w14:val="standardContextual"/>
             </w:rPr>
           </w:pPr>
-          <w:hyperlink w:anchor="_Toc244220143" w:history="1">
+          <w:hyperlink w:anchor="_Toc244268674" w:history="1">
             <w:r>
               <w:rPr>
                 <w:rStyle w:val="Hiperligao"/>
@@ -2749,7 +2749,7 @@
                 <w:noProof/>
                 <w:webHidden/>
               </w:rPr>
-              <w:instrText xml:space="preserve"> PAGEREF _Toc244220143 \h </w:instrText>
+              <w:instrText xml:space="preserve"> PAGEREF _Toc244268674 \h </w:instrText>
             </w:r>
             <w:r>
               <w:rPr>
@@ -2769,7 +2769,7 @@
                 <w:noProof/>
                 <w:webHidden/>
               </w:rPr>
-              <w:t>23</w:t>
+              <w:t>24</w:t>
             </w:r>
             <w:r>
               <w:rPr>
@@ -2795,7 +2795,7 @@
               <w14:ligatures w14:val="standardContextual"/>
             </w:rPr>
           </w:pPr>
-          <w:hyperlink w:anchor="_Toc244220144" w:history="1">
+          <w:hyperlink w:anchor="_Toc244268675" w:history="1">
             <w:r>
               <w:rPr>
                 <w:rStyle w:val="Hiperligao"/>
@@ -2822,7 +2822,7 @@
                 <w:noProof/>
                 <w:webHidden/>
               </w:rPr>
-              <w:instrText xml:space="preserve"> PAGEREF _Toc244220144 \h </w:instrText>
+              <w:instrText xml:space="preserve"> PAGEREF _Toc244268675 \h </w:instrText>
             </w:r>
             <w:r>
               <w:rPr>
@@ -2842,7 +2842,7 @@
                 <w:noProof/>
                 <w:webHidden/>
               </w:rPr>
-              <w:t>23</w:t>
+              <w:t>24</w:t>
             </w:r>
             <w:r>
               <w:rPr>
@@ -2868,7 +2868,7 @@
               <w14:ligatures w14:val="standardContextual"/>
             </w:rPr>
           </w:pPr>
-          <w:hyperlink w:anchor="_Toc244220145" w:history="1">
+          <w:hyperlink w:anchor="_Toc244268676" w:history="1">
             <w:r>
               <w:rPr>
                 <w:rStyle w:val="Hiperligao"/>
@@ -2895,7 +2895,7 @@
                 <w:noProof/>
                 <w:webHidden/>
               </w:rPr>
-              <w:instrText xml:space="preserve"> PAGEREF _Toc244220145 \h </w:instrText>
+              <w:instrText xml:space="preserve"> PAGEREF _Toc244268676 \h </w:instrText>
             </w:r>
             <w:r>
               <w:rPr>
@@ -2915,7 +2915,7 @@
                 <w:noProof/>
                 <w:webHidden/>
               </w:rPr>
-              <w:t>24</w:t>
+              <w:t>25</w:t>
             </w:r>
             <w:r>
               <w:rPr>
@@ -2941,7 +2941,7 @@
               <w14:ligatures w14:val="standardContextual"/>
             </w:rPr>
           </w:pPr>
-          <w:hyperlink w:anchor="_Toc244220146" w:history="1">
+          <w:hyperlink w:anchor="_Toc244268677" w:history="1">
             <w:r>
               <w:rPr>
                 <w:rStyle w:val="Hiperligao"/>
@@ -2968,7 +2968,7 @@
                 <w:noProof/>
                 <w:webHidden/>
               </w:rPr>
-              <w:instrText xml:space="preserve"> PAGEREF _Toc244220146 \h </w:instrText>
+              <w:instrText xml:space="preserve"> PAGEREF _Toc244268677 \h </w:instrText>
             </w:r>
             <w:r>
               <w:rPr>
@@ -2988,7 +2988,7 @@
                 <w:noProof/>
                 <w:webHidden/>
               </w:rPr>
-              <w:t>25</w:t>
+              <w:t>26</w:t>
             </w:r>
             <w:r>
               <w:rPr>
@@ -3014,7 +3014,7 @@
               <w14:ligatures w14:val="standardContextual"/>
             </w:rPr>
           </w:pPr>
-          <w:hyperlink w:anchor="_Toc244220147" w:history="1">
+          <w:hyperlink w:anchor="_Toc244268678" w:history="1">
             <w:r>
               <w:rPr>
                 <w:rStyle w:val="Hiperligao"/>
@@ -3041,7 +3041,7 @@
                 <w:noProof/>
                 <w:webHidden/>
               </w:rPr>
-              <w:instrText xml:space="preserve"> PAGEREF _Toc244220147 \h </w:instrText>
+              <w:instrText xml:space="preserve"> PAGEREF _Toc244268678 \h </w:instrText>
             </w:r>
             <w:r>
               <w:rPr>
@@ -3061,7 +3061,7 @@
                 <w:noProof/>
                 <w:webHidden/>
               </w:rPr>
-              <w:t>25</w:t>
+              <w:t>26</w:t>
             </w:r>
             <w:r>
               <w:rPr>
@@ -3087,7 +3087,7 @@
               <w14:ligatures w14:val="standardContextual"/>
             </w:rPr>
           </w:pPr>
-          <w:hyperlink w:anchor="_Toc244220148" w:history="1">
+          <w:hyperlink w:anchor="_Toc244268679" w:history="1">
             <w:r>
               <w:rPr>
                 <w:rStyle w:val="Hiperligao"/>
@@ -3129,7 +3129,7 @@
                 <w:noProof/>
                 <w:webHidden/>
               </w:rPr>
-              <w:instrText xml:space="preserve"> PAGEREF _Toc244220148 \h </w:instrText>
+              <w:instrText xml:space="preserve"> PAGEREF _Toc244268679 \h </w:instrText>
             </w:r>
             <w:r>
               <w:rPr>
@@ -3149,7 +3149,7 @@
                 <w:noProof/>
                 <w:webHidden/>
               </w:rPr>
-              <w:t>25</w:t>
+              <w:t>26</w:t>
             </w:r>
             <w:r>
               <w:rPr>
@@ -3175,7 +3175,7 @@
               <w14:ligatures w14:val="standardContextual"/>
             </w:rPr>
           </w:pPr>
-          <w:hyperlink w:anchor="_Toc244220149" w:history="1">
+          <w:hyperlink w:anchor="_Toc244268680" w:history="1">
             <w:r>
               <w:rPr>
                 <w:rStyle w:val="Hiperligao"/>
@@ -3217,7 +3217,7 @@
                 <w:noProof/>
                 <w:webHidden/>
               </w:rPr>
-              <w:instrText xml:space="preserve"> PAGEREF _Toc244220149 \h </w:instrText>
+              <w:instrText xml:space="preserve"> PAGEREF _Toc244268680 \h </w:instrText>
             </w:r>
             <w:r>
               <w:rPr>
@@ -3237,7 +3237,7 @@
                 <w:noProof/>
                 <w:webHidden/>
               </w:rPr>
-              <w:t>26</w:t>
+              <w:t>27</w:t>
             </w:r>
             <w:r>
               <w:rPr>
@@ -3263,7 +3263,7 @@
               <w14:ligatures w14:val="standardContextual"/>
             </w:rPr>
           </w:pPr>
-          <w:hyperlink w:anchor="_Toc244220150" w:history="1">
+          <w:hyperlink w:anchor="_Toc244268681" w:history="1">
             <w:r>
               <w:rPr>
                 <w:rStyle w:val="Hiperligao"/>
@@ -3290,7 +3290,7 @@
                 <w:noProof/>
                 <w:webHidden/>
               </w:rPr>
-              <w:instrText xml:space="preserve"> PAGEREF _Toc244220150 \h </w:instrText>
+              <w:instrText xml:space="preserve"> PAGEREF _Toc244268681 \h </w:instrText>
             </w:r>
             <w:r>
               <w:rPr>
@@ -3310,7 +3310,7 @@
                 <w:noProof/>
                 <w:webHidden/>
               </w:rPr>
-              <w:t>26</w:t>
+              <w:t>27</w:t>
             </w:r>
             <w:r>
               <w:rPr>
@@ -3336,7 +3336,7 @@
               <w14:ligatures w14:val="standardContextual"/>
             </w:rPr>
           </w:pPr>
-          <w:hyperlink w:anchor="_Toc244220151" w:history="1">
+          <w:hyperlink w:anchor="_Toc244268682" w:history="1">
             <w:r>
               <w:rPr>
                 <w:rStyle w:val="Hiperligao"/>
@@ -3363,7 +3363,7 @@
                 <w:noProof/>
                 <w:webHidden/>
               </w:rPr>
-              <w:instrText xml:space="preserve"> PAGEREF _Toc244220151 \h </w:instrText>
+              <w:instrText xml:space="preserve"> PAGEREF _Toc244268682 \h </w:instrText>
             </w:r>
             <w:r>
               <w:rPr>
@@ -3383,7 +3383,7 @@
                 <w:noProof/>
                 <w:webHidden/>
               </w:rPr>
-              <w:t>27</w:t>
+              <w:t>28</w:t>
             </w:r>
             <w:r>
               <w:rPr>
@@ -3409,7 +3409,7 @@
               <w14:ligatures w14:val="standardContextual"/>
             </w:rPr>
           </w:pPr>
-          <w:hyperlink w:anchor="_Toc244220152" w:history="1">
+          <w:hyperlink w:anchor="_Toc244268683" w:history="1">
             <w:r>
               <w:rPr>
                 <w:rStyle w:val="Hiperligao"/>
@@ -3436,7 +3436,7 @@
                 <w:noProof/>
                 <w:webHidden/>
               </w:rPr>
-              <w:instrText xml:space="preserve"> PAGEREF _Toc244220152 \h </w:instrText>
+              <w:instrText xml:space="preserve"> PAGEREF _Toc244268683 \h </w:instrText>
             </w:r>
             <w:r>
               <w:rPr>
@@ -3456,7 +3456,7 @@
                 <w:noProof/>
                 <w:webHidden/>
               </w:rPr>
-              <w:t>28</w:t>
+              <w:t>29</w:t>
             </w:r>
             <w:r>
               <w:rPr>
@@ -3603,7 +3603,7 @@
         <w:spacing w:after="40" w:line="300" w:lineRule="auto"/>
       </w:pPr>
       <w:r>
-        <w:t>Tabela 6 – Cronograma do projeto</w:t>
+        <w:t>Tabela 6 – Medição da jogabilidade antes e depois das correções (média por jogo de 3 min, IA contra IA)</w:t>
       </w:r>
     </w:p>
     <w:p>
@@ -3611,7 +3611,15 @@
         <w:spacing w:after="40" w:line="300" w:lineRule="auto"/>
       </w:pPr>
       <w:r>
-        <w:t>Tabela 7 – Gestão de riscos</w:t>
+        <w:t>Tabela 7 – Cronograma do projeto</w:t>
+      </w:r>
+    </w:p>
+    <w:p>
+      <w:pPr>
+        <w:spacing w:after="40" w:line="300" w:lineRule="auto"/>
+      </w:pPr>
+      <w:r>
+        <w:t>Tabela 8 – Gestão de riscos</w:t>
       </w:r>
     </w:p>
     <w:p>
@@ -3789,7 +3797,7 @@
       <w:pPr>
         <w:pStyle w:val="Ttulo1"/>
       </w:pPr>
-      <w:bookmarkStart w:id="0" w:name="_Toc244220116"/>
+      <w:bookmarkStart w:id="0" w:name="_Toc244268647"/>
       <w:r>
         <w:t>1.  Introdução</w:t>
       </w:r>
@@ -3811,7 +3819,7 @@
       <w:pPr>
         <w:pStyle w:val="Ttulo2"/>
       </w:pPr>
-      <w:bookmarkStart w:id="1" w:name="_Toc244220117"/>
+      <w:bookmarkStart w:id="1" w:name="_Toc244268648"/>
       <w:r>
         <w:t>1.1  Enquadramento e contextualização do tema</w:t>
       </w:r>
@@ -3840,7 +3848,7 @@
       <w:pPr>
         <w:pStyle w:val="Ttulo2"/>
       </w:pPr>
-      <w:bookmarkStart w:id="2" w:name="_Toc244220118"/>
+      <w:bookmarkStart w:id="2" w:name="_Toc244268649"/>
       <w:r>
         <w:t>1.2  Motivação e pertinência do projeto</w:t>
       </w:r>
@@ -3869,7 +3877,7 @@
       <w:pPr>
         <w:pStyle w:val="Ttulo2"/>
       </w:pPr>
-      <w:bookmarkStart w:id="3" w:name="_Toc244220119"/>
+      <w:bookmarkStart w:id="3" w:name="_Toc244268650"/>
       <w:r>
         <w:t>1.3  Objetivos (geral e específicos)</w:t>
       </w:r>
@@ -4014,7 +4022,7 @@
       <w:pPr>
         <w:pStyle w:val="Ttulo2"/>
       </w:pPr>
-      <w:bookmarkStart w:id="4" w:name="_Toc244220120"/>
+      <w:bookmarkStart w:id="4" w:name="_Toc244268651"/>
       <w:r>
         <w:t xml:space="preserve">1.4  Metodologia de trabalho (processo adotado; planeamento)   </w:t>
       </w:r>
@@ -4167,7 +4175,7 @@
       <w:pPr>
         <w:pStyle w:val="Ttulo2"/>
       </w:pPr>
-      <w:bookmarkStart w:id="5" w:name="_Toc244220121"/>
+      <w:bookmarkStart w:id="5" w:name="_Toc244268652"/>
       <w:r>
         <w:t>1.5  Estrutura do relatório</w:t>
       </w:r>
@@ -4198,7 +4206,7 @@
       <w:pPr>
         <w:pStyle w:val="Ttulo1"/>
       </w:pPr>
-      <w:bookmarkStart w:id="6" w:name="_Toc244220122"/>
+      <w:bookmarkStart w:id="6" w:name="_Toc244268653"/>
       <w:r>
         <w:t>2.  Análise do sistema</w:t>
       </w:r>
@@ -4208,7 +4216,7 @@
       <w:pPr>
         <w:pStyle w:val="Ttulo2"/>
       </w:pPr>
-      <w:bookmarkStart w:id="7" w:name="_Toc244220123"/>
+      <w:bookmarkStart w:id="7" w:name="_Toc244268654"/>
       <w:r>
         <w:t xml:space="preserve">2.1  Descrição do problema e da necessidade a resolver   </w:t>
       </w:r>
@@ -4246,7 +4254,7 @@
       <w:pPr>
         <w:pStyle w:val="Ttulo2"/>
       </w:pPr>
-      <w:bookmarkStart w:id="8" w:name="_Toc244220124"/>
+      <w:bookmarkStart w:id="8" w:name="_Toc244268655"/>
       <w:r>
         <w:t xml:space="preserve">2.2  Intervenientes e contexto de utilização   </w:t>
       </w:r>
@@ -4399,7 +4407,7 @@
       <w:pPr>
         <w:pStyle w:val="Ttulo2"/>
       </w:pPr>
-      <w:bookmarkStart w:id="9" w:name="_Toc244220125"/>
+      <w:bookmarkStart w:id="9" w:name="_Toc244268656"/>
       <w:r>
         <w:t xml:space="preserve">2.3  Levantamento e análise de requisitos   </w:t>
       </w:r>
@@ -4423,7 +4431,7 @@
       <w:pPr>
         <w:pStyle w:val="Ttulo3"/>
       </w:pPr>
-      <w:bookmarkStart w:id="10" w:name="_Toc244220126"/>
+      <w:bookmarkStart w:id="10" w:name="_Toc244268657"/>
       <w:r>
         <w:t xml:space="preserve">2.3.1  Técnicas de levantamento utilizadas   </w:t>
       </w:r>
@@ -4467,7 +4475,7 @@
       <w:pPr>
         <w:pStyle w:val="Ttulo3"/>
       </w:pPr>
-      <w:bookmarkStart w:id="11" w:name="_Toc244220127"/>
+      <w:bookmarkStart w:id="11" w:name="_Toc244268658"/>
       <w:r>
         <w:t xml:space="preserve">2.3.2  Requisitos funcionais (o que o sistema deve fazer)   </w:t>
       </w:r>
@@ -4586,7 +4594,7 @@
       <w:pPr>
         <w:pStyle w:val="Ttulo3"/>
       </w:pPr>
-      <w:bookmarkStart w:id="12" w:name="_Toc244220128"/>
+      <w:bookmarkStart w:id="12" w:name="_Toc244268659"/>
       <w:r>
         <w:t xml:space="preserve">2.3.3  Requisitos não funcionais (segurança, autonomia, robustez)   </w:t>
       </w:r>
@@ -4670,7 +4678,7 @@
       <w:pPr>
         <w:pStyle w:val="Ttulo2"/>
       </w:pPr>
-      <w:bookmarkStart w:id="13" w:name="_Toc244220129"/>
+      <w:bookmarkStart w:id="13" w:name="_Toc244268660"/>
       <w:r>
         <w:t xml:space="preserve">2.4  Modelação do sistema   </w:t>
       </w:r>
@@ -4690,7 +4698,7 @@
       <w:pPr>
         <w:pStyle w:val="Ttulo3"/>
       </w:pPr>
-      <w:bookmarkStart w:id="14" w:name="_Toc244220130"/>
+      <w:bookmarkStart w:id="14" w:name="_Toc244268661"/>
       <w:r>
         <w:t xml:space="preserve">2.4.1  Cenários de utilização / casos de uso   </w:t>
       </w:r>
@@ -4725,7 +4733,7 @@
           <w:noProof/>
         </w:rPr>
         <w:drawing>
-          <wp:inline distT="0" distB="0" distL="0" distR="0" wp14:anchorId="4C3E4CCC" wp14:editId="0D1511D8">
+          <wp:inline distT="0" distB="0" distL="0" distR="0" wp14:anchorId="4FC41C1E" wp14:editId="31778E41">
             <wp:extent cx="5225000" cy="3632619"/>
             <wp:effectExtent l="0" t="0" r="0" b="0"/>
             <wp:docPr id="901" name="Figura 1"/>
@@ -5174,7 +5182,7 @@
       </w:pPr>
     </w:p>
     <w:p/>
-    <w:bookmarkStart w:id="15" w:name="_Toc244220131"/>
+    <w:bookmarkStart w:id="15" w:name="_Toc244268662"/>
     <w:p>
       <w:pPr>
         <w:pStyle w:val="Ttulo3"/>
@@ -5225,7 +5233,7 @@
           <w:noProof/>
         </w:rPr>
         <w:drawing>
-          <wp:inline distT="0" distB="0" distL="0" distR="0" wp14:anchorId="7C5A35E0" wp14:editId="2BD1CB3C">
+          <wp:inline distT="0" distB="0" distL="0" distR="0" wp14:anchorId="529927E8" wp14:editId="589CD662">
             <wp:extent cx="5500000" cy="2894736"/>
             <wp:effectExtent l="0" t="0" r="0" b="0"/>
             <wp:docPr id="902" name="Figura 2"/>
@@ -5297,7 +5305,7 @@
           <w:noProof/>
         </w:rPr>
         <w:drawing>
-          <wp:inline distT="0" distB="0" distL="0" distR="0" wp14:anchorId="2A6E9630" wp14:editId="6F847DA9">
+          <wp:inline distT="0" distB="0" distL="0" distR="0" wp14:anchorId="13D9450C" wp14:editId="113A8FDD">
             <wp:extent cx="5500000" cy="3471311"/>
             <wp:effectExtent l="0" t="0" r="0" b="0"/>
             <wp:docPr id="903" name="Figura 3"/>
@@ -5369,7 +5377,7 @@
           <w:noProof/>
         </w:rPr>
         <w:drawing>
-          <wp:inline distT="0" distB="0" distL="0" distR="0" wp14:anchorId="48D5AE83" wp14:editId="4894A3A4">
+          <wp:inline distT="0" distB="0" distL="0" distR="0" wp14:anchorId="0EADD519" wp14:editId="3DD4E252">
             <wp:extent cx="5500000" cy="2275862"/>
             <wp:effectExtent l="0" t="0" r="0" b="0"/>
             <wp:docPr id="904" name="Figura 4"/>
@@ -5426,7 +5434,7 @@
       <w:pPr>
         <w:pStyle w:val="Ttulo3"/>
       </w:pPr>
-      <w:bookmarkStart w:id="16" w:name="_Toc244220132"/>
+      <w:bookmarkStart w:id="16" w:name="_Toc244268663"/>
       <w:r>
         <w:t xml:space="preserve">2.4.3  Modelação comportamental (fluxogramas / máquina de estados)   </w:t>
       </w:r>
@@ -5461,7 +5469,7 @@
           <w:noProof/>
         </w:rPr>
         <w:drawing>
-          <wp:inline distT="0" distB="0" distL="0" distR="0" wp14:anchorId="0956B26F" wp14:editId="5E07F65C">
+          <wp:inline distT="0" distB="0" distL="0" distR="0" wp14:anchorId="2AFB2D25" wp14:editId="00FFB79E">
             <wp:extent cx="5500000" cy="2332000"/>
             <wp:effectExtent l="0" t="0" r="0" b="0"/>
             <wp:docPr id="905" name="Figura 5"/>
@@ -5533,7 +5541,7 @@
           <w:noProof/>
         </w:rPr>
         <w:drawing>
-          <wp:inline distT="0" distB="0" distL="0" distR="0" wp14:anchorId="7282FD70" wp14:editId="26419F9C">
+          <wp:inline distT="0" distB="0" distL="0" distR="0" wp14:anchorId="6D33CD56" wp14:editId="77594B22">
             <wp:extent cx="4400000" cy="5524444"/>
             <wp:effectExtent l="0" t="0" r="0" b="0"/>
             <wp:docPr id="906" name="Figura 6"/>
@@ -5591,7 +5599,10 @@
         <w:jc w:val="both"/>
       </w:pPr>
       <w:r>
-        <w:t>Cada jogador da IA decide o que fazer em cada frame. Se tem a bola, ataca (remata, passa ou avança). Se não tem, defende quando o adversário tem a bola, apoia quando é um colega a tê-la, ou persegue a bola quando está livre. Só o jogador mais perto vai à bola, para a equipa não andar toda atrás dela.</w:t>
+        <w:t>Cada jogador da IA decide o que fazer em cada frame. Se tem a bola, ataca: contorna a baliza se estiver atrás dela, remata para o canto mais longe do guarda-redes se estiver perto e com a linha livre, passa a um colega desmarcado se estiver pressionado, ou conduz a bola fintando quem aparece à frente. Se não tem a bola e o adversário tem, os jogadores organizam-se numa fila: o mais perto do portador pressiona, o segundo faz a cobertura entre a bola e a baliza e os outros fecham os espaços. Quando é um coleg</w:t>
+      </w:r>
+      <w:r>
+        <w:t>a a ter a bola, abrem espaço para receber. Com a bola solta, só vai buscá-la o jogador a quem o passe se destina ou o mais perto, e vai ao ponto onde a bola vai estar, não onde está.</w:t>
       </w:r>
     </w:p>
     <w:p>
@@ -5605,8 +5616,8 @@
           <w:noProof/>
         </w:rPr>
         <w:drawing>
-          <wp:inline distT="0" distB="0" distL="0" distR="0" wp14:anchorId="3E94E921" wp14:editId="71C07F70">
-            <wp:extent cx="5500000" cy="3784403"/>
+          <wp:inline distT="0" distB="0" distL="0" distR="0" wp14:anchorId="37A45C80" wp14:editId="377D6BCC">
+            <wp:extent cx="5500000" cy="3224137"/>
             <wp:effectExtent l="0" t="0" r="0" b="0"/>
             <wp:docPr id="907" name="Figura 7"/>
             <wp:cNvGraphicFramePr>
@@ -5628,7 +5639,7 @@
                   <pic:spPr>
                     <a:xfrm>
                       <a:off x="0" y="0"/>
-                      <a:ext cx="5500000" cy="3784403"/>
+                      <a:ext cx="5500000" cy="3224137"/>
                     </a:xfrm>
                     <a:prstGeom prst="rect">
                       <a:avLst/>
@@ -5662,7 +5673,7 @@
       <w:pPr>
         <w:pStyle w:val="Ttulo2"/>
       </w:pPr>
-      <w:bookmarkStart w:id="17" w:name="_Toc244220133"/>
+      <w:bookmarkStart w:id="17" w:name="_Toc244268664"/>
       <w:r>
         <w:t>2.5  Projeto do hardware</w:t>
       </w:r>
@@ -5682,7 +5693,7 @@
       <w:pPr>
         <w:pStyle w:val="Ttulo3"/>
       </w:pPr>
-      <w:bookmarkStart w:id="18" w:name="_Toc244220134"/>
+      <w:bookmarkStart w:id="18" w:name="_Toc244268665"/>
       <w:r>
         <w:t>2.5.1  Componentes: sensores, atuadores e controlador</w:t>
       </w:r>
@@ -6237,7 +6248,7 @@
       <w:pPr>
         <w:pStyle w:val="Ttulo3"/>
       </w:pPr>
-      <w:bookmarkStart w:id="19" w:name="_Toc244220135"/>
+      <w:bookmarkStart w:id="19" w:name="_Toc244268666"/>
       <w:r>
         <w:t>2.5.2  Esquema elétrico e ligações</w:t>
       </w:r>
@@ -6257,7 +6268,7 @@
       <w:pPr>
         <w:pStyle w:val="Ttulo3"/>
       </w:pPr>
-      <w:bookmarkStart w:id="20" w:name="_Toc244220136"/>
+      <w:bookmarkStart w:id="20" w:name="_Toc244268667"/>
       <w:r>
         <w:t>2.5.3  Estrutura mecânica</w:t>
       </w:r>
@@ -6277,7 +6288,7 @@
       <w:pPr>
         <w:pStyle w:val="Ttulo2"/>
       </w:pPr>
-      <w:bookmarkStart w:id="21" w:name="_Toc244220137"/>
+      <w:bookmarkStart w:id="21" w:name="_Toc244268668"/>
       <w:r>
         <w:t xml:space="preserve">2.6  Prototipagem (protótipo físico e/ou simulação)   </w:t>
       </w:r>
@@ -6321,7 +6332,7 @@
           <w:noProof/>
         </w:rPr>
         <w:drawing>
-          <wp:inline distT="0" distB="0" distL="0" distR="0" wp14:anchorId="00E5CD79" wp14:editId="0B085016">
+          <wp:inline distT="0" distB="0" distL="0" distR="0" wp14:anchorId="619D4E05" wp14:editId="6AC6F8A5">
             <wp:extent cx="5500000" cy="3093750"/>
             <wp:effectExtent l="0" t="0" r="0" b="0"/>
             <wp:docPr id="908" name="Figura 8"/>
@@ -6378,7 +6389,7 @@
       <w:pPr>
         <w:pStyle w:val="Ttulo1"/>
       </w:pPr>
-      <w:bookmarkStart w:id="22" w:name="_Toc244220138"/>
+      <w:bookmarkStart w:id="22" w:name="_Toc244268669"/>
       <w:r>
         <w:t>3.  Implementação</w:t>
       </w:r>
@@ -6389,7 +6400,7 @@
       <w:pPr>
         <w:pStyle w:val="Ttulo2"/>
       </w:pPr>
-      <w:bookmarkStart w:id="23" w:name="_Toc244220139"/>
+      <w:bookmarkStart w:id="23" w:name="_Toc244268670"/>
       <w:r>
         <w:t>3.1  Montagem do hardware</w:t>
       </w:r>
@@ -6547,7 +6558,7 @@
       <w:pPr>
         <w:pStyle w:val="Ttulo2"/>
       </w:pPr>
-      <w:bookmarkStart w:id="24" w:name="_Toc244220140"/>
+      <w:bookmarkStart w:id="24" w:name="_Toc244268671"/>
       <w:r>
         <w:t>3.2  Programação do controlo (lógica e algoritmos)</w:t>
       </w:r>
@@ -6607,7 +6618,26 @@
         <w:t xml:space="preserve">Movimento e colisões dos jogadores. </w:t>
       </w:r>
       <w:r>
-        <w:t>O jogador não muda de velocidade de repente: acelera até à velocidade pretendida (200 px/s, ou 260 px/s com Shift) com uma aceleração de 2000 px/s². As colisões entre jogadores são detetadas pela distância entre os centros. Quando estão demasiado perto, são separados e, conforme a força do choque, há um desarme limpo, uma queda ou uma falta.</w:t>
+        <w:t xml:space="preserve">O jogador não muda de velocidade de repente: acelera até à velocidade pretendida (200 px/s, ou 260 px/s com Shift) com uma aceleração de 2000 px/s². As colisões entre jogadores são detetadas pela distância entre os centros (menos de 38 px). Quando chocam, acontecem três coisas: são separados (cada um anda metade da sobreposição); a velocidade com que vinham um contra o outro é anulada, como num choque inelástico, para não ficarem a empurrar-se e a tremer; e voltam a ser mantidos dentro do rinque e fora das </w:t>
+      </w:r>
+      <w:r>
+        <w:t>balizas.</w:t>
+      </w:r>
+    </w:p>
+    <w:p>
+      <w:pPr>
+        <w:spacing w:after="120" w:line="300" w:lineRule="auto"/>
+        <w:jc w:val="both"/>
+      </w:pPr>
+      <w:r>
+        <w:rPr>
+          <w:b/>
+          <w:bCs/>
+        </w:rPr>
+        <w:t xml:space="preserve">Desarmes. </w:t>
+      </w:r>
+      <w:r>
+        <w:t>Quando um defensor choca com quem tem a bola, há uma tentativa de desarme com probabilidade p = 0,42 + (defesa do defensor − 0,5 × velocidade do portador − 30) / 100, limitada entre 15 % e 85 % (o jogador humano tem +18 %). Se ganha, a bola salta para o lado dele. Quem acabou de ganhar a bola fica 0,6 s protegido e quem a perdeu fica 0,8 s sem poder desarmar, o que acabou com o «pingue-pongue» da bola a mudar de dono várias vezes por segundo. Só há falta em choques fortes ou cargas por trás.</w:t>
       </w:r>
     </w:p>
     <w:p>
@@ -6623,7 +6653,10 @@
         <w:t xml:space="preserve">Inteligência artificial. </w:t>
       </w:r>
       <w:r>
-        <w:t>Cada jogador da IA tem um papel (avançado, médio ou defesa) e uma posição tática de referência. Em cada frame escolhe um de quatro comportamentos (atacar, defender, apoiar ou perseguir), como mostra o fluxograma da secção 2.4.3. Para não rematar 60 vezes por segundo, há tempos de espera (cooldowns) entre remates e passes. Antes de passar, a IA verifica se há um adversário na linha de passe, através da projeção de cada adversário na reta entre a bola e o alvo.</w:t>
+        <w:t>Cada jogador da IA tem um papel (avançado, médio ou defesa) e uma posição na formação que acompanha a bola. Em cada frame escolhe um de quatro comportamentos (atacar, defender, apoiar ou perseguir), como mostra o fluxograma da secção 2.4.3. O movimento usa três forças somadas: ir para o alvo (abrandando ao chegar, para não passar e voltar para trás), afastar-se dos colegas que estão a menos de 62 px, e, com a bola, desviar-se dos adversários que estão à frente. Antes de passar ou rematar, a IA verifica se a</w:t>
+      </w:r>
+      <w:r>
+        <w:t xml:space="preserve"> linha está livre, calculando a distância de cada adversário ao segmento entre a bola e o alvo. Os passes são feitos para onde o colega vai estar (posição + velocidade × tempo da bola) e o colega que vai receber vai ao encontro da bola. Quando a posse muda, a IA demora um pouco a reagir (tempo de reação), como uma pessoa.</w:t>
       </w:r>
     </w:p>
     <w:p>
@@ -7328,7 +7361,7 @@
                 <w:sz w:val="19"/>
                 <w:szCs w:val="19"/>
               </w:rPr>
-              <w:t>Agressividade</w:t>
+              <w:t>Tempo de reação da IA (s)</w:t>
             </w:r>
           </w:p>
         </w:tc>
@@ -7349,7 +7382,7 @@
                 <w:sz w:val="19"/>
                 <w:szCs w:val="19"/>
               </w:rPr>
-              <w:t>0,30</w:t>
+              <w:t>0,35</w:t>
             </w:r>
           </w:p>
         </w:tc>
@@ -7370,7 +7403,7 @@
                 <w:sz w:val="19"/>
                 <w:szCs w:val="19"/>
               </w:rPr>
-              <w:t>0,60</w:t>
+              <w:t>0,20</w:t>
             </w:r>
           </w:p>
         </w:tc>
@@ -7391,7 +7424,367 @@
                 <w:sz w:val="19"/>
                 <w:szCs w:val="19"/>
               </w:rPr>
-              <w:t>0,90</w:t>
+              <w:t>0,08</w:t>
+            </w:r>
+          </w:p>
+        </w:tc>
+      </w:tr>
+      <w:tr>
+        <w:trPr>
+          <w:cantSplit/>
+          <w:jc w:val="center"/>
+        </w:trPr>
+        <w:tc>
+          <w:tcPr>
+            <w:tcW w:w="3300" w:type="dxa"/>
+            <w:tcMar>
+              <w:left w:w="80" w:type="dxa"/>
+              <w:right w:w="80" w:type="dxa"/>
+            </w:tcMar>
+          </w:tcPr>
+          <w:p>
+            <w:pPr>
+              <w:spacing w:before="20" w:after="20" w:line="240" w:lineRule="auto"/>
+            </w:pPr>
+            <w:r>
+              <w:rPr>
+                <w:sz w:val="19"/>
+                <w:szCs w:val="19"/>
+              </w:rPr>
+              <w:t>Guarda-redes: velocidade (px/s)</w:t>
+            </w:r>
+          </w:p>
+        </w:tc>
+        <w:tc>
+          <w:tcPr>
+            <w:tcW w:w="1800" w:type="dxa"/>
+            <w:tcMar>
+              <w:left w:w="80" w:type="dxa"/>
+              <w:right w:w="80" w:type="dxa"/>
+            </w:tcMar>
+          </w:tcPr>
+          <w:p>
+            <w:pPr>
+              <w:spacing w:before="20" w:after="20" w:line="240" w:lineRule="auto"/>
+            </w:pPr>
+            <w:r>
+              <w:rPr>
+                <w:sz w:val="19"/>
+                <w:szCs w:val="19"/>
+              </w:rPr>
+              <w:t>170</w:t>
+            </w:r>
+          </w:p>
+        </w:tc>
+        <w:tc>
+          <w:tcPr>
+            <w:tcW w:w="1800" w:type="dxa"/>
+            <w:tcMar>
+              <w:left w:w="80" w:type="dxa"/>
+              <w:right w:w="80" w:type="dxa"/>
+            </w:tcMar>
+          </w:tcPr>
+          <w:p>
+            <w:pPr>
+              <w:spacing w:before="20" w:after="20" w:line="240" w:lineRule="auto"/>
+            </w:pPr>
+            <w:r>
+              <w:rPr>
+                <w:sz w:val="19"/>
+                <w:szCs w:val="19"/>
+              </w:rPr>
+              <w:t>230</w:t>
+            </w:r>
+          </w:p>
+        </w:tc>
+        <w:tc>
+          <w:tcPr>
+            <w:tcW w:w="1800" w:type="dxa"/>
+            <w:tcMar>
+              <w:left w:w="80" w:type="dxa"/>
+              <w:right w:w="80" w:type="dxa"/>
+            </w:tcMar>
+          </w:tcPr>
+          <w:p>
+            <w:pPr>
+              <w:spacing w:before="20" w:after="20" w:line="240" w:lineRule="auto"/>
+            </w:pPr>
+            <w:r>
+              <w:rPr>
+                <w:sz w:val="19"/>
+                <w:szCs w:val="19"/>
+              </w:rPr>
+              <w:t>280</w:t>
+            </w:r>
+          </w:p>
+        </w:tc>
+      </w:tr>
+      <w:tr>
+        <w:trPr>
+          <w:cantSplit/>
+          <w:jc w:val="center"/>
+        </w:trPr>
+        <w:tc>
+          <w:tcPr>
+            <w:tcW w:w="3300" w:type="dxa"/>
+            <w:tcMar>
+              <w:left w:w="80" w:type="dxa"/>
+              <w:right w:w="80" w:type="dxa"/>
+            </w:tcMar>
+          </w:tcPr>
+          <w:p>
+            <w:pPr>
+              <w:spacing w:before="20" w:after="20" w:line="240" w:lineRule="auto"/>
+            </w:pPr>
+            <w:r>
+              <w:rPr>
+                <w:sz w:val="19"/>
+                <w:szCs w:val="19"/>
+              </w:rPr>
+              <w:t>Guarda-redes: tempo de reação (s)</w:t>
+            </w:r>
+          </w:p>
+        </w:tc>
+        <w:tc>
+          <w:tcPr>
+            <w:tcW w:w="1800" w:type="dxa"/>
+            <w:tcMar>
+              <w:left w:w="80" w:type="dxa"/>
+              <w:right w:w="80" w:type="dxa"/>
+            </w:tcMar>
+          </w:tcPr>
+          <w:p>
+            <w:pPr>
+              <w:spacing w:before="20" w:after="20" w:line="240" w:lineRule="auto"/>
+            </w:pPr>
+            <w:r>
+              <w:rPr>
+                <w:sz w:val="19"/>
+                <w:szCs w:val="19"/>
+              </w:rPr>
+              <w:t>0,22</w:t>
+            </w:r>
+          </w:p>
+        </w:tc>
+        <w:tc>
+          <w:tcPr>
+            <w:tcW w:w="1800" w:type="dxa"/>
+            <w:tcMar>
+              <w:left w:w="80" w:type="dxa"/>
+              <w:right w:w="80" w:type="dxa"/>
+            </w:tcMar>
+          </w:tcPr>
+          <w:p>
+            <w:pPr>
+              <w:spacing w:before="20" w:after="20" w:line="240" w:lineRule="auto"/>
+            </w:pPr>
+            <w:r>
+              <w:rPr>
+                <w:sz w:val="19"/>
+                <w:szCs w:val="19"/>
+              </w:rPr>
+              <w:t>0,16</w:t>
+            </w:r>
+          </w:p>
+        </w:tc>
+        <w:tc>
+          <w:tcPr>
+            <w:tcW w:w="1800" w:type="dxa"/>
+            <w:tcMar>
+              <w:left w:w="80" w:type="dxa"/>
+              <w:right w:w="80" w:type="dxa"/>
+            </w:tcMar>
+          </w:tcPr>
+          <w:p>
+            <w:pPr>
+              <w:spacing w:before="20" w:after="20" w:line="240" w:lineRule="auto"/>
+            </w:pPr>
+            <w:r>
+              <w:rPr>
+                <w:sz w:val="19"/>
+                <w:szCs w:val="19"/>
+              </w:rPr>
+              <w:t>0,11</w:t>
+            </w:r>
+          </w:p>
+        </w:tc>
+      </w:tr>
+      <w:tr>
+        <w:trPr>
+          <w:cantSplit/>
+          <w:jc w:val="center"/>
+        </w:trPr>
+        <w:tc>
+          <w:tcPr>
+            <w:tcW w:w="3300" w:type="dxa"/>
+            <w:tcMar>
+              <w:left w:w="80" w:type="dxa"/>
+              <w:right w:w="80" w:type="dxa"/>
+            </w:tcMar>
+          </w:tcPr>
+          <w:p>
+            <w:pPr>
+              <w:spacing w:before="20" w:after="20" w:line="240" w:lineRule="auto"/>
+            </w:pPr>
+            <w:r>
+              <w:rPr>
+                <w:sz w:val="19"/>
+                <w:szCs w:val="19"/>
+              </w:rPr>
+              <w:t>Guarda-redes: alcance (px)</w:t>
+            </w:r>
+          </w:p>
+        </w:tc>
+        <w:tc>
+          <w:tcPr>
+            <w:tcW w:w="1800" w:type="dxa"/>
+            <w:tcMar>
+              <w:left w:w="80" w:type="dxa"/>
+              <w:right w:w="80" w:type="dxa"/>
+            </w:tcMar>
+          </w:tcPr>
+          <w:p>
+            <w:pPr>
+              <w:spacing w:before="20" w:after="20" w:line="240" w:lineRule="auto"/>
+            </w:pPr>
+            <w:r>
+              <w:rPr>
+                <w:sz w:val="19"/>
+                <w:szCs w:val="19"/>
+              </w:rPr>
+              <w:t>14</w:t>
+            </w:r>
+          </w:p>
+        </w:tc>
+        <w:tc>
+          <w:tcPr>
+            <w:tcW w:w="1800" w:type="dxa"/>
+            <w:tcMar>
+              <w:left w:w="80" w:type="dxa"/>
+              <w:right w:w="80" w:type="dxa"/>
+            </w:tcMar>
+          </w:tcPr>
+          <w:p>
+            <w:pPr>
+              <w:spacing w:before="20" w:after="20" w:line="240" w:lineRule="auto"/>
+            </w:pPr>
+            <w:r>
+              <w:rPr>
+                <w:sz w:val="19"/>
+                <w:szCs w:val="19"/>
+              </w:rPr>
+              <w:t>16</w:t>
+            </w:r>
+          </w:p>
+        </w:tc>
+        <w:tc>
+          <w:tcPr>
+            <w:tcW w:w="1800" w:type="dxa"/>
+            <w:tcMar>
+              <w:left w:w="80" w:type="dxa"/>
+              <w:right w:w="80" w:type="dxa"/>
+            </w:tcMar>
+          </w:tcPr>
+          <w:p>
+            <w:pPr>
+              <w:spacing w:before="20" w:after="20" w:line="240" w:lineRule="auto"/>
+            </w:pPr>
+            <w:r>
+              <w:rPr>
+                <w:sz w:val="19"/>
+                <w:szCs w:val="19"/>
+              </w:rPr>
+              <w:t>18</w:t>
+            </w:r>
+          </w:p>
+        </w:tc>
+      </w:tr>
+      <w:tr>
+        <w:trPr>
+          <w:cantSplit/>
+          <w:jc w:val="center"/>
+        </w:trPr>
+        <w:tc>
+          <w:tcPr>
+            <w:tcW w:w="3300" w:type="dxa"/>
+            <w:tcMar>
+              <w:left w:w="80" w:type="dxa"/>
+              <w:right w:w="80" w:type="dxa"/>
+            </w:tcMar>
+          </w:tcPr>
+          <w:p>
+            <w:pPr>
+              <w:spacing w:before="20" w:after="20" w:line="240" w:lineRule="auto"/>
+            </w:pPr>
+            <w:r>
+              <w:rPr>
+                <w:sz w:val="19"/>
+                <w:szCs w:val="19"/>
+              </w:rPr>
+              <w:t>Guarda-redes: erro de leitura (px)</w:t>
+            </w:r>
+          </w:p>
+        </w:tc>
+        <w:tc>
+          <w:tcPr>
+            <w:tcW w:w="1800" w:type="dxa"/>
+            <w:tcMar>
+              <w:left w:w="80" w:type="dxa"/>
+              <w:right w:w="80" w:type="dxa"/>
+            </w:tcMar>
+          </w:tcPr>
+          <w:p>
+            <w:pPr>
+              <w:spacing w:before="20" w:after="20" w:line="240" w:lineRule="auto"/>
+            </w:pPr>
+            <w:r>
+              <w:rPr>
+                <w:sz w:val="19"/>
+                <w:szCs w:val="19"/>
+              </w:rPr>
+              <w:t>± 28</w:t>
+            </w:r>
+          </w:p>
+        </w:tc>
+        <w:tc>
+          <w:tcPr>
+            <w:tcW w:w="1800" w:type="dxa"/>
+            <w:tcMar>
+              <w:left w:w="80" w:type="dxa"/>
+              <w:right w:w="80" w:type="dxa"/>
+            </w:tcMar>
+          </w:tcPr>
+          <w:p>
+            <w:pPr>
+              <w:spacing w:before="20" w:after="20" w:line="240" w:lineRule="auto"/>
+            </w:pPr>
+            <w:r>
+              <w:rPr>
+                <w:sz w:val="19"/>
+                <w:szCs w:val="19"/>
+              </w:rPr>
+              <w:t>± 22</w:t>
+            </w:r>
+          </w:p>
+        </w:tc>
+        <w:tc>
+          <w:tcPr>
+            <w:tcW w:w="1800" w:type="dxa"/>
+            <w:tcMar>
+              <w:left w:w="80" w:type="dxa"/>
+              <w:right w:w="80" w:type="dxa"/>
+            </w:tcMar>
+          </w:tcPr>
+          <w:p>
+            <w:pPr>
+              <w:spacing w:before="20" w:after="20" w:line="240" w:lineRule="auto"/>
+            </w:pPr>
+            <w:r>
+              <w:rPr>
+                <w:sz w:val="19"/>
+                <w:szCs w:val="19"/>
+              </w:rPr>
+              <w:t>± 15</w:t>
             </w:r>
           </w:p>
         </w:tc>
@@ -7401,6 +7794,15 @@
       <w:pPr>
         <w:spacing w:after="120"/>
       </w:pPr>
+    </w:p>
+    <w:p>
+      <w:pPr>
+        <w:spacing w:after="120" w:line="300" w:lineRule="auto"/>
+        <w:jc w:val="both"/>
+      </w:pPr>
+      <w:r>
+        <w:t>A dificuldade só se aplica à equipa adversária; os colegas e o guarda-redes do jogador humano ficam sempre no nível normal.</w:t>
+      </w:r>
     </w:p>
     <w:p>
       <w:pPr>
@@ -7415,7 +7817,7 @@
         <w:t xml:space="preserve">Guarda-redes. </w:t>
       </w:r>
       <w:r>
-        <w:t>O guarda-redes só se move na vertical, sobre a linha de golo. Segue a posição da bola (ou o ponto onde ela vai chegar) até 240 px/s e, se a bola estiver ao seu alcance, bloqueia-a e afasta-a.</w:t>
+        <w:t>O guarda-redes só se move na vertical, sobre a linha de golo. Não é perfeito: guarda as últimas posições da bola e reage ao que viu há alguns décimos de segundo (tempo de reação). Quando há um remate, calcula onde a bola vai cruzar a linha de golo, y = y_bola + v_y × (x_GR − x_bola) / v_x, e vai para esse ponto, mas com um pequeno erro de leitura sorteado em cada remate. Se a bola passa ao seu alcance, bloqueia-a e afasta-a. Estes valores foram afinados com simulações até haver um número de golos realista.</w:t>
       </w:r>
     </w:p>
     <w:p>
@@ -7474,7 +7876,7 @@
       <w:pPr>
         <w:pStyle w:val="Ttulo2"/>
       </w:pPr>
-      <w:bookmarkStart w:id="25" w:name="_Toc244220141"/>
+      <w:bookmarkStart w:id="25" w:name="_Toc244268672"/>
       <w:r>
         <w:t>3.3  Integração hardware – software</w:t>
       </w:r>
@@ -8022,7 +8424,7 @@
       <w:pPr>
         <w:pStyle w:val="Ttulo2"/>
       </w:pPr>
-      <w:bookmarkStart w:id="26" w:name="_Toc244220142"/>
+      <w:bookmarkStart w:id="26" w:name="_Toc244268673"/>
       <w:r>
         <w:t>3.4  Decisões técnicas e dificuldades ultrapassadas</w:t>
       </w:r>
@@ -8124,12 +8526,31 @@
         <w:t>Ao início a bola atravessava as tabelas quando ia muito rápida e os jogadores ficavam presos uns nos outros. Foi corrigido limitando a velocidade, verificando a posição depois de cada movimento e separando os jogadores que se sobrepõem.</w:t>
       </w:r>
     </w:p>
+    <w:p>
+      <w:pPr>
+        <w:spacing w:after="120" w:line="300" w:lineRule="auto"/>
+        <w:jc w:val="both"/>
+      </w:pPr>
+      <w:r>
+        <w:rPr>
+          <w:b/>
+          <w:bCs/>
+        </w:rPr>
+        <w:t xml:space="preserve">Colisões e IA com comportamentos estranhos. </w:t>
+      </w:r>
+      <w:r>
+        <w:t>Mesmo depois disso, os jogadores ainda «tremiam» quando iam uns contra os outros, a bola mudava de dono várias vezes por segundo e a IA tinha comportamentos estranhos: os avançados não voltavam para defender, ninguém ia a uma bola parada entre dois colegas, e quase não havia golos porque o guarda-redes tapava a baliza toda e reagia instantaneamente. Para resolver isto sem «adivinhar», foi criado um script que joga partidas IA contra IA sem janela e conta os problemas (Tabela 6). Cada correção foi medida ant</w:t>
+      </w:r>
+      <w:r>
+        <w:t>es e depois. Também se descobriu que, depois de qualquer golo, a bola ia sempre para a equipa do jogador (agora vai para quem sofreu o golo) e que a dificuldade «Difícil» também melhorava os colegas do jogador.</w:t>
+      </w:r>
+    </w:p>
     <w:p/>
     <w:p>
       <w:pPr>
         <w:pStyle w:val="Ttulo1"/>
       </w:pPr>
-      <w:bookmarkStart w:id="27" w:name="_Toc244220143"/>
+      <w:bookmarkStart w:id="27" w:name="_Toc244268674"/>
       <w:r>
         <w:t>4.  Testes e validação</w:t>
       </w:r>
@@ -8140,7 +8561,7 @@
       <w:pPr>
         <w:pStyle w:val="Ttulo2"/>
       </w:pPr>
-      <w:bookmarkStart w:id="28" w:name="_Toc244220144"/>
+      <w:bookmarkStart w:id="28" w:name="_Toc244268675"/>
       <w:r>
         <w:t>4.1  Plano de testes</w:t>
       </w:r>
@@ -9328,6 +9749,456 @@
                 <w:sz w:val="19"/>
                 <w:szCs w:val="19"/>
               </w:rPr>
+              <w:t>Jogadores a chocar uns com os outros</w:t>
+            </w:r>
+          </w:p>
+        </w:tc>
+        <w:tc>
+          <w:tcPr>
+            <w:tcW w:w="3300" w:type="dxa"/>
+            <w:tcMar>
+              <w:left w:w="80" w:type="dxa"/>
+              <w:right w:w="80" w:type="dxa"/>
+            </w:tcMar>
+          </w:tcPr>
+          <w:p>
+            <w:pPr>
+              <w:spacing w:before="20" w:after="20" w:line="240" w:lineRule="auto"/>
+            </w:pPr>
+            <w:r>
+              <w:rPr>
+                <w:sz w:val="19"/>
+                <w:szCs w:val="19"/>
+              </w:rPr>
+              <w:t>Separam-se sem tremer nem ficar sobrepostos</w:t>
+            </w:r>
+          </w:p>
+        </w:tc>
+        <w:tc>
+          <w:tcPr>
+            <w:tcW w:w="1100" w:type="dxa"/>
+            <w:tcMar>
+              <w:left w:w="80" w:type="dxa"/>
+              <w:right w:w="80" w:type="dxa"/>
+            </w:tcMar>
+          </w:tcPr>
+          <w:p>
+            <w:pPr>
+              <w:spacing w:before="20" w:after="20" w:line="240" w:lineRule="auto"/>
+            </w:pPr>
+            <w:r>
+              <w:rPr>
+                <w:sz w:val="19"/>
+                <w:szCs w:val="19"/>
+              </w:rPr>
+              <w:t>Passou</w:t>
+            </w:r>
+          </w:p>
+        </w:tc>
+      </w:tr>
+      <w:tr>
+        <w:trPr>
+          <w:cantSplit/>
+          <w:jc w:val="center"/>
+        </w:trPr>
+        <w:tc>
+          <w:tcPr>
+            <w:tcW w:w="700" w:type="dxa"/>
+            <w:tcMar>
+              <w:left w:w="80" w:type="dxa"/>
+              <w:right w:w="80" w:type="dxa"/>
+            </w:tcMar>
+          </w:tcPr>
+          <w:p>
+            <w:pPr>
+              <w:spacing w:before="20" w:after="20" w:line="240" w:lineRule="auto"/>
+            </w:pPr>
+            <w:r>
+              <w:rPr>
+                <w:sz w:val="19"/>
+                <w:szCs w:val="19"/>
+              </w:rPr>
+              <w:t>T13</w:t>
+            </w:r>
+          </w:p>
+        </w:tc>
+        <w:tc>
+          <w:tcPr>
+            <w:tcW w:w="3100" w:type="dxa"/>
+            <w:tcMar>
+              <w:left w:w="80" w:type="dxa"/>
+              <w:right w:w="80" w:type="dxa"/>
+            </w:tcMar>
+          </w:tcPr>
+          <w:p>
+            <w:pPr>
+              <w:spacing w:before="20" w:after="20" w:line="240" w:lineRule="auto"/>
+            </w:pPr>
+            <w:r>
+              <w:rPr>
+                <w:sz w:val="19"/>
+                <w:szCs w:val="19"/>
+              </w:rPr>
+              <w:t>Disputa de bola entre dois jogadores</w:t>
+            </w:r>
+          </w:p>
+        </w:tc>
+        <w:tc>
+          <w:tcPr>
+            <w:tcW w:w="3300" w:type="dxa"/>
+            <w:tcMar>
+              <w:left w:w="80" w:type="dxa"/>
+              <w:right w:w="80" w:type="dxa"/>
+            </w:tcMar>
+          </w:tcPr>
+          <w:p>
+            <w:pPr>
+              <w:spacing w:before="20" w:after="20" w:line="240" w:lineRule="auto"/>
+            </w:pPr>
+            <w:r>
+              <w:rPr>
+                <w:sz w:val="19"/>
+                <w:szCs w:val="19"/>
+              </w:rPr>
+              <w:t>A bola não muda de dono várias vezes seguidas</w:t>
+            </w:r>
+          </w:p>
+        </w:tc>
+        <w:tc>
+          <w:tcPr>
+            <w:tcW w:w="1100" w:type="dxa"/>
+            <w:tcMar>
+              <w:left w:w="80" w:type="dxa"/>
+              <w:right w:w="80" w:type="dxa"/>
+            </w:tcMar>
+          </w:tcPr>
+          <w:p>
+            <w:pPr>
+              <w:spacing w:before="20" w:after="20" w:line="240" w:lineRule="auto"/>
+            </w:pPr>
+            <w:r>
+              <w:rPr>
+                <w:sz w:val="19"/>
+                <w:szCs w:val="19"/>
+              </w:rPr>
+              <w:t>Passou</w:t>
+            </w:r>
+          </w:p>
+        </w:tc>
+      </w:tr>
+      <w:tr>
+        <w:trPr>
+          <w:cantSplit/>
+          <w:jc w:val="center"/>
+        </w:trPr>
+        <w:tc>
+          <w:tcPr>
+            <w:tcW w:w="700" w:type="dxa"/>
+            <w:tcMar>
+              <w:left w:w="80" w:type="dxa"/>
+              <w:right w:w="80" w:type="dxa"/>
+            </w:tcMar>
+          </w:tcPr>
+          <w:p>
+            <w:pPr>
+              <w:spacing w:before="20" w:after="20" w:line="240" w:lineRule="auto"/>
+            </w:pPr>
+            <w:r>
+              <w:rPr>
+                <w:sz w:val="19"/>
+                <w:szCs w:val="19"/>
+              </w:rPr>
+              <w:t>T14</w:t>
+            </w:r>
+          </w:p>
+        </w:tc>
+        <w:tc>
+          <w:tcPr>
+            <w:tcW w:w="3100" w:type="dxa"/>
+            <w:tcMar>
+              <w:left w:w="80" w:type="dxa"/>
+              <w:right w:w="80" w:type="dxa"/>
+            </w:tcMar>
+          </w:tcPr>
+          <w:p>
+            <w:pPr>
+              <w:spacing w:before="20" w:after="20" w:line="240" w:lineRule="auto"/>
+            </w:pPr>
+            <w:r>
+              <w:rPr>
+                <w:sz w:val="19"/>
+                <w:szCs w:val="19"/>
+              </w:rPr>
+              <w:t>IA defende quando o adversário tem a bola</w:t>
+            </w:r>
+          </w:p>
+        </w:tc>
+        <w:tc>
+          <w:tcPr>
+            <w:tcW w:w="3300" w:type="dxa"/>
+            <w:tcMar>
+              <w:left w:w="80" w:type="dxa"/>
+              <w:right w:w="80" w:type="dxa"/>
+            </w:tcMar>
+          </w:tcPr>
+          <w:p>
+            <w:pPr>
+              <w:spacing w:before="20" w:after="20" w:line="240" w:lineRule="auto"/>
+            </w:pPr>
+            <w:r>
+              <w:rPr>
+                <w:sz w:val="19"/>
+                <w:szCs w:val="19"/>
+              </w:rPr>
+              <w:t>O mais perto pressiona e outro faz cobertura</w:t>
+            </w:r>
+          </w:p>
+        </w:tc>
+        <w:tc>
+          <w:tcPr>
+            <w:tcW w:w="1100" w:type="dxa"/>
+            <w:tcMar>
+              <w:left w:w="80" w:type="dxa"/>
+              <w:right w:w="80" w:type="dxa"/>
+            </w:tcMar>
+          </w:tcPr>
+          <w:p>
+            <w:pPr>
+              <w:spacing w:before="20" w:after="20" w:line="240" w:lineRule="auto"/>
+            </w:pPr>
+            <w:r>
+              <w:rPr>
+                <w:sz w:val="19"/>
+                <w:szCs w:val="19"/>
+              </w:rPr>
+              <w:t>Passou</w:t>
+            </w:r>
+          </w:p>
+        </w:tc>
+      </w:tr>
+      <w:tr>
+        <w:trPr>
+          <w:cantSplit/>
+          <w:jc w:val="center"/>
+        </w:trPr>
+        <w:tc>
+          <w:tcPr>
+            <w:tcW w:w="700" w:type="dxa"/>
+            <w:tcMar>
+              <w:left w:w="80" w:type="dxa"/>
+              <w:right w:w="80" w:type="dxa"/>
+            </w:tcMar>
+          </w:tcPr>
+          <w:p>
+            <w:pPr>
+              <w:spacing w:before="20" w:after="20" w:line="240" w:lineRule="auto"/>
+            </w:pPr>
+            <w:r>
+              <w:rPr>
+                <w:sz w:val="19"/>
+                <w:szCs w:val="19"/>
+              </w:rPr>
+              <w:t>T15</w:t>
+            </w:r>
+          </w:p>
+        </w:tc>
+        <w:tc>
+          <w:tcPr>
+            <w:tcW w:w="3100" w:type="dxa"/>
+            <w:tcMar>
+              <w:left w:w="80" w:type="dxa"/>
+              <w:right w:w="80" w:type="dxa"/>
+            </w:tcMar>
+          </w:tcPr>
+          <w:p>
+            <w:pPr>
+              <w:spacing w:before="20" w:after="20" w:line="240" w:lineRule="auto"/>
+            </w:pPr>
+            <w:r>
+              <w:rPr>
+                <w:sz w:val="19"/>
+                <w:szCs w:val="19"/>
+              </w:rPr>
+              <w:t>Golo marcado</w:t>
+            </w:r>
+          </w:p>
+        </w:tc>
+        <w:tc>
+          <w:tcPr>
+            <w:tcW w:w="3300" w:type="dxa"/>
+            <w:tcMar>
+              <w:left w:w="80" w:type="dxa"/>
+              <w:right w:w="80" w:type="dxa"/>
+            </w:tcMar>
+          </w:tcPr>
+          <w:p>
+            <w:pPr>
+              <w:spacing w:before="20" w:after="20" w:line="240" w:lineRule="auto"/>
+            </w:pPr>
+            <w:r>
+              <w:rPr>
+                <w:sz w:val="19"/>
+                <w:szCs w:val="19"/>
+              </w:rPr>
+              <w:t>Recomeça com a bola a equipa que sofreu o golo</w:t>
+            </w:r>
+          </w:p>
+        </w:tc>
+        <w:tc>
+          <w:tcPr>
+            <w:tcW w:w="1100" w:type="dxa"/>
+            <w:tcMar>
+              <w:left w:w="80" w:type="dxa"/>
+              <w:right w:w="80" w:type="dxa"/>
+            </w:tcMar>
+          </w:tcPr>
+          <w:p>
+            <w:pPr>
+              <w:spacing w:before="20" w:after="20" w:line="240" w:lineRule="auto"/>
+            </w:pPr>
+            <w:r>
+              <w:rPr>
+                <w:sz w:val="19"/>
+                <w:szCs w:val="19"/>
+              </w:rPr>
+              <w:t>Passou</w:t>
+            </w:r>
+          </w:p>
+        </w:tc>
+      </w:tr>
+      <w:tr>
+        <w:trPr>
+          <w:cantSplit/>
+          <w:jc w:val="center"/>
+        </w:trPr>
+        <w:tc>
+          <w:tcPr>
+            <w:tcW w:w="700" w:type="dxa"/>
+            <w:tcMar>
+              <w:left w:w="80" w:type="dxa"/>
+              <w:right w:w="80" w:type="dxa"/>
+            </w:tcMar>
+          </w:tcPr>
+          <w:p>
+            <w:pPr>
+              <w:spacing w:before="20" w:after="20" w:line="240" w:lineRule="auto"/>
+            </w:pPr>
+            <w:r>
+              <w:rPr>
+                <w:sz w:val="19"/>
+                <w:szCs w:val="19"/>
+              </w:rPr>
+              <w:t>T16</w:t>
+            </w:r>
+          </w:p>
+        </w:tc>
+        <w:tc>
+          <w:tcPr>
+            <w:tcW w:w="3100" w:type="dxa"/>
+            <w:tcMar>
+              <w:left w:w="80" w:type="dxa"/>
+              <w:right w:w="80" w:type="dxa"/>
+            </w:tcMar>
+          </w:tcPr>
+          <w:p>
+            <w:pPr>
+              <w:spacing w:before="20" w:after="20" w:line="240" w:lineRule="auto"/>
+            </w:pPr>
+            <w:r>
+              <w:rPr>
+                <w:sz w:val="19"/>
+                <w:szCs w:val="19"/>
+              </w:rPr>
+              <w:t>Mudar a dificuldade</w:t>
+            </w:r>
+          </w:p>
+        </w:tc>
+        <w:tc>
+          <w:tcPr>
+            <w:tcW w:w="3300" w:type="dxa"/>
+            <w:tcMar>
+              <w:left w:w="80" w:type="dxa"/>
+              <w:right w:w="80" w:type="dxa"/>
+            </w:tcMar>
+          </w:tcPr>
+          <w:p>
+            <w:pPr>
+              <w:spacing w:before="20" w:after="20" w:line="240" w:lineRule="auto"/>
+            </w:pPr>
+            <w:r>
+              <w:rPr>
+                <w:sz w:val="19"/>
+                <w:szCs w:val="19"/>
+              </w:rPr>
+              <w:t>Só muda a equipa adversária</w:t>
+            </w:r>
+          </w:p>
+        </w:tc>
+        <w:tc>
+          <w:tcPr>
+            <w:tcW w:w="1100" w:type="dxa"/>
+            <w:tcMar>
+              <w:left w:w="80" w:type="dxa"/>
+              <w:right w:w="80" w:type="dxa"/>
+            </w:tcMar>
+          </w:tcPr>
+          <w:p>
+            <w:pPr>
+              <w:spacing w:before="20" w:after="20" w:line="240" w:lineRule="auto"/>
+            </w:pPr>
+            <w:r>
+              <w:rPr>
+                <w:sz w:val="19"/>
+                <w:szCs w:val="19"/>
+              </w:rPr>
+              <w:t>Passou</w:t>
+            </w:r>
+          </w:p>
+        </w:tc>
+      </w:tr>
+      <w:tr>
+        <w:trPr>
+          <w:cantSplit/>
+          <w:jc w:val="center"/>
+        </w:trPr>
+        <w:tc>
+          <w:tcPr>
+            <w:tcW w:w="700" w:type="dxa"/>
+            <w:tcMar>
+              <w:left w:w="80" w:type="dxa"/>
+              <w:right w:w="80" w:type="dxa"/>
+            </w:tcMar>
+          </w:tcPr>
+          <w:p>
+            <w:pPr>
+              <w:spacing w:before="20" w:after="20" w:line="240" w:lineRule="auto"/>
+            </w:pPr>
+            <w:r>
+              <w:rPr>
+                <w:sz w:val="19"/>
+                <w:szCs w:val="19"/>
+              </w:rPr>
+              <w:t>T17</w:t>
+            </w:r>
+          </w:p>
+        </w:tc>
+        <w:tc>
+          <w:tcPr>
+            <w:tcW w:w="3100" w:type="dxa"/>
+            <w:tcMar>
+              <w:left w:w="80" w:type="dxa"/>
+              <w:right w:w="80" w:type="dxa"/>
+            </w:tcMar>
+          </w:tcPr>
+          <w:p>
+            <w:pPr>
+              <w:spacing w:before="20" w:after="20" w:line="240" w:lineRule="auto"/>
+            </w:pPr>
+            <w:r>
+              <w:rPr>
+                <w:sz w:val="19"/>
+                <w:szCs w:val="19"/>
+              </w:rPr>
               <w:t>Gravar o torneio em SQLite</w:t>
             </w:r>
           </w:p>
@@ -9386,7 +10257,7 @@
       <w:pPr>
         <w:pStyle w:val="Ttulo2"/>
       </w:pPr>
-      <w:bookmarkStart w:id="29" w:name="_Toc244220145"/>
+      <w:bookmarkStart w:id="29" w:name="_Toc244268676"/>
       <w:r>
         <w:t>4.2  Ensaios, calibração e medições</w:t>
       </w:r>
@@ -9504,86 +10375,11 @@
     </w:p>
     <w:p>
       <w:pPr>
-        <w:pStyle w:val="Ttulo2"/>
-      </w:pPr>
-    </w:p>
-    <w:p>
-      <w:pPr>
-        <w:pStyle w:val="Ttulo2"/>
-      </w:pPr>
-      <w:bookmarkStart w:id="30" w:name="_Toc244220146"/>
-      <w:r>
-        <w:t>4.3  Resultados obtidos e ajustes</w:t>
-      </w:r>
-      <w:bookmarkEnd w:id="30"/>
-    </w:p>
-    <w:p>
-      <w:pPr>
         <w:spacing w:after="120" w:line="300" w:lineRule="auto"/>
         <w:jc w:val="both"/>
       </w:pPr>
       <w:r>
-        <w:t>Os testes T01 a T11 passaram. O teste T12 ainda não foi feito porque o torneio com base de dados é a próxima fase do projeto.</w:t>
-      </w:r>
-    </w:p>
-    <w:p>
-      <w:pPr>
-        <w:spacing w:after="120" w:line="300" w:lineRule="auto"/>
-        <w:jc w:val="both"/>
-      </w:pPr>
-      <w:r>
-        <w:t>Os testes levaram a vários ajustes: o triângulo de seleção e a etiqueta «GR» ficavam a flutuar acima dos jogadores depois da câmara em perspetiva e passaram a usar o retângulo visível do sprite; o stick ficava demasiado claro e foi escurecido; as tabelas e as balizas foram redesenhadas para ficarem iguais à imagem de referência; e a IA foi afinada para haver menos quedas.</w:t>
-      </w:r>
-    </w:p>
-    <w:p/>
-    <w:p>
-      <w:pPr>
-        <w:spacing w:before="120" w:after="120" w:line="360" w:lineRule="auto"/>
-        <w:jc w:val="both"/>
-      </w:pPr>
-    </w:p>
-    <w:p>
-      <w:pPr>
-        <w:pStyle w:val="Ttulo1"/>
-      </w:pPr>
-      <w:bookmarkStart w:id="31" w:name="_Toc244220147"/>
-      <w:r>
-        <w:t>5.  Gestão do projeto</w:t>
-      </w:r>
-      <w:bookmarkEnd w:id="31"/>
-    </w:p>
-    <w:p>
-      <w:pPr>
-        <w:spacing w:before="120" w:after="120" w:line="360" w:lineRule="auto"/>
-        <w:jc w:val="both"/>
-      </w:pPr>
-    </w:p>
-    <w:p>
-      <w:pPr>
-        <w:pStyle w:val="Ttulo2"/>
-      </w:pPr>
-      <w:bookmarkStart w:id="32" w:name="_Toc244220148"/>
-      <w:r>
-        <w:t xml:space="preserve">5.1  Planeamento e cronograma   </w:t>
-      </w:r>
-      <w:r>
-        <w:rPr>
-          <w:rFonts w:ascii="Cambria Math" w:eastAsia="Cambria Math" w:hAnsi="Cambria Math" w:cs="Cambria Math"/>
-        </w:rPr>
-        <w:t>◆</w:t>
-      </w:r>
-      <w:r>
-        <w:t xml:space="preserve"> MADS</w:t>
-      </w:r>
-      <w:bookmarkEnd w:id="32"/>
-    </w:p>
-    <w:p>
-      <w:pPr>
-        <w:spacing w:after="120" w:line="300" w:lineRule="auto"/>
-        <w:jc w:val="both"/>
-      </w:pPr>
-      <w:r>
-        <w:t>A tabela seguinte mostra o cronograma do projeto, desde o anteprojeto até à defesa.</w:t>
+        <w:t>Para a jogabilidade foi criado um script de medição que põe as duas equipas controladas pela IA a jogar sem janela, 8 jogos de 3 minutos, sempre com as mesmas sementes aleatórias (para a comparação ser justa), e conta os problemas. A tabela compara a versão antiga com a versão corrigida.</w:t>
       </w:r>
     </w:p>
     <w:p>
@@ -9599,7 +10395,773 @@
           <w:sz w:val="20"/>
           <w:szCs w:val="20"/>
         </w:rPr>
-        <w:t>Tabela 6 – Cronograma do projeto</w:t>
+        <w:t>Tabela 6 – Medição da jogabilidade antes e depois das correções (média por jogo de 3 min, IA contra IA)</w:t>
+      </w:r>
+    </w:p>
+    <w:tbl>
+      <w:tblPr>
+        <w:tblW w:w="8700" w:type="dxa"/>
+        <w:jc w:val="center"/>
+        <w:tblBorders>
+          <w:top w:val="single" w:sz="4" w:space="0" w:color="8EA9C1"/>
+          <w:left w:val="single" w:sz="4" w:space="0" w:color="8EA9C1"/>
+          <w:bottom w:val="single" w:sz="4" w:space="0" w:color="8EA9C1"/>
+          <w:right w:val="single" w:sz="4" w:space="0" w:color="8EA9C1"/>
+          <w:insideH w:val="single" w:sz="4" w:space="0" w:color="8EA9C1"/>
+          <w:insideV w:val="single" w:sz="4" w:space="0" w:color="8EA9C1"/>
+        </w:tblBorders>
+        <w:tblLayout w:type="fixed"/>
+        <w:tblLook w:val="04A0" w:firstRow="1" w:lastRow="0" w:firstColumn="1" w:lastColumn="0" w:noHBand="0" w:noVBand="1"/>
+      </w:tblPr>
+      <w:tblGrid>
+        <w:gridCol w:w="5100"/>
+        <w:gridCol w:w="1800"/>
+        <w:gridCol w:w="1800"/>
+      </w:tblGrid>
+      <w:tr>
+        <w:trPr>
+          <w:cantSplit/>
+          <w:tblHeader/>
+          <w:jc w:val="center"/>
+        </w:trPr>
+        <w:tc>
+          <w:tcPr>
+            <w:tcW w:w="5100" w:type="dxa"/>
+            <w:shd w:val="clear" w:color="auto" w:fill="D9E2F3"/>
+            <w:tcMar>
+              <w:left w:w="80" w:type="dxa"/>
+              <w:right w:w="80" w:type="dxa"/>
+            </w:tcMar>
+          </w:tcPr>
+          <w:p>
+            <w:pPr>
+              <w:spacing w:before="20" w:after="20" w:line="240" w:lineRule="auto"/>
+            </w:pPr>
+            <w:r>
+              <w:rPr>
+                <w:b/>
+                <w:bCs/>
+                <w:sz w:val="19"/>
+                <w:szCs w:val="19"/>
+              </w:rPr>
+              <w:t>Medida</w:t>
+            </w:r>
+          </w:p>
+        </w:tc>
+        <w:tc>
+          <w:tcPr>
+            <w:tcW w:w="1800" w:type="dxa"/>
+            <w:shd w:val="clear" w:color="auto" w:fill="D9E2F3"/>
+            <w:tcMar>
+              <w:left w:w="80" w:type="dxa"/>
+              <w:right w:w="80" w:type="dxa"/>
+            </w:tcMar>
+          </w:tcPr>
+          <w:p>
+            <w:pPr>
+              <w:spacing w:before="20" w:after="20" w:line="240" w:lineRule="auto"/>
+            </w:pPr>
+            <w:r>
+              <w:rPr>
+                <w:b/>
+                <w:bCs/>
+                <w:sz w:val="19"/>
+                <w:szCs w:val="19"/>
+              </w:rPr>
+              <w:t>Antes</w:t>
+            </w:r>
+          </w:p>
+        </w:tc>
+        <w:tc>
+          <w:tcPr>
+            <w:tcW w:w="1800" w:type="dxa"/>
+            <w:shd w:val="clear" w:color="auto" w:fill="D9E2F3"/>
+            <w:tcMar>
+              <w:left w:w="80" w:type="dxa"/>
+              <w:right w:w="80" w:type="dxa"/>
+            </w:tcMar>
+          </w:tcPr>
+          <w:p>
+            <w:pPr>
+              <w:spacing w:before="20" w:after="20" w:line="240" w:lineRule="auto"/>
+            </w:pPr>
+            <w:r>
+              <w:rPr>
+                <w:b/>
+                <w:bCs/>
+                <w:sz w:val="19"/>
+                <w:szCs w:val="19"/>
+              </w:rPr>
+              <w:t>Depois</w:t>
+            </w:r>
+          </w:p>
+        </w:tc>
+      </w:tr>
+      <w:tr>
+        <w:trPr>
+          <w:cantSplit/>
+          <w:jc w:val="center"/>
+        </w:trPr>
+        <w:tc>
+          <w:tcPr>
+            <w:tcW w:w="5100" w:type="dxa"/>
+            <w:tcMar>
+              <w:left w:w="80" w:type="dxa"/>
+              <w:right w:w="80" w:type="dxa"/>
+            </w:tcMar>
+          </w:tcPr>
+          <w:p>
+            <w:pPr>
+              <w:spacing w:before="20" w:after="20" w:line="240" w:lineRule="auto"/>
+            </w:pPr>
+            <w:r>
+              <w:rPr>
+                <w:sz w:val="19"/>
+                <w:szCs w:val="19"/>
+              </w:rPr>
+              <w:t>Golos</w:t>
+            </w:r>
+          </w:p>
+        </w:tc>
+        <w:tc>
+          <w:tcPr>
+            <w:tcW w:w="1800" w:type="dxa"/>
+            <w:tcMar>
+              <w:left w:w="80" w:type="dxa"/>
+              <w:right w:w="80" w:type="dxa"/>
+            </w:tcMar>
+          </w:tcPr>
+          <w:p>
+            <w:pPr>
+              <w:spacing w:before="20" w:after="20" w:line="240" w:lineRule="auto"/>
+            </w:pPr>
+            <w:r>
+              <w:rPr>
+                <w:sz w:val="19"/>
+                <w:szCs w:val="19"/>
+              </w:rPr>
+              <w:t>0,4</w:t>
+            </w:r>
+          </w:p>
+        </w:tc>
+        <w:tc>
+          <w:tcPr>
+            <w:tcW w:w="1800" w:type="dxa"/>
+            <w:tcMar>
+              <w:left w:w="80" w:type="dxa"/>
+              <w:right w:w="80" w:type="dxa"/>
+            </w:tcMar>
+          </w:tcPr>
+          <w:p>
+            <w:pPr>
+              <w:spacing w:before="20" w:after="20" w:line="240" w:lineRule="auto"/>
+            </w:pPr>
+            <w:r>
+              <w:rPr>
+                <w:sz w:val="19"/>
+                <w:szCs w:val="19"/>
+              </w:rPr>
+              <w:t>2,0</w:t>
+            </w:r>
+          </w:p>
+        </w:tc>
+      </w:tr>
+      <w:tr>
+        <w:trPr>
+          <w:cantSplit/>
+          <w:jc w:val="center"/>
+        </w:trPr>
+        <w:tc>
+          <w:tcPr>
+            <w:tcW w:w="5100" w:type="dxa"/>
+            <w:tcMar>
+              <w:left w:w="80" w:type="dxa"/>
+              <w:right w:w="80" w:type="dxa"/>
+            </w:tcMar>
+          </w:tcPr>
+          <w:p>
+            <w:pPr>
+              <w:spacing w:before="20" w:after="20" w:line="240" w:lineRule="auto"/>
+            </w:pPr>
+            <w:r>
+              <w:rPr>
+                <w:sz w:val="19"/>
+                <w:szCs w:val="19"/>
+              </w:rPr>
+              <w:t>Remates</w:t>
+            </w:r>
+          </w:p>
+        </w:tc>
+        <w:tc>
+          <w:tcPr>
+            <w:tcW w:w="1800" w:type="dxa"/>
+            <w:tcMar>
+              <w:left w:w="80" w:type="dxa"/>
+              <w:right w:w="80" w:type="dxa"/>
+            </w:tcMar>
+          </w:tcPr>
+          <w:p>
+            <w:pPr>
+              <w:spacing w:before="20" w:after="20" w:line="240" w:lineRule="auto"/>
+            </w:pPr>
+            <w:r>
+              <w:rPr>
+                <w:sz w:val="19"/>
+                <w:szCs w:val="19"/>
+              </w:rPr>
+              <w:t>20</w:t>
+            </w:r>
+          </w:p>
+        </w:tc>
+        <w:tc>
+          <w:tcPr>
+            <w:tcW w:w="1800" w:type="dxa"/>
+            <w:tcMar>
+              <w:left w:w="80" w:type="dxa"/>
+              <w:right w:w="80" w:type="dxa"/>
+            </w:tcMar>
+          </w:tcPr>
+          <w:p>
+            <w:pPr>
+              <w:spacing w:before="20" w:after="20" w:line="240" w:lineRule="auto"/>
+            </w:pPr>
+            <w:r>
+              <w:rPr>
+                <w:sz w:val="19"/>
+                <w:szCs w:val="19"/>
+              </w:rPr>
+              <w:t>50</w:t>
+            </w:r>
+          </w:p>
+        </w:tc>
+      </w:tr>
+      <w:tr>
+        <w:trPr>
+          <w:cantSplit/>
+          <w:jc w:val="center"/>
+        </w:trPr>
+        <w:tc>
+          <w:tcPr>
+            <w:tcW w:w="5100" w:type="dxa"/>
+            <w:tcMar>
+              <w:left w:w="80" w:type="dxa"/>
+              <w:right w:w="80" w:type="dxa"/>
+            </w:tcMar>
+          </w:tcPr>
+          <w:p>
+            <w:pPr>
+              <w:spacing w:before="20" w:after="20" w:line="240" w:lineRule="auto"/>
+            </w:pPr>
+            <w:r>
+              <w:rPr>
+                <w:sz w:val="19"/>
+                <w:szCs w:val="19"/>
+              </w:rPr>
+              <w:t>Bola roubada e devolvida em menos de 0,6 s («pingue-pongue»)</w:t>
+            </w:r>
+          </w:p>
+        </w:tc>
+        <w:tc>
+          <w:tcPr>
+            <w:tcW w:w="1800" w:type="dxa"/>
+            <w:tcMar>
+              <w:left w:w="80" w:type="dxa"/>
+              <w:right w:w="80" w:type="dxa"/>
+            </w:tcMar>
+          </w:tcPr>
+          <w:p>
+            <w:pPr>
+              <w:spacing w:before="20" w:after="20" w:line="240" w:lineRule="auto"/>
+            </w:pPr>
+            <w:r>
+              <w:rPr>
+                <w:sz w:val="19"/>
+                <w:szCs w:val="19"/>
+              </w:rPr>
+              <w:t>101</w:t>
+            </w:r>
+          </w:p>
+        </w:tc>
+        <w:tc>
+          <w:tcPr>
+            <w:tcW w:w="1800" w:type="dxa"/>
+            <w:tcMar>
+              <w:left w:w="80" w:type="dxa"/>
+              <w:right w:w="80" w:type="dxa"/>
+            </w:tcMar>
+          </w:tcPr>
+          <w:p>
+            <w:pPr>
+              <w:spacing w:before="20" w:after="20" w:line="240" w:lineRule="auto"/>
+            </w:pPr>
+            <w:r>
+              <w:rPr>
+                <w:sz w:val="19"/>
+                <w:szCs w:val="19"/>
+              </w:rPr>
+              <w:t>16</w:t>
+            </w:r>
+          </w:p>
+        </w:tc>
+      </w:tr>
+      <w:tr>
+        <w:trPr>
+          <w:cantSplit/>
+          <w:jc w:val="center"/>
+        </w:trPr>
+        <w:tc>
+          <w:tcPr>
+            <w:tcW w:w="5100" w:type="dxa"/>
+            <w:tcMar>
+              <w:left w:w="80" w:type="dxa"/>
+              <w:right w:w="80" w:type="dxa"/>
+            </w:tcMar>
+          </w:tcPr>
+          <w:p>
+            <w:pPr>
+              <w:spacing w:before="20" w:after="20" w:line="240" w:lineRule="auto"/>
+            </w:pPr>
+            <w:r>
+              <w:rPr>
+                <w:sz w:val="19"/>
+                <w:szCs w:val="19"/>
+              </w:rPr>
+              <w:t>Passes (muitos eram intercetados)</w:t>
+            </w:r>
+          </w:p>
+        </w:tc>
+        <w:tc>
+          <w:tcPr>
+            <w:tcW w:w="1800" w:type="dxa"/>
+            <w:tcMar>
+              <w:left w:w="80" w:type="dxa"/>
+              <w:right w:w="80" w:type="dxa"/>
+            </w:tcMar>
+          </w:tcPr>
+          <w:p>
+            <w:pPr>
+              <w:spacing w:before="20" w:after="20" w:line="240" w:lineRule="auto"/>
+            </w:pPr>
+            <w:r>
+              <w:rPr>
+                <w:sz w:val="19"/>
+                <w:szCs w:val="19"/>
+              </w:rPr>
+              <w:t>378</w:t>
+            </w:r>
+          </w:p>
+        </w:tc>
+        <w:tc>
+          <w:tcPr>
+            <w:tcW w:w="1800" w:type="dxa"/>
+            <w:tcMar>
+              <w:left w:w="80" w:type="dxa"/>
+              <w:right w:w="80" w:type="dxa"/>
+            </w:tcMar>
+          </w:tcPr>
+          <w:p>
+            <w:pPr>
+              <w:spacing w:before="20" w:after="20" w:line="240" w:lineRule="auto"/>
+            </w:pPr>
+            <w:r>
+              <w:rPr>
+                <w:sz w:val="19"/>
+                <w:szCs w:val="19"/>
+              </w:rPr>
+              <w:t>80</w:t>
+            </w:r>
+          </w:p>
+        </w:tc>
+      </w:tr>
+      <w:tr>
+        <w:trPr>
+          <w:cantSplit/>
+          <w:jc w:val="center"/>
+        </w:trPr>
+        <w:tc>
+          <w:tcPr>
+            <w:tcW w:w="5100" w:type="dxa"/>
+            <w:tcMar>
+              <w:left w:w="80" w:type="dxa"/>
+              <w:right w:w="80" w:type="dxa"/>
+            </w:tcMar>
+          </w:tcPr>
+          <w:p>
+            <w:pPr>
+              <w:spacing w:before="20" w:after="20" w:line="240" w:lineRule="auto"/>
+            </w:pPr>
+            <w:r>
+              <w:rPr>
+                <w:sz w:val="19"/>
+                <w:szCs w:val="19"/>
+              </w:rPr>
+              <w:t>Faltas apitadas</w:t>
+            </w:r>
+          </w:p>
+        </w:tc>
+        <w:tc>
+          <w:tcPr>
+            <w:tcW w:w="1800" w:type="dxa"/>
+            <w:tcMar>
+              <w:left w:w="80" w:type="dxa"/>
+              <w:right w:w="80" w:type="dxa"/>
+            </w:tcMar>
+          </w:tcPr>
+          <w:p>
+            <w:pPr>
+              <w:spacing w:before="20" w:after="20" w:line="240" w:lineRule="auto"/>
+            </w:pPr>
+            <w:r>
+              <w:rPr>
+                <w:sz w:val="19"/>
+                <w:szCs w:val="19"/>
+              </w:rPr>
+              <w:t>15,1</w:t>
+            </w:r>
+          </w:p>
+        </w:tc>
+        <w:tc>
+          <w:tcPr>
+            <w:tcW w:w="1800" w:type="dxa"/>
+            <w:tcMar>
+              <w:left w:w="80" w:type="dxa"/>
+              <w:right w:w="80" w:type="dxa"/>
+            </w:tcMar>
+          </w:tcPr>
+          <w:p>
+            <w:pPr>
+              <w:spacing w:before="20" w:after="20" w:line="240" w:lineRule="auto"/>
+            </w:pPr>
+            <w:r>
+              <w:rPr>
+                <w:sz w:val="19"/>
+                <w:szCs w:val="19"/>
+              </w:rPr>
+              <w:t>0,5</w:t>
+            </w:r>
+          </w:p>
+        </w:tc>
+      </w:tr>
+      <w:tr>
+        <w:trPr>
+          <w:cantSplit/>
+          <w:jc w:val="center"/>
+        </w:trPr>
+        <w:tc>
+          <w:tcPr>
+            <w:tcW w:w="5100" w:type="dxa"/>
+            <w:tcMar>
+              <w:left w:w="80" w:type="dxa"/>
+              <w:right w:w="80" w:type="dxa"/>
+            </w:tcMar>
+          </w:tcPr>
+          <w:p>
+            <w:pPr>
+              <w:spacing w:before="20" w:after="20" w:line="240" w:lineRule="auto"/>
+            </w:pPr>
+            <w:r>
+              <w:rPr>
+                <w:sz w:val="19"/>
+                <w:szCs w:val="19"/>
+              </w:rPr>
+              <w:t>Frames com jogadores a «tremer» (inverter o sentido)</w:t>
+            </w:r>
+          </w:p>
+        </w:tc>
+        <w:tc>
+          <w:tcPr>
+            <w:tcW w:w="1800" w:type="dxa"/>
+            <w:tcMar>
+              <w:left w:w="80" w:type="dxa"/>
+              <w:right w:w="80" w:type="dxa"/>
+            </w:tcMar>
+          </w:tcPr>
+          <w:p>
+            <w:pPr>
+              <w:spacing w:before="20" w:after="20" w:line="240" w:lineRule="auto"/>
+            </w:pPr>
+            <w:r>
+              <w:rPr>
+                <w:sz w:val="19"/>
+                <w:szCs w:val="19"/>
+              </w:rPr>
+              <w:t>59</w:t>
+            </w:r>
+          </w:p>
+        </w:tc>
+        <w:tc>
+          <w:tcPr>
+            <w:tcW w:w="1800" w:type="dxa"/>
+            <w:tcMar>
+              <w:left w:w="80" w:type="dxa"/>
+              <w:right w:w="80" w:type="dxa"/>
+            </w:tcMar>
+          </w:tcPr>
+          <w:p>
+            <w:pPr>
+              <w:spacing w:before="20" w:after="20" w:line="240" w:lineRule="auto"/>
+            </w:pPr>
+            <w:r>
+              <w:rPr>
+                <w:sz w:val="19"/>
+                <w:szCs w:val="19"/>
+              </w:rPr>
+              <w:t>31</w:t>
+            </w:r>
+          </w:p>
+        </w:tc>
+      </w:tr>
+      <w:tr>
+        <w:trPr>
+          <w:cantSplit/>
+          <w:jc w:val="center"/>
+        </w:trPr>
+        <w:tc>
+          <w:tcPr>
+            <w:tcW w:w="5100" w:type="dxa"/>
+            <w:tcMar>
+              <w:left w:w="80" w:type="dxa"/>
+              <w:right w:w="80" w:type="dxa"/>
+            </w:tcMar>
+          </w:tcPr>
+          <w:p>
+            <w:pPr>
+              <w:spacing w:before="20" w:after="20" w:line="240" w:lineRule="auto"/>
+            </w:pPr>
+            <w:r>
+              <w:rPr>
+                <w:sz w:val="19"/>
+                <w:szCs w:val="19"/>
+              </w:rPr>
+              <w:t>Momentos com jogadores sobrepostos</w:t>
+            </w:r>
+          </w:p>
+        </w:tc>
+        <w:tc>
+          <w:tcPr>
+            <w:tcW w:w="1800" w:type="dxa"/>
+            <w:tcMar>
+              <w:left w:w="80" w:type="dxa"/>
+              <w:right w:w="80" w:type="dxa"/>
+            </w:tcMar>
+          </w:tcPr>
+          <w:p>
+            <w:pPr>
+              <w:spacing w:before="20" w:after="20" w:line="240" w:lineRule="auto"/>
+            </w:pPr>
+            <w:r>
+              <w:rPr>
+                <w:sz w:val="19"/>
+                <w:szCs w:val="19"/>
+              </w:rPr>
+              <w:t>4,8</w:t>
+            </w:r>
+          </w:p>
+        </w:tc>
+        <w:tc>
+          <w:tcPr>
+            <w:tcW w:w="1800" w:type="dxa"/>
+            <w:tcMar>
+              <w:left w:w="80" w:type="dxa"/>
+              <w:right w:w="80" w:type="dxa"/>
+            </w:tcMar>
+          </w:tcPr>
+          <w:p>
+            <w:pPr>
+              <w:spacing w:before="20" w:after="20" w:line="240" w:lineRule="auto"/>
+            </w:pPr>
+            <w:r>
+              <w:rPr>
+                <w:sz w:val="19"/>
+                <w:szCs w:val="19"/>
+              </w:rPr>
+              <w:t>0,6</w:t>
+            </w:r>
+          </w:p>
+        </w:tc>
+      </w:tr>
+      <w:tr>
+        <w:trPr>
+          <w:cantSplit/>
+          <w:jc w:val="center"/>
+        </w:trPr>
+        <w:tc>
+          <w:tcPr>
+            <w:tcW w:w="5100" w:type="dxa"/>
+            <w:tcMar>
+              <w:left w:w="80" w:type="dxa"/>
+              <w:right w:w="80" w:type="dxa"/>
+            </w:tcMar>
+          </w:tcPr>
+          <w:p>
+            <w:pPr>
+              <w:spacing w:before="20" w:after="20" w:line="240" w:lineRule="auto"/>
+            </w:pPr>
+            <w:r>
+              <w:rPr>
+                <w:sz w:val="19"/>
+                <w:szCs w:val="19"/>
+              </w:rPr>
+              <w:t>Momentos com jogadores fora do rinque</w:t>
+            </w:r>
+          </w:p>
+        </w:tc>
+        <w:tc>
+          <w:tcPr>
+            <w:tcW w:w="1800" w:type="dxa"/>
+            <w:tcMar>
+              <w:left w:w="80" w:type="dxa"/>
+              <w:right w:w="80" w:type="dxa"/>
+            </w:tcMar>
+          </w:tcPr>
+          <w:p>
+            <w:pPr>
+              <w:spacing w:before="20" w:after="20" w:line="240" w:lineRule="auto"/>
+            </w:pPr>
+            <w:r>
+              <w:rPr>
+                <w:sz w:val="19"/>
+                <w:szCs w:val="19"/>
+              </w:rPr>
+              <w:t>0,4</w:t>
+            </w:r>
+          </w:p>
+        </w:tc>
+        <w:tc>
+          <w:tcPr>
+            <w:tcW w:w="1800" w:type="dxa"/>
+            <w:tcMar>
+              <w:left w:w="80" w:type="dxa"/>
+              <w:right w:w="80" w:type="dxa"/>
+            </w:tcMar>
+          </w:tcPr>
+          <w:p>
+            <w:pPr>
+              <w:spacing w:before="20" w:after="20" w:line="240" w:lineRule="auto"/>
+            </w:pPr>
+            <w:r>
+              <w:rPr>
+                <w:sz w:val="19"/>
+                <w:szCs w:val="19"/>
+              </w:rPr>
+              <w:t>0</w:t>
+            </w:r>
+          </w:p>
+        </w:tc>
+      </w:tr>
+    </w:tbl>
+    <w:p>
+      <w:pPr>
+        <w:spacing w:after="120"/>
+      </w:pPr>
+    </w:p>
+    <w:p>
+      <w:pPr>
+        <w:pStyle w:val="Ttulo2"/>
+      </w:pPr>
+    </w:p>
+    <w:p>
+      <w:pPr>
+        <w:pStyle w:val="Ttulo2"/>
+      </w:pPr>
+      <w:bookmarkStart w:id="30" w:name="_Toc244268677"/>
+      <w:r>
+        <w:t>4.3  Resultados obtidos e ajustes</w:t>
+      </w:r>
+      <w:bookmarkEnd w:id="30"/>
+    </w:p>
+    <w:p>
+      <w:pPr>
+        <w:spacing w:after="120" w:line="300" w:lineRule="auto"/>
+        <w:jc w:val="both"/>
+      </w:pPr>
+      <w:r>
+        <w:t>Os testes T01 a T16 passaram. O teste T17 ainda não foi feito porque o torneio com base de dados é a próxima fase do projeto.</w:t>
+      </w:r>
+    </w:p>
+    <w:p>
+      <w:pPr>
+        <w:spacing w:after="120" w:line="300" w:lineRule="auto"/>
+        <w:jc w:val="both"/>
+      </w:pPr>
+      <w:r>
+        <w:t>Os testes levaram a vários ajustes: o triângulo de seleção e a etiqueta «GR» ficavam a flutuar acima dos jogadores depois da câmara em perspetiva e passaram a usar o retângulo visível do sprite; o stick ficava demasiado claro e foi escurecido; as tabelas e as balizas foram redesenhadas para ficarem iguais à imagem de referência; e a IA foi afinada para haver menos quedas.</w:t>
+      </w:r>
+    </w:p>
+    <w:p>
+      <w:pPr>
+        <w:spacing w:after="120" w:line="300" w:lineRule="auto"/>
+        <w:jc w:val="both"/>
+      </w:pPr>
+      <w:r>
+        <w:t>Na afinação do guarda-redes testaram-se várias combinações de alcance, erro de leitura e tempo de reação. Com o alcance antigo (34 px) o guarda-redes tapava a baliza toda e quase não havia golos; com antecipação perfeita da trajetória também não. Os valores finais dão cerca de 4 % de remates convertidos em golo entre duas equipas da IA, o que corresponde a 6 ou 7 golos num jogo de 2 × 5 minutos.</w:t>
+      </w:r>
+    </w:p>
+    <w:p/>
+    <w:p>
+      <w:pPr>
+        <w:spacing w:before="120" w:after="120" w:line="360" w:lineRule="auto"/>
+        <w:jc w:val="both"/>
+      </w:pPr>
+    </w:p>
+    <w:p>
+      <w:pPr>
+        <w:pStyle w:val="Ttulo1"/>
+      </w:pPr>
+      <w:bookmarkStart w:id="31" w:name="_Toc244268678"/>
+      <w:r>
+        <w:t>5.  Gestão do projeto</w:t>
+      </w:r>
+      <w:bookmarkEnd w:id="31"/>
+    </w:p>
+    <w:p>
+      <w:pPr>
+        <w:spacing w:before="120" w:after="120" w:line="360" w:lineRule="auto"/>
+        <w:jc w:val="both"/>
+      </w:pPr>
+    </w:p>
+    <w:p>
+      <w:pPr>
+        <w:pStyle w:val="Ttulo2"/>
+      </w:pPr>
+      <w:bookmarkStart w:id="32" w:name="_Toc244268679"/>
+      <w:r>
+        <w:t xml:space="preserve">5.1  Planeamento e cronograma   </w:t>
+      </w:r>
+      <w:r>
+        <w:rPr>
+          <w:rFonts w:ascii="Cambria Math" w:eastAsia="Cambria Math" w:hAnsi="Cambria Math" w:cs="Cambria Math"/>
+        </w:rPr>
+        <w:t>◆</w:t>
+      </w:r>
+      <w:r>
+        <w:t xml:space="preserve"> MADS</w:t>
+      </w:r>
+      <w:bookmarkEnd w:id="32"/>
+    </w:p>
+    <w:p>
+      <w:pPr>
+        <w:spacing w:after="120" w:line="300" w:lineRule="auto"/>
+        <w:jc w:val="both"/>
+      </w:pPr>
+      <w:r>
+        <w:t>A tabela seguinte mostra o cronograma do projeto, desde o anteprojeto até à defesa.</w:t>
+      </w:r>
+    </w:p>
+    <w:p>
+      <w:pPr>
+        <w:keepNext/>
+        <w:spacing w:before="200" w:after="60"/>
+        <w:jc w:val="center"/>
+      </w:pPr>
+      <w:r>
+        <w:rPr>
+          <w:i/>
+          <w:iCs/>
+          <w:sz w:val="20"/>
+          <w:szCs w:val="20"/>
+        </w:rPr>
+        <w:t>Tabela 7 – Cronograma do projeto</w:t>
       </w:r>
     </w:p>
     <w:tbl>
@@ -10068,7 +11630,7 @@
                 <w:sz w:val="19"/>
                 <w:szCs w:val="19"/>
               </w:rPr>
-              <w:t>nov.–dez. 2026</w:t>
+              <w:t>out. 2026</w:t>
             </w:r>
           </w:p>
         </w:tc>
@@ -10089,7 +11651,7 @@
                 <w:sz w:val="19"/>
                 <w:szCs w:val="19"/>
               </w:rPr>
-              <w:t>Som, estatísticas da partida, modo de 2 jogadores</w:t>
+              <w:t>Correção das colisões, nova IA tática e guarda-redes com reação</w:t>
             </w:r>
           </w:p>
         </w:tc>
@@ -10110,7 +11672,7 @@
                 <w:sz w:val="19"/>
                 <w:szCs w:val="19"/>
               </w:rPr>
-              <w:t>Planeado</w:t>
+              <w:t>Concluído</w:t>
             </w:r>
           </w:p>
         </w:tc>
@@ -10137,7 +11699,7 @@
                 <w:sz w:val="19"/>
                 <w:szCs w:val="19"/>
               </w:rPr>
-              <w:t>jan.–mar. 2027</w:t>
+              <w:t>nov.–dez. 2026</w:t>
             </w:r>
           </w:p>
         </w:tc>
@@ -10158,7 +11720,7 @@
                 <w:sz w:val="19"/>
                 <w:szCs w:val="19"/>
               </w:rPr>
-              <w:t>Modo torneio com base de dados SQLite e classificação</w:t>
+              <w:t>Som, estatísticas da partida, modo de 2 jogadores</w:t>
             </w:r>
           </w:p>
         </w:tc>
@@ -10206,7 +11768,7 @@
                 <w:sz w:val="19"/>
                 <w:szCs w:val="19"/>
               </w:rPr>
-              <w:t>mar.–abr. 2027</w:t>
+              <w:t>jan.–mar. 2027</w:t>
             </w:r>
           </w:p>
         </w:tc>
@@ -10227,7 +11789,7 @@
                 <w:sz w:val="19"/>
                 <w:szCs w:val="19"/>
               </w:rPr>
-              <w:t>Testes com colegas, correção de erros, novos sprites</w:t>
+              <w:t>Modo torneio com base de dados SQLite e classificação</w:t>
             </w:r>
           </w:p>
         </w:tc>
@@ -10275,7 +11837,7 @@
                 <w:sz w:val="19"/>
                 <w:szCs w:val="19"/>
               </w:rPr>
-              <w:t>abr.–mai. 2027</w:t>
+              <w:t>mar.–abr. 2027</w:t>
             </w:r>
           </w:p>
         </w:tc>
@@ -10296,7 +11858,7 @@
                 <w:sz w:val="19"/>
                 <w:szCs w:val="19"/>
               </w:rPr>
-              <w:t>Relatório final, manual de utilizador e apresentação</w:t>
+              <w:t>Testes com colegas, correção de erros, novos sprites</w:t>
             </w:r>
           </w:p>
         </w:tc>
@@ -10317,7 +11879,7 @@
                 <w:sz w:val="19"/>
                 <w:szCs w:val="19"/>
               </w:rPr>
-              <w:t>Em curso</w:t>
+              <w:t>Planeado</w:t>
             </w:r>
           </w:p>
         </w:tc>
@@ -10344,6 +11906,75 @@
                 <w:sz w:val="19"/>
                 <w:szCs w:val="19"/>
               </w:rPr>
+              <w:t>abr.–mai. 2027</w:t>
+            </w:r>
+          </w:p>
+        </w:tc>
+        <w:tc>
+          <w:tcPr>
+            <w:tcW w:w="5300" w:type="dxa"/>
+            <w:tcMar>
+              <w:left w:w="80" w:type="dxa"/>
+              <w:right w:w="80" w:type="dxa"/>
+            </w:tcMar>
+          </w:tcPr>
+          <w:p>
+            <w:pPr>
+              <w:spacing w:before="20" w:after="20" w:line="240" w:lineRule="auto"/>
+            </w:pPr>
+            <w:r>
+              <w:rPr>
+                <w:sz w:val="19"/>
+                <w:szCs w:val="19"/>
+              </w:rPr>
+              <w:t>Relatório final, manual de utilizador e apresentação</w:t>
+            </w:r>
+          </w:p>
+        </w:tc>
+        <w:tc>
+          <w:tcPr>
+            <w:tcW w:w="1500" w:type="dxa"/>
+            <w:tcMar>
+              <w:left w:w="80" w:type="dxa"/>
+              <w:right w:w="80" w:type="dxa"/>
+            </w:tcMar>
+          </w:tcPr>
+          <w:p>
+            <w:pPr>
+              <w:spacing w:before="20" w:after="20" w:line="240" w:lineRule="auto"/>
+            </w:pPr>
+            <w:r>
+              <w:rPr>
+                <w:sz w:val="19"/>
+                <w:szCs w:val="19"/>
+              </w:rPr>
+              <w:t>Em curso</w:t>
+            </w:r>
+          </w:p>
+        </w:tc>
+      </w:tr>
+      <w:tr>
+        <w:trPr>
+          <w:cantSplit/>
+          <w:jc w:val="center"/>
+        </w:trPr>
+        <w:tc>
+          <w:tcPr>
+            <w:tcW w:w="1900" w:type="dxa"/>
+            <w:tcMar>
+              <w:left w:w="80" w:type="dxa"/>
+              <w:right w:w="80" w:type="dxa"/>
+            </w:tcMar>
+          </w:tcPr>
+          <w:p>
+            <w:pPr>
+              <w:spacing w:before="20" w:after="20" w:line="240" w:lineRule="auto"/>
+            </w:pPr>
+            <w:r>
+              <w:rPr>
+                <w:sz w:val="19"/>
+                <w:szCs w:val="19"/>
+              </w:rPr>
               <w:t>jun. 2027</w:t>
             </w:r>
           </w:p>
@@ -10407,7 +12038,7 @@
       <w:pPr>
         <w:pStyle w:val="Ttulo2"/>
       </w:pPr>
-      <w:bookmarkStart w:id="33" w:name="_Toc244220149"/>
+      <w:bookmarkStart w:id="33" w:name="_Toc244268680"/>
       <w:r>
         <w:t xml:space="preserve">5.2  Gestão de riscos   </w:t>
       </w:r>
@@ -10435,7 +12066,7 @@
           <w:sz w:val="20"/>
           <w:szCs w:val="20"/>
         </w:rPr>
-        <w:t>Tabela 7 – Gestão de riscos</w:t>
+        <w:t>Tabela 8 – Gestão de riscos</w:t>
       </w:r>
     </w:p>
     <w:tbl>
@@ -11208,7 +12839,7 @@
       <w:pPr>
         <w:pStyle w:val="Ttulo2"/>
       </w:pPr>
-      <w:bookmarkStart w:id="34" w:name="_Toc244220150"/>
+      <w:bookmarkStart w:id="34" w:name="_Toc244268681"/>
       <w:r>
         <w:t>5.3  Controlo de versões e trabalho em equipa (Git/GitHub)</w:t>
       </w:r>
@@ -11248,7 +12879,7 @@
         <w:jc w:val="both"/>
       </w:pPr>
       <w:bookmarkStart w:id="35" w:name="_heading=h.wyqfvt3yxluv" w:colFirst="0" w:colLast="0"/>
-      <w:bookmarkStart w:id="36" w:name="_Toc244220151"/>
+      <w:bookmarkStart w:id="36" w:name="_Toc244268682"/>
       <w:bookmarkEnd w:id="35"/>
       <w:r>
         <w:t>6. Conclusão</w:t>
@@ -11290,7 +12921,7 @@
         <w:jc w:val="both"/>
       </w:pPr>
       <w:bookmarkStart w:id="37" w:name="_heading=h.u2ct7f5va3wh" w:colFirst="0" w:colLast="0"/>
-      <w:bookmarkStart w:id="38" w:name="_Toc244220152"/>
+      <w:bookmarkStart w:id="38" w:name="_Toc244268683"/>
       <w:bookmarkEnd w:id="37"/>
       <w:r>
         <w:t>7. Anexos</w:t>
@@ -11676,7 +13307,7 @@
         <w:noProof/>
       </w:rPr>
       <w:drawing>
-        <wp:inline distT="0" distB="0" distL="0" distR="0" wp14:anchorId="1E13EEEF" wp14:editId="7DC21951">
+        <wp:inline distT="0" distB="0" distL="0" distR="0" wp14:anchorId="291FA546" wp14:editId="3E142C9F">
           <wp:extent cx="5566410" cy="510540"/>
           <wp:effectExtent l="0" t="0" r="0" b="0"/>
           <wp:docPr id="1957554077" name="image1.png"/>

</xml_diff>

<commit_message>
fix: bola no stick sem saltos, guarda-redes sem falhas e ordem de desenho
- A bola roda a volta do jogador com velocidade limitada e desliza ate ao
  stick de quem a apanha (antes saltava ate 50 px num frame).
- Defesa do GR testa o caminho da bola no frame (sem 'tunel') e e feita
  antes de ver se e golo; uma defesa manda sempre a bola para a frente.
- GR antecipa so parte da trajetoria (deixa de ir para o lado errado).
- Jogadores chocam com os guarda-redes; a IA nao se posiciona em cima deles.
- A bola entra na ordem de profundidade (fica tapada por quem esta a frente).
- Cantos arredondados do rinque; bola no stick nunca dentro da rede.
- Relatorio atualizado (seccoes 3.2, 3.4, 4.1-4.3).

Co-Authored-By: Claude Opus 5.5 <noreply@anthropic.com>
</commit_message>
<xml_diff>
--- a/docs/relatorio/Relatorio_PAP_StickMania.docx
+++ b/docs/relatorio/Relatorio_PAP_StickMania.docx
@@ -9,7 +9,7 @@
           <w:noProof/>
         </w:rPr>
         <w:drawing>
-          <wp:anchor distT="0" distB="0" distL="114300" distR="114300" simplePos="0" relativeHeight="251658240" behindDoc="0" locked="0" layoutInCell="1" hidden="0" allowOverlap="1" wp14:anchorId="06561113" wp14:editId="2ED9C2D2">
+          <wp:anchor distT="0" distB="0" distL="114300" distR="114300" simplePos="0" relativeHeight="251658240" behindDoc="0" locked="0" layoutInCell="1" hidden="0" allowOverlap="1" wp14:anchorId="0638C1CD" wp14:editId="4A6F84E7">
             <wp:simplePos x="0" y="0"/>
             <wp:positionH relativeFrom="column">
               <wp:posOffset>104780</wp:posOffset>
@@ -236,7 +236,7 @@
           <w:noProof/>
         </w:rPr>
         <w:drawing>
-          <wp:anchor distT="0" distB="0" distL="114300" distR="114300" simplePos="0" relativeHeight="251659264" behindDoc="0" locked="0" layoutInCell="1" hidden="0" allowOverlap="1" wp14:anchorId="7313BF9D" wp14:editId="57AAD542">
+          <wp:anchor distT="0" distB="0" distL="114300" distR="114300" simplePos="0" relativeHeight="251659264" behindDoc="0" locked="0" layoutInCell="1" hidden="0" allowOverlap="1" wp14:anchorId="334A6AEF" wp14:editId="48F52492">
             <wp:simplePos x="0" y="0"/>
             <wp:positionH relativeFrom="column">
               <wp:posOffset>-3172</wp:posOffset>
@@ -570,7 +570,7 @@
           <w:r>
             <w:fldChar w:fldCharType="separate"/>
           </w:r>
-          <w:hyperlink w:anchor="_Toc244268647" w:history="1">
+          <w:hyperlink w:anchor="_Toc244357977" w:history="1">
             <w:r>
               <w:rPr>
                 <w:rStyle w:val="Hiperligao"/>
@@ -597,7 +597,7 @@
                 <w:noProof/>
                 <w:webHidden/>
               </w:rPr>
-              <w:instrText xml:space="preserve"> PAGEREF _Toc244268647 \h </w:instrText>
+              <w:instrText xml:space="preserve"> PAGEREF _Toc244357977 \h </w:instrText>
             </w:r>
             <w:r>
               <w:rPr>
@@ -643,7 +643,7 @@
               <w14:ligatures w14:val="standardContextual"/>
             </w:rPr>
           </w:pPr>
-          <w:hyperlink w:anchor="_Toc244268648" w:history="1">
+          <w:hyperlink w:anchor="_Toc244357978" w:history="1">
             <w:r>
               <w:rPr>
                 <w:rStyle w:val="Hiperligao"/>
@@ -670,7 +670,7 @@
                 <w:noProof/>
                 <w:webHidden/>
               </w:rPr>
-              <w:instrText xml:space="preserve"> PAGEREF _Toc244268648 \h </w:instrText>
+              <w:instrText xml:space="preserve"> PAGEREF _Toc244357978 \h </w:instrText>
             </w:r>
             <w:r>
               <w:rPr>
@@ -716,7 +716,7 @@
               <w14:ligatures w14:val="standardContextual"/>
             </w:rPr>
           </w:pPr>
-          <w:hyperlink w:anchor="_Toc244268649" w:history="1">
+          <w:hyperlink w:anchor="_Toc244357979" w:history="1">
             <w:r>
               <w:rPr>
                 <w:rStyle w:val="Hiperligao"/>
@@ -743,7 +743,7 @@
                 <w:noProof/>
                 <w:webHidden/>
               </w:rPr>
-              <w:instrText xml:space="preserve"> PAGEREF _Toc244268649 \h </w:instrText>
+              <w:instrText xml:space="preserve"> PAGEREF _Toc244357979 \h </w:instrText>
             </w:r>
             <w:r>
               <w:rPr>
@@ -789,7 +789,7 @@
               <w14:ligatures w14:val="standardContextual"/>
             </w:rPr>
           </w:pPr>
-          <w:hyperlink w:anchor="_Toc244268650" w:history="1">
+          <w:hyperlink w:anchor="_Toc244357980" w:history="1">
             <w:r>
               <w:rPr>
                 <w:rStyle w:val="Hiperligao"/>
@@ -816,7 +816,7 @@
                 <w:noProof/>
                 <w:webHidden/>
               </w:rPr>
-              <w:instrText xml:space="preserve"> PAGEREF _Toc244268650 \h </w:instrText>
+              <w:instrText xml:space="preserve"> PAGEREF _Toc244357980 \h </w:instrText>
             </w:r>
             <w:r>
               <w:rPr>
@@ -862,7 +862,7 @@
               <w14:ligatures w14:val="standardContextual"/>
             </w:rPr>
           </w:pPr>
-          <w:hyperlink w:anchor="_Toc244268651" w:history="1">
+          <w:hyperlink w:anchor="_Toc244357981" w:history="1">
             <w:r>
               <w:rPr>
                 <w:rStyle w:val="Hiperligao"/>
@@ -904,7 +904,7 @@
                 <w:noProof/>
                 <w:webHidden/>
               </w:rPr>
-              <w:instrText xml:space="preserve"> PAGEREF _Toc244268651 \h </w:instrText>
+              <w:instrText xml:space="preserve"> PAGEREF _Toc244357981 \h </w:instrText>
             </w:r>
             <w:r>
               <w:rPr>
@@ -950,7 +950,7 @@
               <w14:ligatures w14:val="standardContextual"/>
             </w:rPr>
           </w:pPr>
-          <w:hyperlink w:anchor="_Toc244268652" w:history="1">
+          <w:hyperlink w:anchor="_Toc244357982" w:history="1">
             <w:r>
               <w:rPr>
                 <w:rStyle w:val="Hiperligao"/>
@@ -977,7 +977,7 @@
                 <w:noProof/>
                 <w:webHidden/>
               </w:rPr>
-              <w:instrText xml:space="preserve"> PAGEREF _Toc244268652 \h </w:instrText>
+              <w:instrText xml:space="preserve"> PAGEREF _Toc244357982 \h </w:instrText>
             </w:r>
             <w:r>
               <w:rPr>
@@ -1023,7 +1023,7 @@
               <w14:ligatures w14:val="standardContextual"/>
             </w:rPr>
           </w:pPr>
-          <w:hyperlink w:anchor="_Toc244268653" w:history="1">
+          <w:hyperlink w:anchor="_Toc244357983" w:history="1">
             <w:r>
               <w:rPr>
                 <w:rStyle w:val="Hiperligao"/>
@@ -1050,7 +1050,7 @@
                 <w:noProof/>
                 <w:webHidden/>
               </w:rPr>
-              <w:instrText xml:space="preserve"> PAGEREF _Toc244268653 \h </w:instrText>
+              <w:instrText xml:space="preserve"> PAGEREF _Toc244357983 \h </w:instrText>
             </w:r>
             <w:r>
               <w:rPr>
@@ -1096,7 +1096,7 @@
               <w14:ligatures w14:val="standardContextual"/>
             </w:rPr>
           </w:pPr>
-          <w:hyperlink w:anchor="_Toc244268654" w:history="1">
+          <w:hyperlink w:anchor="_Toc244357984" w:history="1">
             <w:r>
               <w:rPr>
                 <w:rStyle w:val="Hiperligao"/>
@@ -1138,7 +1138,7 @@
                 <w:noProof/>
                 <w:webHidden/>
               </w:rPr>
-              <w:instrText xml:space="preserve"> PAGEREF _Toc244268654 \h </w:instrText>
+              <w:instrText xml:space="preserve"> PAGEREF _Toc244357984 \h </w:instrText>
             </w:r>
             <w:r>
               <w:rPr>
@@ -1184,7 +1184,7 @@
               <w14:ligatures w14:val="standardContextual"/>
             </w:rPr>
           </w:pPr>
-          <w:hyperlink w:anchor="_Toc244268655" w:history="1">
+          <w:hyperlink w:anchor="_Toc244357985" w:history="1">
             <w:r>
               <w:rPr>
                 <w:rStyle w:val="Hiperligao"/>
@@ -1226,7 +1226,7 @@
                 <w:noProof/>
                 <w:webHidden/>
               </w:rPr>
-              <w:instrText xml:space="preserve"> PAGEREF _Toc244268655 \h </w:instrText>
+              <w:instrText xml:space="preserve"> PAGEREF _Toc244357985 \h </w:instrText>
             </w:r>
             <w:r>
               <w:rPr>
@@ -1272,7 +1272,7 @@
               <w14:ligatures w14:val="standardContextual"/>
             </w:rPr>
           </w:pPr>
-          <w:hyperlink w:anchor="_Toc244268656" w:history="1">
+          <w:hyperlink w:anchor="_Toc244357986" w:history="1">
             <w:r>
               <w:rPr>
                 <w:rStyle w:val="Hiperligao"/>
@@ -1314,7 +1314,7 @@
                 <w:noProof/>
                 <w:webHidden/>
               </w:rPr>
-              <w:instrText xml:space="preserve"> PAGEREF _Toc244268656 \h </w:instrText>
+              <w:instrText xml:space="preserve"> PAGEREF _Toc244357986 \h </w:instrText>
             </w:r>
             <w:r>
               <w:rPr>
@@ -1360,7 +1360,7 @@
               <w14:ligatures w14:val="standardContextual"/>
             </w:rPr>
           </w:pPr>
-          <w:hyperlink w:anchor="_Toc244268657" w:history="1">
+          <w:hyperlink w:anchor="_Toc244357987" w:history="1">
             <w:r>
               <w:rPr>
                 <w:rStyle w:val="Hiperligao"/>
@@ -1402,7 +1402,7 @@
                 <w:noProof/>
                 <w:webHidden/>
               </w:rPr>
-              <w:instrText xml:space="preserve"> PAGEREF _Toc244268657 \h </w:instrText>
+              <w:instrText xml:space="preserve"> PAGEREF _Toc244357987 \h </w:instrText>
             </w:r>
             <w:r>
               <w:rPr>
@@ -1448,7 +1448,7 @@
               <w14:ligatures w14:val="standardContextual"/>
             </w:rPr>
           </w:pPr>
-          <w:hyperlink w:anchor="_Toc244268658" w:history="1">
+          <w:hyperlink w:anchor="_Toc244357988" w:history="1">
             <w:r>
               <w:rPr>
                 <w:rStyle w:val="Hiperligao"/>
@@ -1490,7 +1490,7 @@
                 <w:noProof/>
                 <w:webHidden/>
               </w:rPr>
-              <w:instrText xml:space="preserve"> PAGEREF _Toc244268658 \h </w:instrText>
+              <w:instrText xml:space="preserve"> PAGEREF _Toc244357988 \h </w:instrText>
             </w:r>
             <w:r>
               <w:rPr>
@@ -1536,7 +1536,7 @@
               <w14:ligatures w14:val="standardContextual"/>
             </w:rPr>
           </w:pPr>
-          <w:hyperlink w:anchor="_Toc244268659" w:history="1">
+          <w:hyperlink w:anchor="_Toc244357989" w:history="1">
             <w:r>
               <w:rPr>
                 <w:rStyle w:val="Hiperligao"/>
@@ -1578,7 +1578,7 @@
                 <w:noProof/>
                 <w:webHidden/>
               </w:rPr>
-              <w:instrText xml:space="preserve"> PAGEREF _Toc244268659 \h </w:instrText>
+              <w:instrText xml:space="preserve"> PAGEREF _Toc244357989 \h </w:instrText>
             </w:r>
             <w:r>
               <w:rPr>
@@ -1624,7 +1624,7 @@
               <w14:ligatures w14:val="standardContextual"/>
             </w:rPr>
           </w:pPr>
-          <w:hyperlink w:anchor="_Toc244268660" w:history="1">
+          <w:hyperlink w:anchor="_Toc244357990" w:history="1">
             <w:r>
               <w:rPr>
                 <w:rStyle w:val="Hiperligao"/>
@@ -1666,7 +1666,7 @@
                 <w:noProof/>
                 <w:webHidden/>
               </w:rPr>
-              <w:instrText xml:space="preserve"> PAGEREF _Toc244268660 \h </w:instrText>
+              <w:instrText xml:space="preserve"> PAGEREF _Toc244357990 \h </w:instrText>
             </w:r>
             <w:r>
               <w:rPr>
@@ -1712,7 +1712,7 @@
               <w14:ligatures w14:val="standardContextual"/>
             </w:rPr>
           </w:pPr>
-          <w:hyperlink w:anchor="_Toc244268661" w:history="1">
+          <w:hyperlink w:anchor="_Toc244357991" w:history="1">
             <w:r>
               <w:rPr>
                 <w:rStyle w:val="Hiperligao"/>
@@ -1754,7 +1754,7 @@
                 <w:noProof/>
                 <w:webHidden/>
               </w:rPr>
-              <w:instrText xml:space="preserve"> PAGEREF _Toc244268661 \h </w:instrText>
+              <w:instrText xml:space="preserve"> PAGEREF _Toc244357991 \h </w:instrText>
             </w:r>
             <w:r>
               <w:rPr>
@@ -1800,7 +1800,7 @@
               <w14:ligatures w14:val="standardContextual"/>
             </w:rPr>
           </w:pPr>
-          <w:hyperlink w:anchor="_Toc244268662" w:history="1">
+          <w:hyperlink w:anchor="_Toc244357992" w:history="1">
             <w:r>
               <w:rPr>
                 <w:rStyle w:val="Hiperligao"/>
@@ -1843,7 +1843,7 @@
                 <w:noProof/>
                 <w:webHidden/>
               </w:rPr>
-              <w:instrText xml:space="preserve"> PAGEREF _Toc244268662 \h </w:instrText>
+              <w:instrText xml:space="preserve"> PAGEREF _Toc244357992 \h </w:instrText>
             </w:r>
             <w:r>
               <w:rPr>
@@ -1889,7 +1889,7 @@
               <w14:ligatures w14:val="standardContextual"/>
             </w:rPr>
           </w:pPr>
-          <w:hyperlink w:anchor="_Toc244268663" w:history="1">
+          <w:hyperlink w:anchor="_Toc244357993" w:history="1">
             <w:r>
               <w:rPr>
                 <w:rStyle w:val="Hiperligao"/>
@@ -1931,7 +1931,7 @@
                 <w:noProof/>
                 <w:webHidden/>
               </w:rPr>
-              <w:instrText xml:space="preserve"> PAGEREF _Toc244268663 \h </w:instrText>
+              <w:instrText xml:space="preserve"> PAGEREF _Toc244357993 \h </w:instrText>
             </w:r>
             <w:r>
               <w:rPr>
@@ -1977,7 +1977,7 @@
               <w14:ligatures w14:val="standardContextual"/>
             </w:rPr>
           </w:pPr>
-          <w:hyperlink w:anchor="_Toc244268664" w:history="1">
+          <w:hyperlink w:anchor="_Toc244357994" w:history="1">
             <w:r>
               <w:rPr>
                 <w:rStyle w:val="Hiperligao"/>
@@ -2004,7 +2004,7 @@
                 <w:noProof/>
                 <w:webHidden/>
               </w:rPr>
-              <w:instrText xml:space="preserve"> PAGEREF _Toc244268664 \h </w:instrText>
+              <w:instrText xml:space="preserve"> PAGEREF _Toc244357994 \h </w:instrText>
             </w:r>
             <w:r>
               <w:rPr>
@@ -2050,7 +2050,7 @@
               <w14:ligatures w14:val="standardContextual"/>
             </w:rPr>
           </w:pPr>
-          <w:hyperlink w:anchor="_Toc244268665" w:history="1">
+          <w:hyperlink w:anchor="_Toc244357995" w:history="1">
             <w:r>
               <w:rPr>
                 <w:rStyle w:val="Hiperligao"/>
@@ -2077,7 +2077,7 @@
                 <w:noProof/>
                 <w:webHidden/>
               </w:rPr>
-              <w:instrText xml:space="preserve"> PAGEREF _Toc244268665 \h </w:instrText>
+              <w:instrText xml:space="preserve"> PAGEREF _Toc244357995 \h </w:instrText>
             </w:r>
             <w:r>
               <w:rPr>
@@ -2123,7 +2123,7 @@
               <w14:ligatures w14:val="standardContextual"/>
             </w:rPr>
           </w:pPr>
-          <w:hyperlink w:anchor="_Toc244268666" w:history="1">
+          <w:hyperlink w:anchor="_Toc244357996" w:history="1">
             <w:r>
               <w:rPr>
                 <w:rStyle w:val="Hiperligao"/>
@@ -2150,7 +2150,7 @@
                 <w:noProof/>
                 <w:webHidden/>
               </w:rPr>
-              <w:instrText xml:space="preserve"> PAGEREF _Toc244268666 \h </w:instrText>
+              <w:instrText xml:space="preserve"> PAGEREF _Toc244357996 \h </w:instrText>
             </w:r>
             <w:r>
               <w:rPr>
@@ -2196,7 +2196,7 @@
               <w14:ligatures w14:val="standardContextual"/>
             </w:rPr>
           </w:pPr>
-          <w:hyperlink w:anchor="_Toc244268667" w:history="1">
+          <w:hyperlink w:anchor="_Toc244357997" w:history="1">
             <w:r>
               <w:rPr>
                 <w:rStyle w:val="Hiperligao"/>
@@ -2223,7 +2223,7 @@
                 <w:noProof/>
                 <w:webHidden/>
               </w:rPr>
-              <w:instrText xml:space="preserve"> PAGEREF _Toc244268667 \h </w:instrText>
+              <w:instrText xml:space="preserve"> PAGEREF _Toc244357997 \h </w:instrText>
             </w:r>
             <w:r>
               <w:rPr>
@@ -2269,7 +2269,7 @@
               <w14:ligatures w14:val="standardContextual"/>
             </w:rPr>
           </w:pPr>
-          <w:hyperlink w:anchor="_Toc244268668" w:history="1">
+          <w:hyperlink w:anchor="_Toc244357998" w:history="1">
             <w:r>
               <w:rPr>
                 <w:rStyle w:val="Hiperligao"/>
@@ -2311,7 +2311,7 @@
                 <w:noProof/>
                 <w:webHidden/>
               </w:rPr>
-              <w:instrText xml:space="preserve"> PAGEREF _Toc244268668 \h </w:instrText>
+              <w:instrText xml:space="preserve"> PAGEREF _Toc244357998 \h </w:instrText>
             </w:r>
             <w:r>
               <w:rPr>
@@ -2357,7 +2357,7 @@
               <w14:ligatures w14:val="standardContextual"/>
             </w:rPr>
           </w:pPr>
-          <w:hyperlink w:anchor="_Toc244268669" w:history="1">
+          <w:hyperlink w:anchor="_Toc244357999" w:history="1">
             <w:r>
               <w:rPr>
                 <w:rStyle w:val="Hiperligao"/>
@@ -2384,7 +2384,7 @@
                 <w:noProof/>
                 <w:webHidden/>
               </w:rPr>
-              <w:instrText xml:space="preserve"> PAGEREF _Toc244268669 \h </w:instrText>
+              <w:instrText xml:space="preserve"> PAGEREF _Toc244357999 \h </w:instrText>
             </w:r>
             <w:r>
               <w:rPr>
@@ -2430,7 +2430,7 @@
               <w14:ligatures w14:val="standardContextual"/>
             </w:rPr>
           </w:pPr>
-          <w:hyperlink w:anchor="_Toc244268670" w:history="1">
+          <w:hyperlink w:anchor="_Toc244358000" w:history="1">
             <w:r>
               <w:rPr>
                 <w:rStyle w:val="Hiperligao"/>
@@ -2457,7 +2457,7 @@
                 <w:noProof/>
                 <w:webHidden/>
               </w:rPr>
-              <w:instrText xml:space="preserve"> PAGEREF _Toc244268670 \h </w:instrText>
+              <w:instrText xml:space="preserve"> PAGEREF _Toc244358000 \h </w:instrText>
             </w:r>
             <w:r>
               <w:rPr>
@@ -2503,7 +2503,7 @@
               <w14:ligatures w14:val="standardContextual"/>
             </w:rPr>
           </w:pPr>
-          <w:hyperlink w:anchor="_Toc244268671" w:history="1">
+          <w:hyperlink w:anchor="_Toc244358001" w:history="1">
             <w:r>
               <w:rPr>
                 <w:rStyle w:val="Hiperligao"/>
@@ -2530,7 +2530,7 @@
                 <w:noProof/>
                 <w:webHidden/>
               </w:rPr>
-              <w:instrText xml:space="preserve"> PAGEREF _Toc244268671 \h </w:instrText>
+              <w:instrText xml:space="preserve"> PAGEREF _Toc244358001 \h </w:instrText>
             </w:r>
             <w:r>
               <w:rPr>
@@ -2576,7 +2576,7 @@
               <w14:ligatures w14:val="standardContextual"/>
             </w:rPr>
           </w:pPr>
-          <w:hyperlink w:anchor="_Toc244268672" w:history="1">
+          <w:hyperlink w:anchor="_Toc244358002" w:history="1">
             <w:r>
               <w:rPr>
                 <w:rStyle w:val="Hiperligao"/>
@@ -2603,7 +2603,7 @@
                 <w:noProof/>
                 <w:webHidden/>
               </w:rPr>
-              <w:instrText xml:space="preserve"> PAGEREF _Toc244268672 \h </w:instrText>
+              <w:instrText xml:space="preserve"> PAGEREF _Toc244358002 \h </w:instrText>
             </w:r>
             <w:r>
               <w:rPr>
@@ -2649,7 +2649,7 @@
               <w14:ligatures w14:val="standardContextual"/>
             </w:rPr>
           </w:pPr>
-          <w:hyperlink w:anchor="_Toc244268673" w:history="1">
+          <w:hyperlink w:anchor="_Toc244358003" w:history="1">
             <w:r>
               <w:rPr>
                 <w:rStyle w:val="Hiperligao"/>
@@ -2676,7 +2676,7 @@
                 <w:noProof/>
                 <w:webHidden/>
               </w:rPr>
-              <w:instrText xml:space="preserve"> PAGEREF _Toc244268673 \h </w:instrText>
+              <w:instrText xml:space="preserve"> PAGEREF _Toc244358003 \h </w:instrText>
             </w:r>
             <w:r>
               <w:rPr>
@@ -2696,7 +2696,7 @@
                 <w:noProof/>
                 <w:webHidden/>
               </w:rPr>
-              <w:t>23</w:t>
+              <w:t>24</w:t>
             </w:r>
             <w:r>
               <w:rPr>
@@ -2722,7 +2722,7 @@
               <w14:ligatures w14:val="standardContextual"/>
             </w:rPr>
           </w:pPr>
-          <w:hyperlink w:anchor="_Toc244268674" w:history="1">
+          <w:hyperlink w:anchor="_Toc244358004" w:history="1">
             <w:r>
               <w:rPr>
                 <w:rStyle w:val="Hiperligao"/>
@@ -2749,7 +2749,7 @@
                 <w:noProof/>
                 <w:webHidden/>
               </w:rPr>
-              <w:instrText xml:space="preserve"> PAGEREF _Toc244268674 \h </w:instrText>
+              <w:instrText xml:space="preserve"> PAGEREF _Toc244358004 \h </w:instrText>
             </w:r>
             <w:r>
               <w:rPr>
@@ -2769,7 +2769,7 @@
                 <w:noProof/>
                 <w:webHidden/>
               </w:rPr>
-              <w:t>24</w:t>
+              <w:t>25</w:t>
             </w:r>
             <w:r>
               <w:rPr>
@@ -2795,7 +2795,7 @@
               <w14:ligatures w14:val="standardContextual"/>
             </w:rPr>
           </w:pPr>
-          <w:hyperlink w:anchor="_Toc244268675" w:history="1">
+          <w:hyperlink w:anchor="_Toc244358005" w:history="1">
             <w:r>
               <w:rPr>
                 <w:rStyle w:val="Hiperligao"/>
@@ -2822,7 +2822,7 @@
                 <w:noProof/>
                 <w:webHidden/>
               </w:rPr>
-              <w:instrText xml:space="preserve"> PAGEREF _Toc244268675 \h </w:instrText>
+              <w:instrText xml:space="preserve"> PAGEREF _Toc244358005 \h </w:instrText>
             </w:r>
             <w:r>
               <w:rPr>
@@ -2842,7 +2842,7 @@
                 <w:noProof/>
                 <w:webHidden/>
               </w:rPr>
-              <w:t>24</w:t>
+              <w:t>25</w:t>
             </w:r>
             <w:r>
               <w:rPr>
@@ -2868,7 +2868,7 @@
               <w14:ligatures w14:val="standardContextual"/>
             </w:rPr>
           </w:pPr>
-          <w:hyperlink w:anchor="_Toc244268676" w:history="1">
+          <w:hyperlink w:anchor="_Toc244358006" w:history="1">
             <w:r>
               <w:rPr>
                 <w:rStyle w:val="Hiperligao"/>
@@ -2895,7 +2895,7 @@
                 <w:noProof/>
                 <w:webHidden/>
               </w:rPr>
-              <w:instrText xml:space="preserve"> PAGEREF _Toc244268676 \h </w:instrText>
+              <w:instrText xml:space="preserve"> PAGEREF _Toc244358006 \h </w:instrText>
             </w:r>
             <w:r>
               <w:rPr>
@@ -2915,7 +2915,7 @@
                 <w:noProof/>
                 <w:webHidden/>
               </w:rPr>
-              <w:t>25</w:t>
+              <w:t>26</w:t>
             </w:r>
             <w:r>
               <w:rPr>
@@ -2941,7 +2941,7 @@
               <w14:ligatures w14:val="standardContextual"/>
             </w:rPr>
           </w:pPr>
-          <w:hyperlink w:anchor="_Toc244268677" w:history="1">
+          <w:hyperlink w:anchor="_Toc244358007" w:history="1">
             <w:r>
               <w:rPr>
                 <w:rStyle w:val="Hiperligao"/>
@@ -2968,7 +2968,7 @@
                 <w:noProof/>
                 <w:webHidden/>
               </w:rPr>
-              <w:instrText xml:space="preserve"> PAGEREF _Toc244268677 \h </w:instrText>
+              <w:instrText xml:space="preserve"> PAGEREF _Toc244358007 \h </w:instrText>
             </w:r>
             <w:r>
               <w:rPr>
@@ -2988,7 +2988,7 @@
                 <w:noProof/>
                 <w:webHidden/>
               </w:rPr>
-              <w:t>26</w:t>
+              <w:t>27</w:t>
             </w:r>
             <w:r>
               <w:rPr>
@@ -3014,7 +3014,7 @@
               <w14:ligatures w14:val="standardContextual"/>
             </w:rPr>
           </w:pPr>
-          <w:hyperlink w:anchor="_Toc244268678" w:history="1">
+          <w:hyperlink w:anchor="_Toc244358008" w:history="1">
             <w:r>
               <w:rPr>
                 <w:rStyle w:val="Hiperligao"/>
@@ -3041,7 +3041,7 @@
                 <w:noProof/>
                 <w:webHidden/>
               </w:rPr>
-              <w:instrText xml:space="preserve"> PAGEREF _Toc244268678 \h </w:instrText>
+              <w:instrText xml:space="preserve"> PAGEREF _Toc244358008 \h </w:instrText>
             </w:r>
             <w:r>
               <w:rPr>
@@ -3061,7 +3061,7 @@
                 <w:noProof/>
                 <w:webHidden/>
               </w:rPr>
-              <w:t>26</w:t>
+              <w:t>27</w:t>
             </w:r>
             <w:r>
               <w:rPr>
@@ -3087,7 +3087,7 @@
               <w14:ligatures w14:val="standardContextual"/>
             </w:rPr>
           </w:pPr>
-          <w:hyperlink w:anchor="_Toc244268679" w:history="1">
+          <w:hyperlink w:anchor="_Toc244358009" w:history="1">
             <w:r>
               <w:rPr>
                 <w:rStyle w:val="Hiperligao"/>
@@ -3129,7 +3129,7 @@
                 <w:noProof/>
                 <w:webHidden/>
               </w:rPr>
-              <w:instrText xml:space="preserve"> PAGEREF _Toc244268679 \h </w:instrText>
+              <w:instrText xml:space="preserve"> PAGEREF _Toc244358009 \h </w:instrText>
             </w:r>
             <w:r>
               <w:rPr>
@@ -3149,7 +3149,7 @@
                 <w:noProof/>
                 <w:webHidden/>
               </w:rPr>
-              <w:t>26</w:t>
+              <w:t>27</w:t>
             </w:r>
             <w:r>
               <w:rPr>
@@ -3175,7 +3175,7 @@
               <w14:ligatures w14:val="standardContextual"/>
             </w:rPr>
           </w:pPr>
-          <w:hyperlink w:anchor="_Toc244268680" w:history="1">
+          <w:hyperlink w:anchor="_Toc244358010" w:history="1">
             <w:r>
               <w:rPr>
                 <w:rStyle w:val="Hiperligao"/>
@@ -3217,7 +3217,7 @@
                 <w:noProof/>
                 <w:webHidden/>
               </w:rPr>
-              <w:instrText xml:space="preserve"> PAGEREF _Toc244268680 \h </w:instrText>
+              <w:instrText xml:space="preserve"> PAGEREF _Toc244358010 \h </w:instrText>
             </w:r>
             <w:r>
               <w:rPr>
@@ -3237,7 +3237,7 @@
                 <w:noProof/>
                 <w:webHidden/>
               </w:rPr>
-              <w:t>27</w:t>
+              <w:t>28</w:t>
             </w:r>
             <w:r>
               <w:rPr>
@@ -3263,7 +3263,7 @@
               <w14:ligatures w14:val="standardContextual"/>
             </w:rPr>
           </w:pPr>
-          <w:hyperlink w:anchor="_Toc244268681" w:history="1">
+          <w:hyperlink w:anchor="_Toc244358011" w:history="1">
             <w:r>
               <w:rPr>
                 <w:rStyle w:val="Hiperligao"/>
@@ -3290,7 +3290,7 @@
                 <w:noProof/>
                 <w:webHidden/>
               </w:rPr>
-              <w:instrText xml:space="preserve"> PAGEREF _Toc244268681 \h </w:instrText>
+              <w:instrText xml:space="preserve"> PAGEREF _Toc244358011 \h </w:instrText>
             </w:r>
             <w:r>
               <w:rPr>
@@ -3310,7 +3310,7 @@
                 <w:noProof/>
                 <w:webHidden/>
               </w:rPr>
-              <w:t>27</w:t>
+              <w:t>28</w:t>
             </w:r>
             <w:r>
               <w:rPr>
@@ -3336,7 +3336,7 @@
               <w14:ligatures w14:val="standardContextual"/>
             </w:rPr>
           </w:pPr>
-          <w:hyperlink w:anchor="_Toc244268682" w:history="1">
+          <w:hyperlink w:anchor="_Toc244358012" w:history="1">
             <w:r>
               <w:rPr>
                 <w:rStyle w:val="Hiperligao"/>
@@ -3363,7 +3363,7 @@
                 <w:noProof/>
                 <w:webHidden/>
               </w:rPr>
-              <w:instrText xml:space="preserve"> PAGEREF _Toc244268682 \h </w:instrText>
+              <w:instrText xml:space="preserve"> PAGEREF _Toc244358012 \h </w:instrText>
             </w:r>
             <w:r>
               <w:rPr>
@@ -3383,7 +3383,7 @@
                 <w:noProof/>
                 <w:webHidden/>
               </w:rPr>
-              <w:t>28</w:t>
+              <w:t>29</w:t>
             </w:r>
             <w:r>
               <w:rPr>
@@ -3409,7 +3409,7 @@
               <w14:ligatures w14:val="standardContextual"/>
             </w:rPr>
           </w:pPr>
-          <w:hyperlink w:anchor="_Toc244268683" w:history="1">
+          <w:hyperlink w:anchor="_Toc244358013" w:history="1">
             <w:r>
               <w:rPr>
                 <w:rStyle w:val="Hiperligao"/>
@@ -3436,7 +3436,7 @@
                 <w:noProof/>
                 <w:webHidden/>
               </w:rPr>
-              <w:instrText xml:space="preserve"> PAGEREF _Toc244268683 \h </w:instrText>
+              <w:instrText xml:space="preserve"> PAGEREF _Toc244358013 \h </w:instrText>
             </w:r>
             <w:r>
               <w:rPr>
@@ -3456,7 +3456,7 @@
                 <w:noProof/>
                 <w:webHidden/>
               </w:rPr>
-              <w:t>29</w:t>
+              <w:t>30</w:t>
             </w:r>
             <w:r>
               <w:rPr>
@@ -3611,7 +3611,7 @@
         <w:spacing w:after="40" w:line="300" w:lineRule="auto"/>
       </w:pPr>
       <w:r>
-        <w:t>Tabela 7 – Cronograma do projeto</w:t>
+        <w:t>Tabela 7 – Bola e guarda-redes antes e depois das correções (média por jogo de 3 min)</w:t>
       </w:r>
     </w:p>
     <w:p>
@@ -3619,7 +3619,15 @@
         <w:spacing w:after="40" w:line="300" w:lineRule="auto"/>
       </w:pPr>
       <w:r>
-        <w:t>Tabela 8 – Gestão de riscos</w:t>
+        <w:t>Tabela 8 – Cronograma do projeto</w:t>
+      </w:r>
+    </w:p>
+    <w:p>
+      <w:pPr>
+        <w:spacing w:after="40" w:line="300" w:lineRule="auto"/>
+      </w:pPr>
+      <w:r>
+        <w:t>Tabela 9 – Gestão de riscos</w:t>
       </w:r>
     </w:p>
     <w:p>
@@ -3797,7 +3805,7 @@
       <w:pPr>
         <w:pStyle w:val="Ttulo1"/>
       </w:pPr>
-      <w:bookmarkStart w:id="0" w:name="_Toc244268647"/>
+      <w:bookmarkStart w:id="0" w:name="_Toc244357977"/>
       <w:r>
         <w:t>1.  Introdução</w:t>
       </w:r>
@@ -3819,7 +3827,7 @@
       <w:pPr>
         <w:pStyle w:val="Ttulo2"/>
       </w:pPr>
-      <w:bookmarkStart w:id="1" w:name="_Toc244268648"/>
+      <w:bookmarkStart w:id="1" w:name="_Toc244357978"/>
       <w:r>
         <w:t>1.1  Enquadramento e contextualização do tema</w:t>
       </w:r>
@@ -3848,7 +3856,7 @@
       <w:pPr>
         <w:pStyle w:val="Ttulo2"/>
       </w:pPr>
-      <w:bookmarkStart w:id="2" w:name="_Toc244268649"/>
+      <w:bookmarkStart w:id="2" w:name="_Toc244357979"/>
       <w:r>
         <w:t>1.2  Motivação e pertinência do projeto</w:t>
       </w:r>
@@ -3877,7 +3885,7 @@
       <w:pPr>
         <w:pStyle w:val="Ttulo2"/>
       </w:pPr>
-      <w:bookmarkStart w:id="3" w:name="_Toc244268650"/>
+      <w:bookmarkStart w:id="3" w:name="_Toc244357980"/>
       <w:r>
         <w:t>1.3  Objetivos (geral e específicos)</w:t>
       </w:r>
@@ -4022,7 +4030,7 @@
       <w:pPr>
         <w:pStyle w:val="Ttulo2"/>
       </w:pPr>
-      <w:bookmarkStart w:id="4" w:name="_Toc244268651"/>
+      <w:bookmarkStart w:id="4" w:name="_Toc244357981"/>
       <w:r>
         <w:t xml:space="preserve">1.4  Metodologia de trabalho (processo adotado; planeamento)   </w:t>
       </w:r>
@@ -4175,7 +4183,7 @@
       <w:pPr>
         <w:pStyle w:val="Ttulo2"/>
       </w:pPr>
-      <w:bookmarkStart w:id="5" w:name="_Toc244268652"/>
+      <w:bookmarkStart w:id="5" w:name="_Toc244357982"/>
       <w:r>
         <w:t>1.5  Estrutura do relatório</w:t>
       </w:r>
@@ -4206,7 +4214,7 @@
       <w:pPr>
         <w:pStyle w:val="Ttulo1"/>
       </w:pPr>
-      <w:bookmarkStart w:id="6" w:name="_Toc244268653"/>
+      <w:bookmarkStart w:id="6" w:name="_Toc244357983"/>
       <w:r>
         <w:t>2.  Análise do sistema</w:t>
       </w:r>
@@ -4216,7 +4224,7 @@
       <w:pPr>
         <w:pStyle w:val="Ttulo2"/>
       </w:pPr>
-      <w:bookmarkStart w:id="7" w:name="_Toc244268654"/>
+      <w:bookmarkStart w:id="7" w:name="_Toc244357984"/>
       <w:r>
         <w:t xml:space="preserve">2.1  Descrição do problema e da necessidade a resolver   </w:t>
       </w:r>
@@ -4254,7 +4262,7 @@
       <w:pPr>
         <w:pStyle w:val="Ttulo2"/>
       </w:pPr>
-      <w:bookmarkStart w:id="8" w:name="_Toc244268655"/>
+      <w:bookmarkStart w:id="8" w:name="_Toc244357985"/>
       <w:r>
         <w:t xml:space="preserve">2.2  Intervenientes e contexto de utilização   </w:t>
       </w:r>
@@ -4407,7 +4415,7 @@
       <w:pPr>
         <w:pStyle w:val="Ttulo2"/>
       </w:pPr>
-      <w:bookmarkStart w:id="9" w:name="_Toc244268656"/>
+      <w:bookmarkStart w:id="9" w:name="_Toc244357986"/>
       <w:r>
         <w:t xml:space="preserve">2.3  Levantamento e análise de requisitos   </w:t>
       </w:r>
@@ -4431,7 +4439,7 @@
       <w:pPr>
         <w:pStyle w:val="Ttulo3"/>
       </w:pPr>
-      <w:bookmarkStart w:id="10" w:name="_Toc244268657"/>
+      <w:bookmarkStart w:id="10" w:name="_Toc244357987"/>
       <w:r>
         <w:t xml:space="preserve">2.3.1  Técnicas de levantamento utilizadas   </w:t>
       </w:r>
@@ -4475,7 +4483,7 @@
       <w:pPr>
         <w:pStyle w:val="Ttulo3"/>
       </w:pPr>
-      <w:bookmarkStart w:id="11" w:name="_Toc244268658"/>
+      <w:bookmarkStart w:id="11" w:name="_Toc244357988"/>
       <w:r>
         <w:t xml:space="preserve">2.3.2  Requisitos funcionais (o que o sistema deve fazer)   </w:t>
       </w:r>
@@ -4594,7 +4602,7 @@
       <w:pPr>
         <w:pStyle w:val="Ttulo3"/>
       </w:pPr>
-      <w:bookmarkStart w:id="12" w:name="_Toc244268659"/>
+      <w:bookmarkStart w:id="12" w:name="_Toc244357989"/>
       <w:r>
         <w:t xml:space="preserve">2.3.3  Requisitos não funcionais (segurança, autonomia, robustez)   </w:t>
       </w:r>
@@ -4678,7 +4686,7 @@
       <w:pPr>
         <w:pStyle w:val="Ttulo2"/>
       </w:pPr>
-      <w:bookmarkStart w:id="13" w:name="_Toc244268660"/>
+      <w:bookmarkStart w:id="13" w:name="_Toc244357990"/>
       <w:r>
         <w:t xml:space="preserve">2.4  Modelação do sistema   </w:t>
       </w:r>
@@ -4698,7 +4706,7 @@
       <w:pPr>
         <w:pStyle w:val="Ttulo3"/>
       </w:pPr>
-      <w:bookmarkStart w:id="14" w:name="_Toc244268661"/>
+      <w:bookmarkStart w:id="14" w:name="_Toc244357991"/>
       <w:r>
         <w:t xml:space="preserve">2.4.1  Cenários de utilização / casos de uso   </w:t>
       </w:r>
@@ -4733,7 +4741,7 @@
           <w:noProof/>
         </w:rPr>
         <w:drawing>
-          <wp:inline distT="0" distB="0" distL="0" distR="0" wp14:anchorId="4FC41C1E" wp14:editId="31778E41">
+          <wp:inline distT="0" distB="0" distL="0" distR="0" wp14:anchorId="7F88D565" wp14:editId="3F6F7429">
             <wp:extent cx="5225000" cy="3632619"/>
             <wp:effectExtent l="0" t="0" r="0" b="0"/>
             <wp:docPr id="901" name="Figura 1"/>
@@ -5182,7 +5190,7 @@
       </w:pPr>
     </w:p>
     <w:p/>
-    <w:bookmarkStart w:id="15" w:name="_Toc244268662"/>
+    <w:bookmarkStart w:id="15" w:name="_Toc244357992"/>
     <w:p>
       <w:pPr>
         <w:pStyle w:val="Ttulo3"/>
@@ -5233,7 +5241,7 @@
           <w:noProof/>
         </w:rPr>
         <w:drawing>
-          <wp:inline distT="0" distB="0" distL="0" distR="0" wp14:anchorId="529927E8" wp14:editId="589CD662">
+          <wp:inline distT="0" distB="0" distL="0" distR="0" wp14:anchorId="31C81519" wp14:editId="63DE2F81">
             <wp:extent cx="5500000" cy="2894736"/>
             <wp:effectExtent l="0" t="0" r="0" b="0"/>
             <wp:docPr id="902" name="Figura 2"/>
@@ -5305,7 +5313,7 @@
           <w:noProof/>
         </w:rPr>
         <w:drawing>
-          <wp:inline distT="0" distB="0" distL="0" distR="0" wp14:anchorId="13D9450C" wp14:editId="113A8FDD">
+          <wp:inline distT="0" distB="0" distL="0" distR="0" wp14:anchorId="5DD15662" wp14:editId="42EBC45E">
             <wp:extent cx="5500000" cy="3471311"/>
             <wp:effectExtent l="0" t="0" r="0" b="0"/>
             <wp:docPr id="903" name="Figura 3"/>
@@ -5377,7 +5385,7 @@
           <w:noProof/>
         </w:rPr>
         <w:drawing>
-          <wp:inline distT="0" distB="0" distL="0" distR="0" wp14:anchorId="0EADD519" wp14:editId="3DD4E252">
+          <wp:inline distT="0" distB="0" distL="0" distR="0" wp14:anchorId="69D93106" wp14:editId="4C3A9C14">
             <wp:extent cx="5500000" cy="2275862"/>
             <wp:effectExtent l="0" t="0" r="0" b="0"/>
             <wp:docPr id="904" name="Figura 4"/>
@@ -5434,7 +5442,7 @@
       <w:pPr>
         <w:pStyle w:val="Ttulo3"/>
       </w:pPr>
-      <w:bookmarkStart w:id="16" w:name="_Toc244268663"/>
+      <w:bookmarkStart w:id="16" w:name="_Toc244357993"/>
       <w:r>
         <w:t xml:space="preserve">2.4.3  Modelação comportamental (fluxogramas / máquina de estados)   </w:t>
       </w:r>
@@ -5469,7 +5477,7 @@
           <w:noProof/>
         </w:rPr>
         <w:drawing>
-          <wp:inline distT="0" distB="0" distL="0" distR="0" wp14:anchorId="2AFB2D25" wp14:editId="00FFB79E">
+          <wp:inline distT="0" distB="0" distL="0" distR="0" wp14:anchorId="7F82907D" wp14:editId="4EEE1AD3">
             <wp:extent cx="5500000" cy="2332000"/>
             <wp:effectExtent l="0" t="0" r="0" b="0"/>
             <wp:docPr id="905" name="Figura 5"/>
@@ -5541,7 +5549,7 @@
           <w:noProof/>
         </w:rPr>
         <w:drawing>
-          <wp:inline distT="0" distB="0" distL="0" distR="0" wp14:anchorId="6D33CD56" wp14:editId="77594B22">
+          <wp:inline distT="0" distB="0" distL="0" distR="0" wp14:anchorId="1F87DD9B" wp14:editId="3A4D4BB1">
             <wp:extent cx="4400000" cy="5524444"/>
             <wp:effectExtent l="0" t="0" r="0" b="0"/>
             <wp:docPr id="906" name="Figura 6"/>
@@ -5616,7 +5624,7 @@
           <w:noProof/>
         </w:rPr>
         <w:drawing>
-          <wp:inline distT="0" distB="0" distL="0" distR="0" wp14:anchorId="37A45C80" wp14:editId="377D6BCC">
+          <wp:inline distT="0" distB="0" distL="0" distR="0" wp14:anchorId="425D8A9C" wp14:editId="199B5D30">
             <wp:extent cx="5500000" cy="3224137"/>
             <wp:effectExtent l="0" t="0" r="0" b="0"/>
             <wp:docPr id="907" name="Figura 7"/>
@@ -5673,7 +5681,7 @@
       <w:pPr>
         <w:pStyle w:val="Ttulo2"/>
       </w:pPr>
-      <w:bookmarkStart w:id="17" w:name="_Toc244268664"/>
+      <w:bookmarkStart w:id="17" w:name="_Toc244357994"/>
       <w:r>
         <w:t>2.5  Projeto do hardware</w:t>
       </w:r>
@@ -5693,7 +5701,7 @@
       <w:pPr>
         <w:pStyle w:val="Ttulo3"/>
       </w:pPr>
-      <w:bookmarkStart w:id="18" w:name="_Toc244268665"/>
+      <w:bookmarkStart w:id="18" w:name="_Toc244357995"/>
       <w:r>
         <w:t>2.5.1  Componentes: sensores, atuadores e controlador</w:t>
       </w:r>
@@ -6248,7 +6256,7 @@
       <w:pPr>
         <w:pStyle w:val="Ttulo3"/>
       </w:pPr>
-      <w:bookmarkStart w:id="19" w:name="_Toc244268666"/>
+      <w:bookmarkStart w:id="19" w:name="_Toc244357996"/>
       <w:r>
         <w:t>2.5.2  Esquema elétrico e ligações</w:t>
       </w:r>
@@ -6268,7 +6276,7 @@
       <w:pPr>
         <w:pStyle w:val="Ttulo3"/>
       </w:pPr>
-      <w:bookmarkStart w:id="20" w:name="_Toc244268667"/>
+      <w:bookmarkStart w:id="20" w:name="_Toc244357997"/>
       <w:r>
         <w:t>2.5.3  Estrutura mecânica</w:t>
       </w:r>
@@ -6288,7 +6296,7 @@
       <w:pPr>
         <w:pStyle w:val="Ttulo2"/>
       </w:pPr>
-      <w:bookmarkStart w:id="21" w:name="_Toc244268668"/>
+      <w:bookmarkStart w:id="21" w:name="_Toc244357998"/>
       <w:r>
         <w:t xml:space="preserve">2.6  Prototipagem (protótipo físico e/ou simulação)   </w:t>
       </w:r>
@@ -6332,7 +6340,7 @@
           <w:noProof/>
         </w:rPr>
         <w:drawing>
-          <wp:inline distT="0" distB="0" distL="0" distR="0" wp14:anchorId="619D4E05" wp14:editId="6AC6F8A5">
+          <wp:inline distT="0" distB="0" distL="0" distR="0" wp14:anchorId="7852BE18" wp14:editId="19539FBF">
             <wp:extent cx="5500000" cy="3093750"/>
             <wp:effectExtent l="0" t="0" r="0" b="0"/>
             <wp:docPr id="908" name="Figura 8"/>
@@ -6389,7 +6397,7 @@
       <w:pPr>
         <w:pStyle w:val="Ttulo1"/>
       </w:pPr>
-      <w:bookmarkStart w:id="22" w:name="_Toc244268669"/>
+      <w:bookmarkStart w:id="22" w:name="_Toc244357999"/>
       <w:r>
         <w:t>3.  Implementação</w:t>
       </w:r>
@@ -6400,7 +6408,7 @@
       <w:pPr>
         <w:pStyle w:val="Ttulo2"/>
       </w:pPr>
-      <w:bookmarkStart w:id="23" w:name="_Toc244268670"/>
+      <w:bookmarkStart w:id="23" w:name="_Toc244358000"/>
       <w:r>
         <w:t>3.1  Montagem do hardware</w:t>
       </w:r>
@@ -6558,7 +6566,7 @@
       <w:pPr>
         <w:pStyle w:val="Ttulo2"/>
       </w:pPr>
-      <w:bookmarkStart w:id="24" w:name="_Toc244268671"/>
+      <w:bookmarkStart w:id="24" w:name="_Toc244358001"/>
       <w:r>
         <w:t>3.2  Programação do controlo (lógica e algoritmos)</w:t>
       </w:r>
@@ -6602,7 +6610,26 @@
         <w:t xml:space="preserve">Física da bola. </w:t>
       </w:r>
       <w:r>
-        <w:t>Em cada frame a bola anda vel × dt. O atrito do piso de madeira multiplica a velocidade por 0,991 quando a bola vai rápida e por 0,975 quando vai lenta (abaixo de 120 px/s), e abaixo de 8 px/s a bola para. Ao bater numa tabela, a componente da velocidade perpendicular à tabela troca de sinal e é multiplicada pelo coeficiente de ressalto 0,78. Um pequeno efeito lateral (spin) torna os ressaltos menos previsíveis. O passe tem força 400 px/s e o remate 650 px/s.</w:t>
+        <w:t>Em cada frame a bola anda vel × dt. O atrito do piso de madeira multiplica a velocidade por 0,991 quando a bola vai rápida e por 0,975 quando vai lenta (abaixo de 120 px/s), e abaixo de 8 px/s a bola para. Ao bater numa tabela, a componente da velocidade perpendicular à tabela troca de sinal e é multiplicada pelo coeficiente de ressalto 0,78. Um pequeno efeito lateral (spin) torna os ressaltos menos previsíveis. O passe tem força 400 px/s e o remate 650 px/s. Os cantos do rinque são arredondados (raio 50 px</w:t>
+      </w:r>
+      <w:r>
+        <w:t>): se a bola passa a curva da tabela, volta a ser posta dentro dela e ressalta segundo a normal da curva.</w:t>
+      </w:r>
+    </w:p>
+    <w:p>
+      <w:pPr>
+        <w:spacing w:after="120" w:line="300" w:lineRule="auto"/>
+        <w:jc w:val="both"/>
+      </w:pPr>
+      <w:r>
+        <w:rPr>
+          <w:b/>
+          <w:bCs/>
+        </w:rPr>
+        <w:t xml:space="preserve">Bola no stick. </w:t>
+      </w:r>
+      <w:r>
+        <w:t>Quando um jogador tem a bola, ela fica a 22 px do centro, do lado para onde ele olha. Em vez de mudar de lado instantaneamente, o ângulo da bola à volta do jogador roda no máximo 0,24 rad por frame (cerca de 14 rad/s), como se o stick a arrastasse, e quando alguém apanha a bola ela desliza até ao stick a 9 px por frame. A bola no stick também nunca pode ficar dentro da rede da baliza.</w:t>
       </w:r>
     </w:p>
     <w:p>
@@ -7652,7 +7679,7 @@
                 <w:sz w:val="19"/>
                 <w:szCs w:val="19"/>
               </w:rPr>
-              <w:t>14</w:t>
+              <w:t>16</w:t>
             </w:r>
           </w:p>
         </w:tc>
@@ -7673,7 +7700,7 @@
                 <w:sz w:val="19"/>
                 <w:szCs w:val="19"/>
               </w:rPr>
-              <w:t>16</w:t>
+              <w:t>17</w:t>
             </w:r>
           </w:p>
         </w:tc>
@@ -7721,7 +7748,7 @@
                 <w:sz w:val="19"/>
                 <w:szCs w:val="19"/>
               </w:rPr>
-              <w:t>Guarda-redes: erro de leitura (px)</w:t>
+              <w:t>Guarda-redes: antecipação do remate</w:t>
             </w:r>
           </w:p>
         </w:tc>
@@ -7742,7 +7769,7 @@
                 <w:sz w:val="19"/>
                 <w:szCs w:val="19"/>
               </w:rPr>
-              <w:t>± 28</w:t>
+              <w:t>52 %</w:t>
             </w:r>
           </w:p>
         </w:tc>
@@ -7763,7 +7790,7 @@
                 <w:sz w:val="19"/>
                 <w:szCs w:val="19"/>
               </w:rPr>
-              <w:t>± 22</w:t>
+              <w:t>60 %</w:t>
             </w:r>
           </w:p>
         </w:tc>
@@ -7784,7 +7811,7 @@
                 <w:sz w:val="19"/>
                 <w:szCs w:val="19"/>
               </w:rPr>
-              <w:t>± 15</w:t>
+              <w:t>70 %</w:t>
             </w:r>
           </w:p>
         </w:tc>
@@ -7817,7 +7844,42 @@
         <w:t xml:space="preserve">Guarda-redes. </w:t>
       </w:r>
       <w:r>
-        <w:t>O guarda-redes só se move na vertical, sobre a linha de golo. Não é perfeito: guarda as últimas posições da bola e reage ao que viu há alguns décimos de segundo (tempo de reação). Quando há um remate, calcula onde a bola vai cruzar a linha de golo, y = y_bola + v_y × (x_GR − x_bola) / v_x, e vai para esse ponto, mas com um pequeno erro de leitura sorteado em cada remate. Se a bola passa ao seu alcance, bloqueia-a e afasta-a. Estes valores foram afinados com simulações até haver um número de golos realista.</w:t>
+        <w:t>O guarda-redes só se move na vertical, sobre a linha de golo. Não é perfeito: guarda as últimas posições da bola e reage ao que viu há alguns décimos de segundo (tempo de reação). Quando há um remate, calcula onde a bola vai cruzar a linha de golo, y_cruz = y_bola + v_y × (x_GR − x_bola) / v_x, mas só antecipa parte do caminho: vai para y_bola + (y_cruz − y_bola) × antecipação. Assim um remate feito direto para ele é sempre defendido e só um remate bem colocado no canto pode entrar.</w:t>
+      </w:r>
+    </w:p>
+    <w:p>
+      <w:pPr>
+        <w:spacing w:after="120" w:line="300" w:lineRule="auto"/>
+        <w:jc w:val="both"/>
+      </w:pPr>
+      <w:r>
+        <w:rPr>
+          <w:b/>
+          <w:bCs/>
+        </w:rPr>
+        <w:t xml:space="preserve">Defesas sem falhas. </w:t>
+      </w:r>
+      <w:r>
+        <w:t xml:space="preserve">Como a bola anda cerca de 10 px por frame, não basta ver onde ela está: podia «saltar» por cima do guarda-redes entre dois frames. Por isso o jogo calcula o ponto do caminho da bola nesse frame (o segmento entre a posição anterior e a atual) mais perto do guarda-redes e compara essa distância com o alcance dele. Esta verificação é feita antes de ver se é golo, e uma defesa manda sempre a bola para a frente da baliza. Os jogadores de campo também chocam com o guarda-redes (são afastados a 30 px dele) e a IA </w:t>
+      </w:r>
+      <w:r>
+        <w:t>nunca escolhe uma posição tática na pequena zona à frente da baliza.</w:t>
+      </w:r>
+    </w:p>
+    <w:p>
+      <w:pPr>
+        <w:spacing w:after="120" w:line="300" w:lineRule="auto"/>
+        <w:jc w:val="both"/>
+      </w:pPr>
+      <w:r>
+        <w:rPr>
+          <w:b/>
+          <w:bCs/>
+        </w:rPr>
+        <w:t xml:space="preserve">Ordem de desenho. </w:t>
+      </w:r>
+      <w:r>
+        <w:t>A bola entra na mesma ordenação por profundidade que os jogadores: se passar atrás do guarda-redes ou de um jogador, fica tapada por ele. Antes era desenhada sempre por cima de todos, o que fazia parecer que atravessava o corpo do guarda-redes.</w:t>
       </w:r>
     </w:p>
     <w:p>
@@ -7876,7 +7938,7 @@
       <w:pPr>
         <w:pStyle w:val="Ttulo2"/>
       </w:pPr>
-      <w:bookmarkStart w:id="25" w:name="_Toc244268672"/>
+      <w:bookmarkStart w:id="25" w:name="_Toc244358002"/>
       <w:r>
         <w:t>3.3  Integração hardware – software</w:t>
       </w:r>
@@ -8424,7 +8486,7 @@
       <w:pPr>
         <w:pStyle w:val="Ttulo2"/>
       </w:pPr>
-      <w:bookmarkStart w:id="26" w:name="_Toc244268673"/>
+      <w:bookmarkStart w:id="26" w:name="_Toc244358003"/>
       <w:r>
         <w:t>3.4  Decisões técnicas e dificuldades ultrapassadas</w:t>
       </w:r>
@@ -8545,12 +8607,28 @@
         <w:t>es e depois. Também se descobriu que, depois de qualquer golo, a bola ia sempre para a equipa do jogador (agora vai para quem sofreu o golo) e que a dificuldade «Difícil» também melhorava os colegas do jogador.</w:t>
       </w:r>
     </w:p>
+    <w:p>
+      <w:pPr>
+        <w:spacing w:after="120" w:line="300" w:lineRule="auto"/>
+        <w:jc w:val="both"/>
+      </w:pPr>
+      <w:r>
+        <w:rPr>
+          <w:b/>
+          <w:bCs/>
+        </w:rPr>
+        <w:t xml:space="preserve">Bola e guarda-redes. </w:t>
+      </w:r>
+      <w:r>
+        <w:t>Ao jogar, ainda se viam problemas com a bola e o guarda-redes. Foi feito um segundo script que procura situações estranhas (Tabela 7): a bola saltava até 50 px de um frame para o outro quando o jogador mudava de direção; jogadores ficavam em cima do guarda-redes porque não chocavam com ele; a bola parecia atravessar o guarda-redes por ser sempre desenhada por cima; e, em casos raros, a bola entrava nos cantos arredondados ou ficava no stick dentro da rede. As soluções estão descritas na secção 3.2.</w:t>
+      </w:r>
+    </w:p>
     <w:p/>
     <w:p>
       <w:pPr>
         <w:pStyle w:val="Ttulo1"/>
       </w:pPr>
-      <w:bookmarkStart w:id="27" w:name="_Toc244268674"/>
+      <w:bookmarkStart w:id="27" w:name="_Toc244358004"/>
       <w:r>
         <w:t>4.  Testes e validação</w:t>
       </w:r>
@@ -8561,7 +8639,7 @@
       <w:pPr>
         <w:pStyle w:val="Ttulo2"/>
       </w:pPr>
-      <w:bookmarkStart w:id="28" w:name="_Toc244268675"/>
+      <w:bookmarkStart w:id="28" w:name="_Toc244358005"/>
       <w:r>
         <w:t>4.1  Plano de testes</w:t>
       </w:r>
@@ -10199,6 +10277,366 @@
                 <w:sz w:val="19"/>
                 <w:szCs w:val="19"/>
               </w:rPr>
+              <w:t>Jogador muda de direção com a bola</w:t>
+            </w:r>
+          </w:p>
+        </w:tc>
+        <w:tc>
+          <w:tcPr>
+            <w:tcW w:w="3300" w:type="dxa"/>
+            <w:tcMar>
+              <w:left w:w="80" w:type="dxa"/>
+              <w:right w:w="80" w:type="dxa"/>
+            </w:tcMar>
+          </w:tcPr>
+          <w:p>
+            <w:pPr>
+              <w:spacing w:before="20" w:after="20" w:line="240" w:lineRule="auto"/>
+            </w:pPr>
+            <w:r>
+              <w:rPr>
+                <w:sz w:val="19"/>
+                <w:szCs w:val="19"/>
+              </w:rPr>
+              <w:t>A bola roda à volta dele, sem saltos</w:t>
+            </w:r>
+          </w:p>
+        </w:tc>
+        <w:tc>
+          <w:tcPr>
+            <w:tcW w:w="1100" w:type="dxa"/>
+            <w:tcMar>
+              <w:left w:w="80" w:type="dxa"/>
+              <w:right w:w="80" w:type="dxa"/>
+            </w:tcMar>
+          </w:tcPr>
+          <w:p>
+            <w:pPr>
+              <w:spacing w:before="20" w:after="20" w:line="240" w:lineRule="auto"/>
+            </w:pPr>
+            <w:r>
+              <w:rPr>
+                <w:sz w:val="19"/>
+                <w:szCs w:val="19"/>
+              </w:rPr>
+              <w:t>Passou</w:t>
+            </w:r>
+          </w:p>
+        </w:tc>
+      </w:tr>
+      <w:tr>
+        <w:trPr>
+          <w:cantSplit/>
+          <w:jc w:val="center"/>
+        </w:trPr>
+        <w:tc>
+          <w:tcPr>
+            <w:tcW w:w="700" w:type="dxa"/>
+            <w:tcMar>
+              <w:left w:w="80" w:type="dxa"/>
+              <w:right w:w="80" w:type="dxa"/>
+            </w:tcMar>
+          </w:tcPr>
+          <w:p>
+            <w:pPr>
+              <w:spacing w:before="20" w:after="20" w:line="240" w:lineRule="auto"/>
+            </w:pPr>
+            <w:r>
+              <w:rPr>
+                <w:sz w:val="19"/>
+                <w:szCs w:val="19"/>
+              </w:rPr>
+              <w:t>T18</w:t>
+            </w:r>
+          </w:p>
+        </w:tc>
+        <w:tc>
+          <w:tcPr>
+            <w:tcW w:w="3100" w:type="dxa"/>
+            <w:tcMar>
+              <w:left w:w="80" w:type="dxa"/>
+              <w:right w:w="80" w:type="dxa"/>
+            </w:tcMar>
+          </w:tcPr>
+          <w:p>
+            <w:pPr>
+              <w:spacing w:before="20" w:after="20" w:line="240" w:lineRule="auto"/>
+            </w:pPr>
+            <w:r>
+              <w:rPr>
+                <w:sz w:val="19"/>
+                <w:szCs w:val="19"/>
+              </w:rPr>
+              <w:t>Remate rápido junto ao guarda-redes</w:t>
+            </w:r>
+          </w:p>
+        </w:tc>
+        <w:tc>
+          <w:tcPr>
+            <w:tcW w:w="3300" w:type="dxa"/>
+            <w:tcMar>
+              <w:left w:w="80" w:type="dxa"/>
+              <w:right w:w="80" w:type="dxa"/>
+            </w:tcMar>
+          </w:tcPr>
+          <w:p>
+            <w:pPr>
+              <w:spacing w:before="20" w:after="20" w:line="240" w:lineRule="auto"/>
+            </w:pPr>
+            <w:r>
+              <w:rPr>
+                <w:sz w:val="19"/>
+                <w:szCs w:val="19"/>
+              </w:rPr>
+              <w:t>Não atravessa o GR; a defesa manda a bola para a frente</w:t>
+            </w:r>
+          </w:p>
+        </w:tc>
+        <w:tc>
+          <w:tcPr>
+            <w:tcW w:w="1100" w:type="dxa"/>
+            <w:tcMar>
+              <w:left w:w="80" w:type="dxa"/>
+              <w:right w:w="80" w:type="dxa"/>
+            </w:tcMar>
+          </w:tcPr>
+          <w:p>
+            <w:pPr>
+              <w:spacing w:before="20" w:after="20" w:line="240" w:lineRule="auto"/>
+            </w:pPr>
+            <w:r>
+              <w:rPr>
+                <w:sz w:val="19"/>
+                <w:szCs w:val="19"/>
+              </w:rPr>
+              <w:t>Passou</w:t>
+            </w:r>
+          </w:p>
+        </w:tc>
+      </w:tr>
+      <w:tr>
+        <w:trPr>
+          <w:cantSplit/>
+          <w:jc w:val="center"/>
+        </w:trPr>
+        <w:tc>
+          <w:tcPr>
+            <w:tcW w:w="700" w:type="dxa"/>
+            <w:tcMar>
+              <w:left w:w="80" w:type="dxa"/>
+              <w:right w:w="80" w:type="dxa"/>
+            </w:tcMar>
+          </w:tcPr>
+          <w:p>
+            <w:pPr>
+              <w:spacing w:before="20" w:after="20" w:line="240" w:lineRule="auto"/>
+            </w:pPr>
+            <w:r>
+              <w:rPr>
+                <w:sz w:val="19"/>
+                <w:szCs w:val="19"/>
+              </w:rPr>
+              <w:t>T19</w:t>
+            </w:r>
+          </w:p>
+        </w:tc>
+        <w:tc>
+          <w:tcPr>
+            <w:tcW w:w="3100" w:type="dxa"/>
+            <w:tcMar>
+              <w:left w:w="80" w:type="dxa"/>
+              <w:right w:w="80" w:type="dxa"/>
+            </w:tcMar>
+          </w:tcPr>
+          <w:p>
+            <w:pPr>
+              <w:spacing w:before="20" w:after="20" w:line="240" w:lineRule="auto"/>
+            </w:pPr>
+            <w:r>
+              <w:rPr>
+                <w:sz w:val="19"/>
+                <w:szCs w:val="19"/>
+              </w:rPr>
+              <w:t>Jogador a ir contra o guarda-redes</w:t>
+            </w:r>
+          </w:p>
+        </w:tc>
+        <w:tc>
+          <w:tcPr>
+            <w:tcW w:w="3300" w:type="dxa"/>
+            <w:tcMar>
+              <w:left w:w="80" w:type="dxa"/>
+              <w:right w:w="80" w:type="dxa"/>
+            </w:tcMar>
+          </w:tcPr>
+          <w:p>
+            <w:pPr>
+              <w:spacing w:before="20" w:after="20" w:line="240" w:lineRule="auto"/>
+            </w:pPr>
+            <w:r>
+              <w:rPr>
+                <w:sz w:val="19"/>
+                <w:szCs w:val="19"/>
+              </w:rPr>
+              <w:t>Não fica em cima do GR</w:t>
+            </w:r>
+          </w:p>
+        </w:tc>
+        <w:tc>
+          <w:tcPr>
+            <w:tcW w:w="1100" w:type="dxa"/>
+            <w:tcMar>
+              <w:left w:w="80" w:type="dxa"/>
+              <w:right w:w="80" w:type="dxa"/>
+            </w:tcMar>
+          </w:tcPr>
+          <w:p>
+            <w:pPr>
+              <w:spacing w:before="20" w:after="20" w:line="240" w:lineRule="auto"/>
+            </w:pPr>
+            <w:r>
+              <w:rPr>
+                <w:sz w:val="19"/>
+                <w:szCs w:val="19"/>
+              </w:rPr>
+              <w:t>Passou</w:t>
+            </w:r>
+          </w:p>
+        </w:tc>
+      </w:tr>
+      <w:tr>
+        <w:trPr>
+          <w:cantSplit/>
+          <w:jc w:val="center"/>
+        </w:trPr>
+        <w:tc>
+          <w:tcPr>
+            <w:tcW w:w="700" w:type="dxa"/>
+            <w:tcMar>
+              <w:left w:w="80" w:type="dxa"/>
+              <w:right w:w="80" w:type="dxa"/>
+            </w:tcMar>
+          </w:tcPr>
+          <w:p>
+            <w:pPr>
+              <w:spacing w:before="20" w:after="20" w:line="240" w:lineRule="auto"/>
+            </w:pPr>
+            <w:r>
+              <w:rPr>
+                <w:sz w:val="19"/>
+                <w:szCs w:val="19"/>
+              </w:rPr>
+              <w:t>T20</w:t>
+            </w:r>
+          </w:p>
+        </w:tc>
+        <w:tc>
+          <w:tcPr>
+            <w:tcW w:w="3100" w:type="dxa"/>
+            <w:tcMar>
+              <w:left w:w="80" w:type="dxa"/>
+              <w:right w:w="80" w:type="dxa"/>
+            </w:tcMar>
+          </w:tcPr>
+          <w:p>
+            <w:pPr>
+              <w:spacing w:before="20" w:after="20" w:line="240" w:lineRule="auto"/>
+            </w:pPr>
+            <w:r>
+              <w:rPr>
+                <w:sz w:val="19"/>
+                <w:szCs w:val="19"/>
+              </w:rPr>
+              <w:t>Bola nos cantos do rinque</w:t>
+            </w:r>
+          </w:p>
+        </w:tc>
+        <w:tc>
+          <w:tcPr>
+            <w:tcW w:w="3300" w:type="dxa"/>
+            <w:tcMar>
+              <w:left w:w="80" w:type="dxa"/>
+              <w:right w:w="80" w:type="dxa"/>
+            </w:tcMar>
+          </w:tcPr>
+          <w:p>
+            <w:pPr>
+              <w:spacing w:before="20" w:after="20" w:line="240" w:lineRule="auto"/>
+            </w:pPr>
+            <w:r>
+              <w:rPr>
+                <w:sz w:val="19"/>
+                <w:szCs w:val="19"/>
+              </w:rPr>
+              <w:t>Ressalta na curva da tabela</w:t>
+            </w:r>
+          </w:p>
+        </w:tc>
+        <w:tc>
+          <w:tcPr>
+            <w:tcW w:w="1100" w:type="dxa"/>
+            <w:tcMar>
+              <w:left w:w="80" w:type="dxa"/>
+              <w:right w:w="80" w:type="dxa"/>
+            </w:tcMar>
+          </w:tcPr>
+          <w:p>
+            <w:pPr>
+              <w:spacing w:before="20" w:after="20" w:line="240" w:lineRule="auto"/>
+            </w:pPr>
+            <w:r>
+              <w:rPr>
+                <w:sz w:val="19"/>
+                <w:szCs w:val="19"/>
+              </w:rPr>
+              <w:t>Passou</w:t>
+            </w:r>
+          </w:p>
+        </w:tc>
+      </w:tr>
+      <w:tr>
+        <w:trPr>
+          <w:cantSplit/>
+          <w:jc w:val="center"/>
+        </w:trPr>
+        <w:tc>
+          <w:tcPr>
+            <w:tcW w:w="700" w:type="dxa"/>
+            <w:tcMar>
+              <w:left w:w="80" w:type="dxa"/>
+              <w:right w:w="80" w:type="dxa"/>
+            </w:tcMar>
+          </w:tcPr>
+          <w:p>
+            <w:pPr>
+              <w:spacing w:before="20" w:after="20" w:line="240" w:lineRule="auto"/>
+            </w:pPr>
+            <w:r>
+              <w:rPr>
+                <w:sz w:val="19"/>
+                <w:szCs w:val="19"/>
+              </w:rPr>
+              <w:t>T21</w:t>
+            </w:r>
+          </w:p>
+        </w:tc>
+        <w:tc>
+          <w:tcPr>
+            <w:tcW w:w="3100" w:type="dxa"/>
+            <w:tcMar>
+              <w:left w:w="80" w:type="dxa"/>
+              <w:right w:w="80" w:type="dxa"/>
+            </w:tcMar>
+          </w:tcPr>
+          <w:p>
+            <w:pPr>
+              <w:spacing w:before="20" w:after="20" w:line="240" w:lineRule="auto"/>
+            </w:pPr>
+            <w:r>
+              <w:rPr>
+                <w:sz w:val="19"/>
+                <w:szCs w:val="19"/>
+              </w:rPr>
               <w:t>Gravar o torneio em SQLite</w:t>
             </w:r>
           </w:p>
@@ -10257,7 +10695,7 @@
       <w:pPr>
         <w:pStyle w:val="Ttulo2"/>
       </w:pPr>
-      <w:bookmarkStart w:id="29" w:name="_Toc244268676"/>
+      <w:bookmarkStart w:id="29" w:name="_Toc244358006"/>
       <w:r>
         <w:t>4.2  Ensaios, calibração e medições</w:t>
       </w:r>
@@ -10561,7 +10999,7 @@
                 <w:sz w:val="19"/>
                 <w:szCs w:val="19"/>
               </w:rPr>
-              <w:t>2,0</w:t>
+              <w:t>2,5</w:t>
             </w:r>
           </w:p>
         </w:tc>
@@ -10630,7 +11068,7 @@
                 <w:sz w:val="19"/>
                 <w:szCs w:val="19"/>
               </w:rPr>
-              <w:t>50</w:t>
+              <w:t>51</w:t>
             </w:r>
           </w:p>
         </w:tc>
@@ -10699,7 +11137,7 @@
                 <w:sz w:val="19"/>
                 <w:szCs w:val="19"/>
               </w:rPr>
-              <w:t>16</w:t>
+              <w:t>18</w:t>
             </w:r>
           </w:p>
         </w:tc>
@@ -10768,7 +11206,7 @@
                 <w:sz w:val="19"/>
                 <w:szCs w:val="19"/>
               </w:rPr>
-              <w:t>80</w:t>
+              <w:t>81</w:t>
             </w:r>
           </w:p>
         </w:tc>
@@ -10837,7 +11275,7 @@
                 <w:sz w:val="19"/>
                 <w:szCs w:val="19"/>
               </w:rPr>
-              <w:t>0,5</w:t>
+              <w:t>0,6</w:t>
             </w:r>
           </w:p>
         </w:tc>
@@ -10906,7 +11344,7 @@
                 <w:sz w:val="19"/>
                 <w:szCs w:val="19"/>
               </w:rPr>
-              <w:t>31</w:t>
+              <w:t>39</w:t>
             </w:r>
           </w:p>
         </w:tc>
@@ -10975,7 +11413,7 @@
                 <w:sz w:val="19"/>
                 <w:szCs w:val="19"/>
               </w:rPr>
-              <w:t>0,6</w:t>
+              <w:t>0,2</w:t>
             </w:r>
           </w:p>
         </w:tc>
@@ -11057,95 +11495,11 @@
     </w:p>
     <w:p>
       <w:pPr>
-        <w:pStyle w:val="Ttulo2"/>
-      </w:pPr>
-    </w:p>
-    <w:p>
-      <w:pPr>
-        <w:pStyle w:val="Ttulo2"/>
-      </w:pPr>
-      <w:bookmarkStart w:id="30" w:name="_Toc244268677"/>
-      <w:r>
-        <w:t>4.3  Resultados obtidos e ajustes</w:t>
-      </w:r>
-      <w:bookmarkEnd w:id="30"/>
-    </w:p>
-    <w:p>
-      <w:pPr>
         <w:spacing w:after="120" w:line="300" w:lineRule="auto"/>
         <w:jc w:val="both"/>
       </w:pPr>
       <w:r>
-        <w:t>Os testes T01 a T16 passaram. O teste T17 ainda não foi feito porque o torneio com base de dados é a próxima fase do projeto.</w:t>
-      </w:r>
-    </w:p>
-    <w:p>
-      <w:pPr>
-        <w:spacing w:after="120" w:line="300" w:lineRule="auto"/>
-        <w:jc w:val="both"/>
-      </w:pPr>
-      <w:r>
-        <w:t>Os testes levaram a vários ajustes: o triângulo de seleção e a etiqueta «GR» ficavam a flutuar acima dos jogadores depois da câmara em perspetiva e passaram a usar o retângulo visível do sprite; o stick ficava demasiado claro e foi escurecido; as tabelas e as balizas foram redesenhadas para ficarem iguais à imagem de referência; e a IA foi afinada para haver menos quedas.</w:t>
-      </w:r>
-    </w:p>
-    <w:p>
-      <w:pPr>
-        <w:spacing w:after="120" w:line="300" w:lineRule="auto"/>
-        <w:jc w:val="both"/>
-      </w:pPr>
-      <w:r>
-        <w:t>Na afinação do guarda-redes testaram-se várias combinações de alcance, erro de leitura e tempo de reação. Com o alcance antigo (34 px) o guarda-redes tapava a baliza toda e quase não havia golos; com antecipação perfeita da trajetória também não. Os valores finais dão cerca de 4 % de remates convertidos em golo entre duas equipas da IA, o que corresponde a 6 ou 7 golos num jogo de 2 × 5 minutos.</w:t>
-      </w:r>
-    </w:p>
-    <w:p/>
-    <w:p>
-      <w:pPr>
-        <w:spacing w:before="120" w:after="120" w:line="360" w:lineRule="auto"/>
-        <w:jc w:val="both"/>
-      </w:pPr>
-    </w:p>
-    <w:p>
-      <w:pPr>
-        <w:pStyle w:val="Ttulo1"/>
-      </w:pPr>
-      <w:bookmarkStart w:id="31" w:name="_Toc244268678"/>
-      <w:r>
-        <w:t>5.  Gestão do projeto</w:t>
-      </w:r>
-      <w:bookmarkEnd w:id="31"/>
-    </w:p>
-    <w:p>
-      <w:pPr>
-        <w:spacing w:before="120" w:after="120" w:line="360" w:lineRule="auto"/>
-        <w:jc w:val="both"/>
-      </w:pPr>
-    </w:p>
-    <w:p>
-      <w:pPr>
-        <w:pStyle w:val="Ttulo2"/>
-      </w:pPr>
-      <w:bookmarkStart w:id="32" w:name="_Toc244268679"/>
-      <w:r>
-        <w:t xml:space="preserve">5.1  Planeamento e cronograma   </w:t>
-      </w:r>
-      <w:r>
-        <w:rPr>
-          <w:rFonts w:ascii="Cambria Math" w:eastAsia="Cambria Math" w:hAnsi="Cambria Math" w:cs="Cambria Math"/>
-        </w:rPr>
-        <w:t>◆</w:t>
-      </w:r>
-      <w:r>
-        <w:t xml:space="preserve"> MADS</w:t>
-      </w:r>
-      <w:bookmarkEnd w:id="32"/>
-    </w:p>
-    <w:p>
-      <w:pPr>
-        <w:spacing w:after="120" w:line="300" w:lineRule="auto"/>
-        <w:jc w:val="both"/>
-      </w:pPr>
-      <w:r>
-        <w:t>A tabela seguinte mostra o cronograma do projeto, desde o anteprojeto até à defesa.</w:t>
+        <w:t>Um segundo script procura problemas da bola e do guarda-redes, em 4 jogos de 3 minutos (IA contra IA):</w:t>
       </w:r>
     </w:p>
     <w:p>
@@ -11161,7 +11515,569 @@
           <w:sz w:val="20"/>
           <w:szCs w:val="20"/>
         </w:rPr>
-        <w:t>Tabela 7 – Cronograma do projeto</w:t>
+        <w:t>Tabela 7 – Bola e guarda-redes antes e depois das correções (média por jogo de 3 min)</w:t>
+      </w:r>
+    </w:p>
+    <w:tbl>
+      <w:tblPr>
+        <w:tblW w:w="8700" w:type="dxa"/>
+        <w:jc w:val="center"/>
+        <w:tblBorders>
+          <w:top w:val="single" w:sz="4" w:space="0" w:color="8EA9C1"/>
+          <w:left w:val="single" w:sz="4" w:space="0" w:color="8EA9C1"/>
+          <w:bottom w:val="single" w:sz="4" w:space="0" w:color="8EA9C1"/>
+          <w:right w:val="single" w:sz="4" w:space="0" w:color="8EA9C1"/>
+          <w:insideH w:val="single" w:sz="4" w:space="0" w:color="8EA9C1"/>
+          <w:insideV w:val="single" w:sz="4" w:space="0" w:color="8EA9C1"/>
+        </w:tblBorders>
+        <w:tblLayout w:type="fixed"/>
+        <w:tblLook w:val="04A0" w:firstRow="1" w:lastRow="0" w:firstColumn="1" w:lastColumn="0" w:noHBand="0" w:noVBand="1"/>
+      </w:tblPr>
+      <w:tblGrid>
+        <w:gridCol w:w="5100"/>
+        <w:gridCol w:w="1800"/>
+        <w:gridCol w:w="1800"/>
+      </w:tblGrid>
+      <w:tr>
+        <w:trPr>
+          <w:cantSplit/>
+          <w:tblHeader/>
+          <w:jc w:val="center"/>
+        </w:trPr>
+        <w:tc>
+          <w:tcPr>
+            <w:tcW w:w="5100" w:type="dxa"/>
+            <w:shd w:val="clear" w:color="auto" w:fill="D9E2F3"/>
+            <w:tcMar>
+              <w:left w:w="80" w:type="dxa"/>
+              <w:right w:w="80" w:type="dxa"/>
+            </w:tcMar>
+          </w:tcPr>
+          <w:p>
+            <w:pPr>
+              <w:spacing w:before="20" w:after="20" w:line="240" w:lineRule="auto"/>
+            </w:pPr>
+            <w:r>
+              <w:rPr>
+                <w:b/>
+                <w:bCs/>
+                <w:sz w:val="19"/>
+                <w:szCs w:val="19"/>
+              </w:rPr>
+              <w:t>Medida</w:t>
+            </w:r>
+          </w:p>
+        </w:tc>
+        <w:tc>
+          <w:tcPr>
+            <w:tcW w:w="1800" w:type="dxa"/>
+            <w:shd w:val="clear" w:color="auto" w:fill="D9E2F3"/>
+            <w:tcMar>
+              <w:left w:w="80" w:type="dxa"/>
+              <w:right w:w="80" w:type="dxa"/>
+            </w:tcMar>
+          </w:tcPr>
+          <w:p>
+            <w:pPr>
+              <w:spacing w:before="20" w:after="20" w:line="240" w:lineRule="auto"/>
+            </w:pPr>
+            <w:r>
+              <w:rPr>
+                <w:b/>
+                <w:bCs/>
+                <w:sz w:val="19"/>
+                <w:szCs w:val="19"/>
+              </w:rPr>
+              <w:t>Antes</w:t>
+            </w:r>
+          </w:p>
+        </w:tc>
+        <w:tc>
+          <w:tcPr>
+            <w:tcW w:w="1800" w:type="dxa"/>
+            <w:shd w:val="clear" w:color="auto" w:fill="D9E2F3"/>
+            <w:tcMar>
+              <w:left w:w="80" w:type="dxa"/>
+              <w:right w:w="80" w:type="dxa"/>
+            </w:tcMar>
+          </w:tcPr>
+          <w:p>
+            <w:pPr>
+              <w:spacing w:before="20" w:after="20" w:line="240" w:lineRule="auto"/>
+            </w:pPr>
+            <w:r>
+              <w:rPr>
+                <w:b/>
+                <w:bCs/>
+                <w:sz w:val="19"/>
+                <w:szCs w:val="19"/>
+              </w:rPr>
+              <w:t>Depois</w:t>
+            </w:r>
+          </w:p>
+        </w:tc>
+      </w:tr>
+      <w:tr>
+        <w:trPr>
+          <w:cantSplit/>
+          <w:jc w:val="center"/>
+        </w:trPr>
+        <w:tc>
+          <w:tcPr>
+            <w:tcW w:w="5100" w:type="dxa"/>
+            <w:tcMar>
+              <w:left w:w="80" w:type="dxa"/>
+              <w:right w:w="80" w:type="dxa"/>
+            </w:tcMar>
+          </w:tcPr>
+          <w:p>
+            <w:pPr>
+              <w:spacing w:before="20" w:after="20" w:line="240" w:lineRule="auto"/>
+            </w:pPr>
+            <w:r>
+              <w:rPr>
+                <w:sz w:val="19"/>
+                <w:szCs w:val="19"/>
+              </w:rPr>
+              <w:t>Saltos da bola de mais de 25 px num frame</w:t>
+            </w:r>
+          </w:p>
+        </w:tc>
+        <w:tc>
+          <w:tcPr>
+            <w:tcW w:w="1800" w:type="dxa"/>
+            <w:tcMar>
+              <w:left w:w="80" w:type="dxa"/>
+              <w:right w:w="80" w:type="dxa"/>
+            </w:tcMar>
+          </w:tcPr>
+          <w:p>
+            <w:pPr>
+              <w:spacing w:before="20" w:after="20" w:line="240" w:lineRule="auto"/>
+            </w:pPr>
+            <w:r>
+              <w:rPr>
+                <w:sz w:val="19"/>
+                <w:szCs w:val="19"/>
+              </w:rPr>
+              <w:t>157</w:t>
+            </w:r>
+          </w:p>
+        </w:tc>
+        <w:tc>
+          <w:tcPr>
+            <w:tcW w:w="1800" w:type="dxa"/>
+            <w:tcMar>
+              <w:left w:w="80" w:type="dxa"/>
+              <w:right w:w="80" w:type="dxa"/>
+            </w:tcMar>
+          </w:tcPr>
+          <w:p>
+            <w:pPr>
+              <w:spacing w:before="20" w:after="20" w:line="240" w:lineRule="auto"/>
+            </w:pPr>
+            <w:r>
+              <w:rPr>
+                <w:sz w:val="19"/>
+                <w:szCs w:val="19"/>
+              </w:rPr>
+              <w:t>0</w:t>
+            </w:r>
+          </w:p>
+        </w:tc>
+      </w:tr>
+      <w:tr>
+        <w:trPr>
+          <w:cantSplit/>
+          <w:jc w:val="center"/>
+        </w:trPr>
+        <w:tc>
+          <w:tcPr>
+            <w:tcW w:w="5100" w:type="dxa"/>
+            <w:tcMar>
+              <w:left w:w="80" w:type="dxa"/>
+              <w:right w:w="80" w:type="dxa"/>
+            </w:tcMar>
+          </w:tcPr>
+          <w:p>
+            <w:pPr>
+              <w:spacing w:before="20" w:after="20" w:line="240" w:lineRule="auto"/>
+            </w:pPr>
+            <w:r>
+              <w:rPr>
+                <w:sz w:val="19"/>
+                <w:szCs w:val="19"/>
+              </w:rPr>
+              <w:t>Frames com um jogador em cima do guarda-redes</w:t>
+            </w:r>
+          </w:p>
+        </w:tc>
+        <w:tc>
+          <w:tcPr>
+            <w:tcW w:w="1800" w:type="dxa"/>
+            <w:tcMar>
+              <w:left w:w="80" w:type="dxa"/>
+              <w:right w:w="80" w:type="dxa"/>
+            </w:tcMar>
+          </w:tcPr>
+          <w:p>
+            <w:pPr>
+              <w:spacing w:before="20" w:after="20" w:line="240" w:lineRule="auto"/>
+            </w:pPr>
+            <w:r>
+              <w:rPr>
+                <w:sz w:val="19"/>
+                <w:szCs w:val="19"/>
+              </w:rPr>
+              <w:t>107</w:t>
+            </w:r>
+          </w:p>
+        </w:tc>
+        <w:tc>
+          <w:tcPr>
+            <w:tcW w:w="1800" w:type="dxa"/>
+            <w:tcMar>
+              <w:left w:w="80" w:type="dxa"/>
+              <w:right w:w="80" w:type="dxa"/>
+            </w:tcMar>
+          </w:tcPr>
+          <w:p>
+            <w:pPr>
+              <w:spacing w:before="20" w:after="20" w:line="240" w:lineRule="auto"/>
+            </w:pPr>
+            <w:r>
+              <w:rPr>
+                <w:sz w:val="19"/>
+                <w:szCs w:val="19"/>
+              </w:rPr>
+              <w:t>3,5</w:t>
+            </w:r>
+          </w:p>
+        </w:tc>
+      </w:tr>
+      <w:tr>
+        <w:trPr>
+          <w:cantSplit/>
+          <w:jc w:val="center"/>
+        </w:trPr>
+        <w:tc>
+          <w:tcPr>
+            <w:tcW w:w="5100" w:type="dxa"/>
+            <w:tcMar>
+              <w:left w:w="80" w:type="dxa"/>
+              <w:right w:w="80" w:type="dxa"/>
+            </w:tcMar>
+          </w:tcPr>
+          <w:p>
+            <w:pPr>
+              <w:spacing w:before="20" w:after="20" w:line="240" w:lineRule="auto"/>
+            </w:pPr>
+            <w:r>
+              <w:rPr>
+                <w:sz w:val="19"/>
+                <w:szCs w:val="19"/>
+              </w:rPr>
+              <w:t>Frames com a bola fora dos cantos arredondados</w:t>
+            </w:r>
+          </w:p>
+        </w:tc>
+        <w:tc>
+          <w:tcPr>
+            <w:tcW w:w="1800" w:type="dxa"/>
+            <w:tcMar>
+              <w:left w:w="80" w:type="dxa"/>
+              <w:right w:w="80" w:type="dxa"/>
+            </w:tcMar>
+          </w:tcPr>
+          <w:p>
+            <w:pPr>
+              <w:spacing w:before="20" w:after="20" w:line="240" w:lineRule="auto"/>
+            </w:pPr>
+            <w:r>
+              <w:rPr>
+                <w:sz w:val="19"/>
+                <w:szCs w:val="19"/>
+              </w:rPr>
+              <w:t>0,75</w:t>
+            </w:r>
+          </w:p>
+        </w:tc>
+        <w:tc>
+          <w:tcPr>
+            <w:tcW w:w="1800" w:type="dxa"/>
+            <w:tcMar>
+              <w:left w:w="80" w:type="dxa"/>
+              <w:right w:w="80" w:type="dxa"/>
+            </w:tcMar>
+          </w:tcPr>
+          <w:p>
+            <w:pPr>
+              <w:spacing w:before="20" w:after="20" w:line="240" w:lineRule="auto"/>
+            </w:pPr>
+            <w:r>
+              <w:rPr>
+                <w:sz w:val="19"/>
+                <w:szCs w:val="19"/>
+              </w:rPr>
+              <w:t>0</w:t>
+            </w:r>
+          </w:p>
+        </w:tc>
+      </w:tr>
+      <w:tr>
+        <w:trPr>
+          <w:cantSplit/>
+          <w:jc w:val="center"/>
+        </w:trPr>
+        <w:tc>
+          <w:tcPr>
+            <w:tcW w:w="5100" w:type="dxa"/>
+            <w:tcMar>
+              <w:left w:w="80" w:type="dxa"/>
+              <w:right w:w="80" w:type="dxa"/>
+            </w:tcMar>
+          </w:tcPr>
+          <w:p>
+            <w:pPr>
+              <w:spacing w:before="20" w:after="20" w:line="240" w:lineRule="auto"/>
+            </w:pPr>
+            <w:r>
+              <w:rPr>
+                <w:sz w:val="19"/>
+                <w:szCs w:val="19"/>
+              </w:rPr>
+              <w:t>Frames com a bola no stick dentro da rede</w:t>
+            </w:r>
+          </w:p>
+        </w:tc>
+        <w:tc>
+          <w:tcPr>
+            <w:tcW w:w="1800" w:type="dxa"/>
+            <w:tcMar>
+              <w:left w:w="80" w:type="dxa"/>
+              <w:right w:w="80" w:type="dxa"/>
+            </w:tcMar>
+          </w:tcPr>
+          <w:p>
+            <w:pPr>
+              <w:spacing w:before="20" w:after="20" w:line="240" w:lineRule="auto"/>
+            </w:pPr>
+            <w:r>
+              <w:rPr>
+                <w:sz w:val="19"/>
+                <w:szCs w:val="19"/>
+              </w:rPr>
+              <w:t>4</w:t>
+            </w:r>
+          </w:p>
+        </w:tc>
+        <w:tc>
+          <w:tcPr>
+            <w:tcW w:w="1800" w:type="dxa"/>
+            <w:tcMar>
+              <w:left w:w="80" w:type="dxa"/>
+              <w:right w:w="80" w:type="dxa"/>
+            </w:tcMar>
+          </w:tcPr>
+          <w:p>
+            <w:pPr>
+              <w:spacing w:before="20" w:after="20" w:line="240" w:lineRule="auto"/>
+            </w:pPr>
+            <w:r>
+              <w:rPr>
+                <w:sz w:val="19"/>
+                <w:szCs w:val="19"/>
+              </w:rPr>
+              <w:t>0</w:t>
+            </w:r>
+          </w:p>
+        </w:tc>
+      </w:tr>
+      <w:tr>
+        <w:trPr>
+          <w:cantSplit/>
+          <w:jc w:val="center"/>
+        </w:trPr>
+        <w:tc>
+          <w:tcPr>
+            <w:tcW w:w="5100" w:type="dxa"/>
+            <w:tcMar>
+              <w:left w:w="80" w:type="dxa"/>
+              <w:right w:w="80" w:type="dxa"/>
+            </w:tcMar>
+          </w:tcPr>
+          <w:p>
+            <w:pPr>
+              <w:spacing w:before="20" w:after="20" w:line="240" w:lineRule="auto"/>
+            </w:pPr>
+            <w:r>
+              <w:rPr>
+                <w:sz w:val="19"/>
+                <w:szCs w:val="19"/>
+              </w:rPr>
+              <w:t>Bola a passar junto ao GR sem defesa (a 22–24 px, fora do alcance)</w:t>
+            </w:r>
+          </w:p>
+        </w:tc>
+        <w:tc>
+          <w:tcPr>
+            <w:tcW w:w="1800" w:type="dxa"/>
+            <w:tcMar>
+              <w:left w:w="80" w:type="dxa"/>
+              <w:right w:w="80" w:type="dxa"/>
+            </w:tcMar>
+          </w:tcPr>
+          <w:p>
+            <w:pPr>
+              <w:spacing w:before="20" w:after="20" w:line="240" w:lineRule="auto"/>
+            </w:pPr>
+            <w:r>
+              <w:rPr>
+                <w:sz w:val="19"/>
+                <w:szCs w:val="19"/>
+              </w:rPr>
+              <w:t>1,0</w:t>
+            </w:r>
+          </w:p>
+        </w:tc>
+        <w:tc>
+          <w:tcPr>
+            <w:tcW w:w="1800" w:type="dxa"/>
+            <w:tcMar>
+              <w:left w:w="80" w:type="dxa"/>
+              <w:right w:w="80" w:type="dxa"/>
+            </w:tcMar>
+          </w:tcPr>
+          <w:p>
+            <w:pPr>
+              <w:spacing w:before="20" w:after="20" w:line="240" w:lineRule="auto"/>
+            </w:pPr>
+            <w:r>
+              <w:rPr>
+                <w:sz w:val="19"/>
+                <w:szCs w:val="19"/>
+              </w:rPr>
+              <w:t>0,5</w:t>
+            </w:r>
+          </w:p>
+        </w:tc>
+      </w:tr>
+    </w:tbl>
+    <w:p>
+      <w:pPr>
+        <w:spacing w:after="120"/>
+      </w:pPr>
+    </w:p>
+    <w:p>
+      <w:pPr>
+        <w:pStyle w:val="Ttulo2"/>
+      </w:pPr>
+    </w:p>
+    <w:p>
+      <w:pPr>
+        <w:pStyle w:val="Ttulo2"/>
+      </w:pPr>
+      <w:bookmarkStart w:id="30" w:name="_Toc244358007"/>
+      <w:r>
+        <w:t>4.3  Resultados obtidos e ajustes</w:t>
+      </w:r>
+      <w:bookmarkEnd w:id="30"/>
+    </w:p>
+    <w:p>
+      <w:pPr>
+        <w:spacing w:after="120" w:line="300" w:lineRule="auto"/>
+        <w:jc w:val="both"/>
+      </w:pPr>
+      <w:r>
+        <w:t>Os testes T01 a T20 passaram. O teste T21 ainda não foi feito porque o torneio com base de dados é a próxima fase do projeto.</w:t>
+      </w:r>
+    </w:p>
+    <w:p>
+      <w:pPr>
+        <w:spacing w:after="120" w:line="300" w:lineRule="auto"/>
+        <w:jc w:val="both"/>
+      </w:pPr>
+      <w:r>
+        <w:t>Os testes levaram a vários ajustes: o triângulo de seleção e a etiqueta «GR» ficavam a flutuar acima dos jogadores depois da câmara em perspetiva e passaram a usar o retângulo visível do sprite; o stick ficava demasiado claro e foi escurecido; as tabelas e as balizas foram redesenhadas para ficarem iguais à imagem de referência; e a IA foi afinada para haver menos quedas.</w:t>
+      </w:r>
+    </w:p>
+    <w:p>
+      <w:pPr>
+        <w:spacing w:after="120" w:line="300" w:lineRule="auto"/>
+        <w:jc w:val="both"/>
+      </w:pPr>
+      <w:r>
+        <w:t>Na afinação do guarda-redes testaram-se várias combinações de alcance, antecipação e tempo de reação. Com o alcance antigo (34 px) o guarda-redes tapava a baliza toda e quase não havia golos; com antecipação perfeita da trajetória também não. Uma primeira versão com um erro de leitura aleatório fazia o guarda-redes mexer-se às vezes para o lado errado num remate direto, o que parecia um erro, e foi trocada pela antecipação parcial. O número de golos muda muito com este valor (com 55 % havia 6 golos em 3 min</w:t>
+      </w:r>
+      <w:r>
+        <w:t>utos, com 62 % só 1), por isso escolheu-se 60 % no nível normal: cerca de 5 % dos remates dão golo entre duas equipas da IA.</w:t>
+      </w:r>
+    </w:p>
+    <w:p/>
+    <w:p>
+      <w:pPr>
+        <w:spacing w:before="120" w:after="120" w:line="360" w:lineRule="auto"/>
+        <w:jc w:val="both"/>
+      </w:pPr>
+    </w:p>
+    <w:p>
+      <w:pPr>
+        <w:pStyle w:val="Ttulo1"/>
+      </w:pPr>
+      <w:bookmarkStart w:id="31" w:name="_Toc244358008"/>
+      <w:r>
+        <w:t>5.  Gestão do projeto</w:t>
+      </w:r>
+      <w:bookmarkEnd w:id="31"/>
+    </w:p>
+    <w:p>
+      <w:pPr>
+        <w:spacing w:before="120" w:after="120" w:line="360" w:lineRule="auto"/>
+        <w:jc w:val="both"/>
+      </w:pPr>
+    </w:p>
+    <w:p>
+      <w:pPr>
+        <w:pStyle w:val="Ttulo2"/>
+      </w:pPr>
+      <w:bookmarkStart w:id="32" w:name="_Toc244358009"/>
+      <w:r>
+        <w:t xml:space="preserve">5.1  Planeamento e cronograma   </w:t>
+      </w:r>
+      <w:r>
+        <w:rPr>
+          <w:rFonts w:ascii="Cambria Math" w:eastAsia="Cambria Math" w:hAnsi="Cambria Math" w:cs="Cambria Math"/>
+        </w:rPr>
+        <w:t>◆</w:t>
+      </w:r>
+      <w:r>
+        <w:t xml:space="preserve"> MADS</w:t>
+      </w:r>
+      <w:bookmarkEnd w:id="32"/>
+    </w:p>
+    <w:p>
+      <w:pPr>
+        <w:spacing w:after="120" w:line="300" w:lineRule="auto"/>
+        <w:jc w:val="both"/>
+      </w:pPr>
+      <w:r>
+        <w:t>A tabela seguinte mostra o cronograma do projeto, desde o anteprojeto até à defesa.</w:t>
+      </w:r>
+    </w:p>
+    <w:p>
+      <w:pPr>
+        <w:keepNext/>
+        <w:spacing w:before="200" w:after="60"/>
+        <w:jc w:val="center"/>
+      </w:pPr>
+      <w:r>
+        <w:rPr>
+          <w:i/>
+          <w:iCs/>
+          <w:sz w:val="20"/>
+          <w:szCs w:val="20"/>
+        </w:rPr>
+        <w:t>Tabela 8 – Cronograma do projeto</w:t>
       </w:r>
     </w:p>
     <w:tbl>
@@ -11699,7 +12615,7 @@
                 <w:sz w:val="19"/>
                 <w:szCs w:val="19"/>
               </w:rPr>
-              <w:t>nov.–dez. 2026</w:t>
+              <w:t>out. 2026</w:t>
             </w:r>
           </w:p>
         </w:tc>
@@ -11720,7 +12636,7 @@
                 <w:sz w:val="19"/>
                 <w:szCs w:val="19"/>
               </w:rPr>
-              <w:t>Som, estatísticas da partida, modo de 2 jogadores</w:t>
+              <w:t>Correção da bola no stick, das defesas do guarda-redes e da ordem de desenho</w:t>
             </w:r>
           </w:p>
         </w:tc>
@@ -11741,7 +12657,7 @@
                 <w:sz w:val="19"/>
                 <w:szCs w:val="19"/>
               </w:rPr>
-              <w:t>Planeado</w:t>
+              <w:t>Concluído</w:t>
             </w:r>
           </w:p>
         </w:tc>
@@ -11768,7 +12684,7 @@
                 <w:sz w:val="19"/>
                 <w:szCs w:val="19"/>
               </w:rPr>
-              <w:t>jan.–mar. 2027</w:t>
+              <w:t>nov.–dez. 2026</w:t>
             </w:r>
           </w:p>
         </w:tc>
@@ -11789,7 +12705,7 @@
                 <w:sz w:val="19"/>
                 <w:szCs w:val="19"/>
               </w:rPr>
-              <w:t>Modo torneio com base de dados SQLite e classificação</w:t>
+              <w:t>Som, estatísticas da partida, modo de 2 jogadores</w:t>
             </w:r>
           </w:p>
         </w:tc>
@@ -11837,7 +12753,7 @@
                 <w:sz w:val="19"/>
                 <w:szCs w:val="19"/>
               </w:rPr>
-              <w:t>mar.–abr. 2027</w:t>
+              <w:t>jan.–mar. 2027</w:t>
             </w:r>
           </w:p>
         </w:tc>
@@ -11858,7 +12774,7 @@
                 <w:sz w:val="19"/>
                 <w:szCs w:val="19"/>
               </w:rPr>
-              <w:t>Testes com colegas, correção de erros, novos sprites</w:t>
+              <w:t>Modo torneio com base de dados SQLite e classificação</w:t>
             </w:r>
           </w:p>
         </w:tc>
@@ -11906,7 +12822,7 @@
                 <w:sz w:val="19"/>
                 <w:szCs w:val="19"/>
               </w:rPr>
-              <w:t>abr.–mai. 2027</w:t>
+              <w:t>mar.–abr. 2027</w:t>
             </w:r>
           </w:p>
         </w:tc>
@@ -11927,7 +12843,7 @@
                 <w:sz w:val="19"/>
                 <w:szCs w:val="19"/>
               </w:rPr>
-              <w:t>Relatório final, manual de utilizador e apresentação</w:t>
+              <w:t>Testes com colegas, correção de erros, novos sprites</w:t>
             </w:r>
           </w:p>
         </w:tc>
@@ -11948,7 +12864,7 @@
                 <w:sz w:val="19"/>
                 <w:szCs w:val="19"/>
               </w:rPr>
-              <w:t>Em curso</w:t>
+              <w:t>Planeado</w:t>
             </w:r>
           </w:p>
         </w:tc>
@@ -11975,6 +12891,75 @@
                 <w:sz w:val="19"/>
                 <w:szCs w:val="19"/>
               </w:rPr>
+              <w:t>abr.–mai. 2027</w:t>
+            </w:r>
+          </w:p>
+        </w:tc>
+        <w:tc>
+          <w:tcPr>
+            <w:tcW w:w="5300" w:type="dxa"/>
+            <w:tcMar>
+              <w:left w:w="80" w:type="dxa"/>
+              <w:right w:w="80" w:type="dxa"/>
+            </w:tcMar>
+          </w:tcPr>
+          <w:p>
+            <w:pPr>
+              <w:spacing w:before="20" w:after="20" w:line="240" w:lineRule="auto"/>
+            </w:pPr>
+            <w:r>
+              <w:rPr>
+                <w:sz w:val="19"/>
+                <w:szCs w:val="19"/>
+              </w:rPr>
+              <w:t>Relatório final, manual de utilizador e apresentação</w:t>
+            </w:r>
+          </w:p>
+        </w:tc>
+        <w:tc>
+          <w:tcPr>
+            <w:tcW w:w="1500" w:type="dxa"/>
+            <w:tcMar>
+              <w:left w:w="80" w:type="dxa"/>
+              <w:right w:w="80" w:type="dxa"/>
+            </w:tcMar>
+          </w:tcPr>
+          <w:p>
+            <w:pPr>
+              <w:spacing w:before="20" w:after="20" w:line="240" w:lineRule="auto"/>
+            </w:pPr>
+            <w:r>
+              <w:rPr>
+                <w:sz w:val="19"/>
+                <w:szCs w:val="19"/>
+              </w:rPr>
+              <w:t>Em curso</w:t>
+            </w:r>
+          </w:p>
+        </w:tc>
+      </w:tr>
+      <w:tr>
+        <w:trPr>
+          <w:cantSplit/>
+          <w:jc w:val="center"/>
+        </w:trPr>
+        <w:tc>
+          <w:tcPr>
+            <w:tcW w:w="1900" w:type="dxa"/>
+            <w:tcMar>
+              <w:left w:w="80" w:type="dxa"/>
+              <w:right w:w="80" w:type="dxa"/>
+            </w:tcMar>
+          </w:tcPr>
+          <w:p>
+            <w:pPr>
+              <w:spacing w:before="20" w:after="20" w:line="240" w:lineRule="auto"/>
+            </w:pPr>
+            <w:r>
+              <w:rPr>
+                <w:sz w:val="19"/>
+                <w:szCs w:val="19"/>
+              </w:rPr>
               <w:t>jun. 2027</w:t>
             </w:r>
           </w:p>
@@ -12038,7 +13023,7 @@
       <w:pPr>
         <w:pStyle w:val="Ttulo2"/>
       </w:pPr>
-      <w:bookmarkStart w:id="33" w:name="_Toc244268680"/>
+      <w:bookmarkStart w:id="33" w:name="_Toc244358010"/>
       <w:r>
         <w:t xml:space="preserve">5.2  Gestão de riscos   </w:t>
       </w:r>
@@ -12066,7 +13051,7 @@
           <w:sz w:val="20"/>
           <w:szCs w:val="20"/>
         </w:rPr>
-        <w:t>Tabela 8 – Gestão de riscos</w:t>
+        <w:t>Tabela 9 – Gestão de riscos</w:t>
       </w:r>
     </w:p>
     <w:tbl>
@@ -12839,7 +13824,7 @@
       <w:pPr>
         <w:pStyle w:val="Ttulo2"/>
       </w:pPr>
-      <w:bookmarkStart w:id="34" w:name="_Toc244268681"/>
+      <w:bookmarkStart w:id="34" w:name="_Toc244358011"/>
       <w:r>
         <w:t>5.3  Controlo de versões e trabalho em equipa (Git/GitHub)</w:t>
       </w:r>
@@ -12879,7 +13864,7 @@
         <w:jc w:val="both"/>
       </w:pPr>
       <w:bookmarkStart w:id="35" w:name="_heading=h.wyqfvt3yxluv" w:colFirst="0" w:colLast="0"/>
-      <w:bookmarkStart w:id="36" w:name="_Toc244268682"/>
+      <w:bookmarkStart w:id="36" w:name="_Toc244358012"/>
       <w:bookmarkEnd w:id="35"/>
       <w:r>
         <w:t>6. Conclusão</w:t>
@@ -12921,7 +13906,7 @@
         <w:jc w:val="both"/>
       </w:pPr>
       <w:bookmarkStart w:id="37" w:name="_heading=h.u2ct7f5va3wh" w:colFirst="0" w:colLast="0"/>
-      <w:bookmarkStart w:id="38" w:name="_Toc244268683"/>
+      <w:bookmarkStart w:id="38" w:name="_Toc244358013"/>
       <w:bookmarkEnd w:id="37"/>
       <w:r>
         <w:t>7. Anexos</w:t>
@@ -13307,7 +14292,7 @@
         <w:noProof/>
       </w:rPr>
       <w:drawing>
-        <wp:inline distT="0" distB="0" distL="0" distR="0" wp14:anchorId="291FA546" wp14:editId="3E142C9F">
+        <wp:inline distT="0" distB="0" distL="0" distR="0" wp14:anchorId="0F35CF32" wp14:editId="1E5A6877">
           <wp:extent cx="5566410" cy="510540"/>
           <wp:effectExtent l="0" t="0" r="0" b="0"/>
           <wp:docPr id="1957554077" name="image1.png"/>

</xml_diff>